<commit_message>
docs: simplify to baseline vs accel_all; swap in new encoder figure
- Refer only to the final accelerated configuration and call it
  "accel_all" (drop the v1/v2 distinction throughout text, tables, and
  figures); reduce the firmware build-modes table to baseline + accel_all.
- Performance comparison and per-accelerator tables now contrast baseline
  vs accel_all only; remove the GEMV v1-vs-v2 chart.
- Replace the generated encoder-pipeline diagram (Figure 6) with the new
  hand-drawn encoder architecture image (Figure6_Encoder_Architecture.jpeg).
- Renumber simulation waveforms to Figures 9-14; refresh Word export.

Co-Authored-By: Claude Opus 4.8 <noreply@anthropic.com>
</commit_message>
<xml_diff>
--- a/Docs/Project_Report.docx
+++ b/Docs/Project_Report.docx
@@ -344,7 +344,7 @@
         <w:pStyle w:val="ListBullet"/>
       </w:pPr>
       <w:r>
-        <w:t>Figure 8 — Three-Way Performance Comparison Graph</w:t>
+        <w:t>Figure 8 — Performance Comparison Graph</w:t>
       </w:r>
     </w:p>
     <w:p>
@@ -352,7 +352,7 @@
         <w:pStyle w:val="ListBullet"/>
       </w:pPr>
       <w:r>
-        <w:t>Figure 9 — GEMV v1 vs. v2 Cycle Comparison</w:t>
+        <w:t>Figure 9 — GEMV Simulation: Full Operation Overview</w:t>
       </w:r>
     </w:p>
     <w:p>
@@ -360,7 +360,7 @@
         <w:pStyle w:val="ListBullet"/>
       </w:pPr>
       <w:r>
-        <w:t>Figure 10 — GEMV Simulation: Full Operation Overview</w:t>
+        <w:t>Figure 10 — GEMV Simulation: Start Handshake</w:t>
       </w:r>
     </w:p>
     <w:p>
@@ -368,7 +368,7 @@
         <w:pStyle w:val="ListBullet"/>
       </w:pPr>
       <w:r>
-        <w:t>Figure 11 — GEMV Simulation: Start Handshake</w:t>
+        <w:t>Figure 11 — GEMV Simulation: One Compute Row (4-lane MAC)</w:t>
       </w:r>
     </w:p>
     <w:p>
@@ -376,7 +376,7 @@
         <w:pStyle w:val="ListBullet"/>
       </w:pPr>
       <w:r>
-        <w:t>Figure 12 — GEMV Simulation: One Compute Row (4-lane MAC)</w:t>
+        <w:t>Figure 12 — GEMV Simulation: Completion and Result Read-back</w:t>
       </w:r>
     </w:p>
     <w:p>
@@ -384,7 +384,7 @@
         <w:pStyle w:val="ListBullet"/>
       </w:pPr>
       <w:r>
-        <w:t>Figure 13 — GEMV Simulation: Completion and Result Read-back</w:t>
+        <w:t>Figure 13 — EXP-LUT Simulation: Full Index Sweep (Test 1)</w:t>
       </w:r>
     </w:p>
     <w:p>
@@ -392,7 +392,15 @@
         <w:pStyle w:val="ListBullet"/>
       </w:pPr>
       <w:r>
-        <w:t>Figure 14 — EXP-LUT Simulation: Full Index Sweep (Test 1)</w:t>
+        <w:t>Figure 14 — EXP-LUT Simulation: Stability Hold (Test 2)</w:t>
+      </w:r>
+    </w:p>
+    <w:p>
+      <w:pPr>
+        <w:pStyle w:val="Heading1"/>
+      </w:pPr>
+      <w:r>
+        <w:t>List of Tables</w:t>
       </w:r>
     </w:p>
     <w:p>
@@ -400,15 +408,7 @@
         <w:pStyle w:val="ListBullet"/>
       </w:pPr>
       <w:r>
-        <w:t>Figure 15 — EXP-LUT Simulation: Stability Hold (Test 2)</w:t>
-      </w:r>
-    </w:p>
-    <w:p>
-      <w:pPr>
-        <w:pStyle w:val="Heading1"/>
-      </w:pPr>
-      <w:r>
-        <w:t>List of Tables</w:t>
+        <w:t>Table 1 — TinyFormer Model Parameters</w:t>
       </w:r>
     </w:p>
     <w:p>
@@ -416,7 +416,7 @@
         <w:pStyle w:val="ListBullet"/>
       </w:pPr>
       <w:r>
-        <w:t>Table 1 — TinyFormer Model Parameters</w:t>
+        <w:t>Table 2 — Per-Timestep Feature Vector Layout</w:t>
       </w:r>
     </w:p>
     <w:p>
@@ -424,7 +424,7 @@
         <w:pStyle w:val="ListBullet"/>
       </w:pPr>
       <w:r>
-        <w:t>Table 2 — Per-Timestep Feature Vector Layout</w:t>
+        <w:t>Table 3 — RTL Simulation Test Scenarios</w:t>
       </w:r>
     </w:p>
     <w:p>
@@ -432,7 +432,7 @@
         <w:pStyle w:val="ListBullet"/>
       </w:pPr>
       <w:r>
-        <w:t>Table 3 — RTL Simulation Test Scenarios</w:t>
+        <w:t>Table 4 — FPGA Resource Utilization and Power</w:t>
       </w:r>
     </w:p>
     <w:p>
@@ -440,7 +440,7 @@
         <w:pStyle w:val="ListBullet"/>
       </w:pPr>
       <w:r>
-        <w:t>Table 4 — FPGA Resource Utilization and Power</w:t>
+        <w:t>Table 5 — Firmware Build Modes</w:t>
       </w:r>
     </w:p>
     <w:p>
@@ -448,7 +448,7 @@
         <w:pStyle w:val="ListBullet"/>
       </w:pPr>
       <w:r>
-        <w:t>Table 5 — Firmware Build Modes</w:t>
+        <w:t>Table 6 — Algorithm Operation Count per Stage</w:t>
       </w:r>
     </w:p>
     <w:p>
@@ -456,7 +456,7 @@
         <w:pStyle w:val="ListBullet"/>
       </w:pPr>
       <w:r>
-        <w:t>Table 6 — Algorithm Operation Count per Stage</w:t>
+        <w:t>Table 7 — Baseline Cycle Decomposition</w:t>
       </w:r>
     </w:p>
     <w:p>
@@ -464,15 +464,7 @@
         <w:pStyle w:val="ListBullet"/>
       </w:pPr>
       <w:r>
-        <w:t>Table 7 — Baseline Cycle Decomposition</w:t>
-      </w:r>
-    </w:p>
-    <w:p>
-      <w:pPr>
-        <w:pStyle w:val="ListBullet"/>
-      </w:pPr>
-      <w:r>
-        <w:t>Table 8 — Three-Way Performance Comparison</w:t>
+        <w:t>Table 8 — Performance Comparison</w:t>
       </w:r>
     </w:p>
     <w:p>
@@ -2572,7 +2564,7 @@
           <w:b/>
           <w:i/>
         </w:rPr>
-        <w:t>Figure 10 — GEMV simulation: full operation overview</w:t>
+        <w:t>Figure 9 — GEMV simulation: full operation overview</w:t>
       </w:r>
     </w:p>
     <w:p>
@@ -2617,7 +2609,7 @@
     <w:p/>
     <w:p>
       <w:r>
-        <w:t xml:space="preserve">Figure 10 shows one complete matrix-vector operation end to end: reset, the three CPU load bursts (the long </w:t>
+        <w:t xml:space="preserve">Figure 9 shows one complete matrix-vector operation end to end: reset, the three CPU load bursts (the long </w:t>
       </w:r>
       <w:r>
         <w:rPr>
@@ -2709,7 +2701,7 @@
           <w:b/>
           <w:i/>
         </w:rPr>
-        <w:t>Figure 11 — GEMV simulation: start handshake</w:t>
+        <w:t>Figure 10 — GEMV simulation: start handshake</w:t>
       </w:r>
     </w:p>
     <w:p>
@@ -2754,7 +2746,7 @@
     <w:p/>
     <w:p>
       <w:r>
-        <w:t xml:space="preserve">Figure 11 zooms into roughly six clock cycles around the kick-off. On the rising edge during the one-cycle </w:t>
+        <w:t xml:space="preserve">Figure 10 zooms into roughly six clock cycles around the kick-off. On the rising edge during the one-cycle </w:t>
       </w:r>
       <w:r>
         <w:rPr>
@@ -2816,7 +2808,7 @@
           <w:b/>
           <w:i/>
         </w:rPr>
-        <w:t>Figure 12 — GEMV simulation: one compute row (4-lane MAC)</w:t>
+        <w:t>Figure 11 — GEMV simulation: one compute row (4-lane MAC)</w:t>
       </w:r>
     </w:p>
     <w:p>
@@ -2861,7 +2853,7 @@
     <w:p/>
     <w:p>
       <w:r>
-        <w:t xml:space="preserve">Figure 12 spans one full output row (~10 cycles). With </w:t>
+        <w:t xml:space="preserve">Figure 11 spans one full output row (~10 cycles). With </w:t>
       </w:r>
       <w:r>
         <w:rPr>
@@ -3001,7 +2993,7 @@
         <w:t>b[1]</w:t>
       </w:r>
       <w:r>
-        <w:t xml:space="preserve">. This is the heart of the v2 design: 32 multiplies are completed in 8 cycles versus 32 cycles in the byte-wide v1. The full compute phase between </w:t>
+        <w:t xml:space="preserve">. This is the heart of the packed 4-lane design: 32 multiplies are completed in 8 cycles, versus 32 cycles for a one-byte-per-cycle MAC. The full compute phase between </w:t>
       </w:r>
       <w:r>
         <w:rPr>
@@ -3033,7 +3025,7 @@
           <w:b/>
           <w:i/>
         </w:rPr>
-        <w:t>Figure 13 — GEMV simulation: completion and result read-back</w:t>
+        <w:t>Figure 12 — GEMV simulation: completion and result read-back</w:t>
       </w:r>
     </w:p>
     <w:p>
@@ -3078,7 +3070,7 @@
     <w:p/>
     <w:p>
       <w:r>
-        <w:t xml:space="preserve">Figure 13 shows the hand-off back to the CPU. </w:t>
+        <w:t xml:space="preserve">Figure 12 shows the hand-off back to the CPU. </w:t>
       </w:r>
       <w:r>
         <w:rPr>
@@ -3203,7 +3195,7 @@
           <w:b/>
           <w:i/>
         </w:rPr>
-        <w:t>Figure 14 — EXP-LUT simulation: full index sweep (Test 1)</w:t>
+        <w:t>Figure 13 — EXP-LUT simulation: full index sweep (Test 1)</w:t>
       </w:r>
     </w:p>
     <w:p>
@@ -3248,7 +3240,7 @@
     <w:p/>
     <w:p>
       <w:r>
-        <w:t xml:space="preserve">Figure 14 drives </w:t>
+        <w:t xml:space="preserve">Figure 13 drives </w:t>
       </w:r>
       <w:r>
         <w:rPr>
@@ -3418,7 +3410,7 @@
           <w:b/>
           <w:i/>
         </w:rPr>
-        <w:t>Figure 15 — EXP-LUT simulation: stability hold (Test 2)</w:t>
+        <w:t>Figure 14 — EXP-LUT simulation: stability hold (Test 2)</w:t>
       </w:r>
     </w:p>
     <w:p>
@@ -3463,7 +3455,7 @@
     <w:p/>
     <w:p>
       <w:r>
-        <w:t xml:space="preserve">Figure 15 drives four representative indices — </w:t>
+        <w:t xml:space="preserve">Figure 14 drives four representative indices — </w:t>
       </w:r>
       <w:r>
         <w:rPr>
@@ -4433,17 +4425,12 @@
         <w:rPr>
           <w:b/>
         </w:rPr>
-        <w:t>v2 Design (32-bit packed data path, 4-lane MAC):</w:t>
+        <w:t>Design (32-bit packed data path, 4-lane MAC):</w:t>
       </w:r>
     </w:p>
     <w:p>
       <w:r>
-        <w:t>The GEMV peripheral evolved through two design iterations. The v1 design used 8-bit CSR registers for X and W, requiring one MMIO write per int8 element. For a 32×32 matvec this meant 32+1024+32 = 1,088 CSR writes per call, with the bus dominating total latency. The compute kernel performed one int8 multiply-accumulate per clock cycle (1,024 cycles for 32×32).</w:t>
-      </w:r>
-    </w:p>
-    <w:p>
-      <w:r>
-        <w:t xml:space="preserve">The v2 design widens both the </w:t>
+        <w:t xml:space="preserve">The GEMV peripheral uses a 32-bit packed data path with a 4-lane parallel MAC. Both the </w:t>
       </w:r>
       <w:r>
         <w:rPr>
@@ -4463,7 +4450,7 @@
         <w:t>W_IN</w:t>
       </w:r>
       <w:r>
-        <w:t xml:space="preserve"> CSR registers to 32 bits. The firmware driver packs four int8 elements into each 32-bit word using </w:t>
+        <w:t xml:space="preserve"> CSR registers are 32 bits wide; the firmware driver packs four int8 elements into each word using </w:t>
       </w:r>
       <w:r>
         <w:rPr>
@@ -4473,7 +4460,7 @@
         <w:t>pack4_i8()</w:t>
       </w:r>
       <w:r>
-        <w:t>, reducing CSR-bus traffic by 4× (approximately 272 writes per 32×32 matvec). The internal X and W memories are restructured as 32-bit word arrays, and the FSM reads one packed 32-bit word from each per clock cycle, computing four signed int8 multiply-accumulate operations in parallel (a 4-lane dot-product unit built from 4 DSP blocks). The compute phase drops to 256 cycles for a 32×32 matvec — another 4× improvement on the hardware side.</w:t>
+        <w:t>, so a 32×32 matvec requires only about 272 CSR writes — a 4× reduction in bus traffic compared to a naïve one-byte-per-write design (which would need 1,088 writes). The internal X and W memories are 32-bit word arrays, and the FSM reads one packed word from each per clock cycle, computing four signed int8 multiply-accumulate operations in parallel (a 4-lane dot-product unit built from 4 DSP blocks). A 32×32 matvec therefore completes in 256 compute cycles — a further 4× improvement over a one-MAC-per-cycle design. The two optimisations are independent and multiply: 4× on the bus and 4× on compute.</w:t>
       </w:r>
     </w:p>
     <w:p>
@@ -5104,7 +5091,17 @@
     </w:p>
     <w:p>
       <w:r>
-        <w:t>The firmware is organized as a set of shared common sources plus six mode-specific main files. All modes share the same TinyFormer encoder implementation and hardware paths are selected at compile time using feature macros.</w:t>
+        <w:t xml:space="preserve">The firmware is organized as a set of shared common sources plus mode-specific main files. Both configurations share the same TinyFormer encoder implementation, and hardware paths are selected at compile time using feature macros. This report focuses on the two end-point configurations — the pure-software baseline and the fully-accelerated </w:t>
+      </w:r>
+      <w:r>
+        <w:rPr>
+          <w:rFonts w:ascii="Consolas" w:hAnsi="Consolas"/>
+          <w:sz w:val="20"/>
+        </w:rPr>
+        <w:t>accel_all</w:t>
+      </w:r>
+      <w:r>
+        <w:t xml:space="preserve"> build.</w:t>
       </w:r>
     </w:p>
     <w:p>
@@ -5243,7 +5240,7 @@
           <w:p>
             <w:r/>
             <w:r>
-              <w:t>accel_dot8</w:t>
+              <w:t>accel_all</w:t>
             </w:r>
           </w:p>
         </w:tc>
@@ -5254,7 +5251,7 @@
           <w:p>
             <w:r/>
             <w:r>
-              <w:t>DOT8</w:t>
+              <w:t>DOT8 + EXP-LUT + GEMV</w:t>
             </w:r>
           </w:p>
         </w:tc>
@@ -5274,40 +5271,8 @@
               </w:rPr>
               <w:t>USE_DOT8_HW</w:t>
             </w:r>
-          </w:p>
-        </w:tc>
-      </w:tr>
-      <w:tr>
-        <w:tc>
-          <w:tcPr>
-            <w:tcW w:type="dxa" w:w="2880"/>
-          </w:tcPr>
-          <w:p>
-            <w:r/>
-            <w:r>
-              <w:t>accel_lut</w:t>
-            </w:r>
-          </w:p>
-        </w:tc>
-        <w:tc>
-          <w:tcPr>
-            <w:tcW w:type="dxa" w:w="2880"/>
-          </w:tcPr>
-          <w:p>
-            <w:r/>
-            <w:r>
-              <w:t>EXP-LUT</w:t>
-            </w:r>
-          </w:p>
-        </w:tc>
-        <w:tc>
-          <w:tcPr>
-            <w:tcW w:type="dxa" w:w="2880"/>
-          </w:tcPr>
-          <w:p>
-            <w:r/>
-            <w:r>
-              <w:t xml:space="preserve">+ </w:t>
+            <w:r>
+              <w:t xml:space="preserve">, </w:t>
             </w:r>
             <w:r>
               <w:rPr>
@@ -5324,146 +5289,10 @@
                 <w:rFonts w:ascii="Consolas" w:hAnsi="Consolas"/>
                 <w:sz w:val="20"/>
               </w:rPr>
-              <w:t>EXP_LUT_USE_LITEX_CSR</w:t>
-            </w:r>
-          </w:p>
-        </w:tc>
-      </w:tr>
-      <w:tr>
-        <w:tc>
-          <w:tcPr>
-            <w:tcW w:type="dxa" w:w="2880"/>
-          </w:tcPr>
-          <w:p>
-            <w:r/>
-            <w:r>
-              <w:t>accel_gemv</w:t>
-            </w:r>
-          </w:p>
-        </w:tc>
-        <w:tc>
-          <w:tcPr>
-            <w:tcW w:type="dxa" w:w="2880"/>
-          </w:tcPr>
-          <w:p>
-            <w:r/>
-            <w:r>
-              <w:t>GEMV</w:t>
-            </w:r>
-          </w:p>
-        </w:tc>
-        <w:tc>
-          <w:tcPr>
-            <w:tcW w:type="dxa" w:w="2880"/>
-          </w:tcPr>
-          <w:p>
-            <w:r/>
-            <w:r>
-              <w:t xml:space="preserve">+ </w:t>
-            </w:r>
-            <w:r>
-              <w:rPr>
-                <w:rFonts w:ascii="Consolas" w:hAnsi="Consolas"/>
-                <w:sz w:val="20"/>
-              </w:rPr>
               <w:t>USE_GEMV_HW</w:t>
             </w:r>
             <w:r>
-              <w:t xml:space="preserve">, </w:t>
-            </w:r>
-            <w:r>
-              <w:rPr>
-                <w:rFonts w:ascii="Consolas" w:hAnsi="Consolas"/>
-                <w:sz w:val="20"/>
-              </w:rPr>
-              <w:t>GEMV_USE_LITEX_CSR</w:t>
-            </w:r>
-          </w:p>
-        </w:tc>
-      </w:tr>
-      <w:tr>
-        <w:tc>
-          <w:tcPr>
-            <w:tcW w:type="dxa" w:w="2880"/>
-          </w:tcPr>
-          <w:p>
-            <w:r/>
-            <w:r>
-              <w:t>accel_dot8_lut</w:t>
-            </w:r>
-          </w:p>
-        </w:tc>
-        <w:tc>
-          <w:tcPr>
-            <w:tcW w:type="dxa" w:w="2880"/>
-          </w:tcPr>
-          <w:p>
-            <w:r/>
-            <w:r>
-              <w:t>DOT8 + EXP-LUT</w:t>
-            </w:r>
-          </w:p>
-        </w:tc>
-        <w:tc>
-          <w:tcPr>
-            <w:tcW w:type="dxa" w:w="2880"/>
-          </w:tcPr>
-          <w:p>
-            <w:r/>
-            <w:r>
-              <w:t xml:space="preserve">+ </w:t>
-            </w:r>
-            <w:r>
-              <w:rPr>
-                <w:rFonts w:ascii="Consolas" w:hAnsi="Consolas"/>
-                <w:sz w:val="20"/>
-              </w:rPr>
-              <w:t>USE_DOT8_HW</w:t>
-            </w:r>
-            <w:r>
-              <w:t xml:space="preserve">, </w:t>
-            </w:r>
-            <w:r>
-              <w:rPr>
-                <w:rFonts w:ascii="Consolas" w:hAnsi="Consolas"/>
-                <w:sz w:val="20"/>
-              </w:rPr>
-              <w:t>USE_EXP_LUT_HW</w:t>
-            </w:r>
-          </w:p>
-        </w:tc>
-      </w:tr>
-      <w:tr>
-        <w:tc>
-          <w:tcPr>
-            <w:tcW w:type="dxa" w:w="2880"/>
-          </w:tcPr>
-          <w:p>
-            <w:r/>
-            <w:r>
-              <w:t>accel_all</w:t>
-            </w:r>
-          </w:p>
-        </w:tc>
-        <w:tc>
-          <w:tcPr>
-            <w:tcW w:type="dxa" w:w="2880"/>
-          </w:tcPr>
-          <w:p>
-            <w:r/>
-            <w:r>
-              <w:t>DOT8 + EXP-LUT + GEMV</w:t>
-            </w:r>
-          </w:p>
-        </w:tc>
-        <w:tc>
-          <w:tcPr>
-            <w:tcW w:type="dxa" w:w="2880"/>
-          </w:tcPr>
-          <w:p>
-            <w:r/>
-            <w:r>
-              <w:t>All of the above</w:t>
+              <w:t xml:space="preserve"> (with the LiteX-CSR variants)</w:t>
             </w:r>
           </w:p>
         </w:tc>
@@ -5472,7 +5301,17 @@
     <w:p/>
     <w:p>
       <w:r>
-        <w:t>When a macro is not defined, the corresponding hardware is never accessed — no custom instruction opcode is issued, no MMIO register is touched — so the same codebase runs correctly on a plain VexRiscv or on a partial SoC.</w:t>
+        <w:t>When a macro is not defined, the corresponding hardware is never accessed — no custom instruction opcode is issued, no MMIO register is touched — so the same codebase runs correctly on a plain VexRiscv (baseline) or with all three accelerators enabled (</w:t>
+      </w:r>
+      <w:r>
+        <w:rPr>
+          <w:rFonts w:ascii="Consolas" w:hAnsi="Consolas"/>
+          <w:sz w:val="20"/>
+        </w:rPr>
+        <w:t>accel_all</w:t>
+      </w:r>
+      <w:r>
+        <w:t>).</w:t>
       </w:r>
     </w:p>
     <w:p>
@@ -5530,7 +5369,17 @@
         <w:t>saturate_int32_to_int8</w:t>
       </w:r>
       <w:r>
-        <w:t xml:space="preserve"> macro. This produces Q, K, and V tensors of shape 16×32. In the accel_gemv build, all projections use the GEMV peripheral.</w:t>
+        <w:t xml:space="preserve"> macro. This produces Q, K, and V tensors of shape 16×32. In </w:t>
+      </w:r>
+      <w:r>
+        <w:rPr>
+          <w:rFonts w:ascii="Consolas" w:hAnsi="Consolas"/>
+          <w:sz w:val="20"/>
+        </w:rPr>
+        <w:t>accel_all</w:t>
+      </w:r>
+      <w:r>
+        <w:t>, all projections use the GEMV peripheral.</w:t>
       </w:r>
     </w:p>
     <w:p>
@@ -5629,9 +5478,21 @@
         <w:jc w:val="center"/>
       </w:pPr>
       <w:r>
+        <w:rPr>
+          <w:b/>
+          <w:i/>
+        </w:rPr>
+        <w:t>Figure 6 — TinyFormer Algorithm Pipeline</w:t>
+      </w:r>
+    </w:p>
+    <w:p>
+      <w:pPr>
+        <w:jc w:val="center"/>
+      </w:pPr>
+      <w:r>
         <w:drawing>
           <wp:inline xmlns:a="http://schemas.openxmlformats.org/drawingml/2006/main" xmlns:pic="http://schemas.openxmlformats.org/drawingml/2006/picture">
-            <wp:extent cx="5760720" cy="6555685"/>
+            <wp:extent cx="5760720" cy="1515789"/>
             <wp:docPr id="12" name="Picture 12"/>
             <wp:cNvGraphicFramePr>
               <a:graphicFrameLocks noChangeAspect="1"/>
@@ -5640,7 +5501,7 @@
               <a:graphicData uri="http://schemas.openxmlformats.org/drawingml/2006/picture">
                 <pic:pic>
                   <pic:nvPicPr>
-                    <pic:cNvPr id="0" name="Figure6_TinyFormer_Encoder_Pipeline.png"/>
+                    <pic:cNvPr id="0" name="Figure6_Encoder_Architecture.jpeg"/>
                     <pic:cNvPicPr/>
                   </pic:nvPicPr>
                   <pic:blipFill>
@@ -5652,7 +5513,7 @@
                   <pic:spPr>
                     <a:xfrm>
                       <a:off x="0" y="0"/>
-                      <a:ext cx="5760720" cy="6555685"/>
+                      <a:ext cx="5760720" cy="1515789"/>
                     </a:xfrm>
                     <a:prstGeom prst="rect"/>
                   </pic:spPr>
@@ -7121,7 +6982,7 @@
         <w:rPr>
           <w:b/>
         </w:rPr>
-        <w:t>Table 8 — Three-Way Performance Comparison</w:t>
+        <w:t>Table 8 — Performance Comparison</w:t>
       </w:r>
     </w:p>
     <w:tbl>
@@ -7306,67 +7167,7 @@
               <w:rPr>
                 <w:b/>
               </w:rPr>
-              <w:t>accel_all v1</w:t>
-            </w:r>
-          </w:p>
-        </w:tc>
-        <w:tc>
-          <w:tcPr>
-            <w:tcW w:type="dxa" w:w="1728"/>
-          </w:tcPr>
-          <w:p>
-            <w:r/>
-            <w:r>
-              <w:t>HW LUT + DOT8 + 1-lane GEMV (byte-wide)</w:t>
-            </w:r>
-          </w:p>
-        </w:tc>
-        <w:tc>
-          <w:tcPr>
-            <w:tcW w:type="dxa" w:w="1728"/>
-          </w:tcPr>
-          <w:p>
-            <w:r/>
-            <w:r>
-              <w:t>19,067,129</w:t>
-            </w:r>
-          </w:p>
-        </w:tc>
-        <w:tc>
-          <w:tcPr>
-            <w:tcW w:type="dxa" w:w="1728"/>
-          </w:tcPr>
-          <w:p>
-            <w:r/>
-            <w:r>
-              <w:t>190.67 ms</w:t>
-            </w:r>
-          </w:p>
-        </w:tc>
-        <w:tc>
-          <w:tcPr>
-            <w:tcW w:type="dxa" w:w="1728"/>
-          </w:tcPr>
-          <w:p>
-            <w:r/>
-            <w:r>
-              <w:t>3.98×</w:t>
-            </w:r>
-          </w:p>
-        </w:tc>
-      </w:tr>
-      <w:tr>
-        <w:tc>
-          <w:tcPr>
-            <w:tcW w:type="dxa" w:w="1728"/>
-          </w:tcPr>
-          <w:p>
-            <w:r/>
-            <w:r>
-              <w:rPr>
-                <w:b/>
-              </w:rPr>
-              <w:t>accel_all v2</w:t>
+              <w:t>accel_all</w:t>
             </w:r>
           </w:p>
         </w:tc>
@@ -7428,7 +7229,7 @@
     <w:p/>
     <w:p>
       <w:r>
-        <w:t xml:space="preserve">Speedup (final): 75,900,400 / 15,755,300 = </w:t>
+        <w:t xml:space="preserve">Speedup: 75,900,400 / 15,755,300 = </w:t>
       </w:r>
       <w:r>
         <w:rPr>
@@ -7501,21 +7302,10 @@
         <w:rPr>
           <w:b/>
         </w:rPr>
-        <w:t>GEMV (v2)</w:t>
-      </w:r>
-      <w:r>
-        <w:t xml:space="preserve"> is the single largest contributor in absolute cycle savings. Comparing baseline (software matvec) to v2 GEMV, the speedup per 32×32 matvec call is approximately 8× (from ~17,000 cycles to ~2,000 cycles). This improvement comes equally from two independent optimizations: (1) the 4× reduction in CSR-bus writes due to the 32-bit packed data path, and (2) the 4× reduction in compute cycles due to the parallel 4-lane MAC.</w:t>
-      </w:r>
-    </w:p>
-    <w:p>
-      <w:r>
-        <w:rPr>
-          <w:b/>
-        </w:rPr>
-        <w:t>GEMV v1 → v2 transition</w:t>
-      </w:r>
-      <w:r>
-        <w:t xml:space="preserve"> saves approximately 3.3 M cycles per inference (~33 ms), yielding a 1.21× improvement specifically from the v1-to-v2 upgrade.</w:t>
+        <w:t>GEMV</w:t>
+      </w:r>
+      <w:r>
+        <w:t xml:space="preserve"> is the single largest contributor in absolute cycle savings. Comparing the baseline software matvec to the GEMV peripheral, the speedup per 32×32 matvec call is approximately 8× (from ~17,000 cycles to ~2,000 cycles). This improvement comes equally from two independent optimizations: (1) the 4× reduction in CSR-bus writes due to the 32-bit packed data path, and (2) the 4× reduction in compute cycles due to the parallel 4-lane MAC.</w:t>
       </w:r>
     </w:p>
     <w:p>
@@ -7651,7 +7441,7 @@
           <w:p>
             <w:r/>
             <w:r>
-              <w:t>GEMV (v1)</w:t>
+              <w:t>GEMV</w:t>
             </w:r>
           </w:p>
         </w:tc>
@@ -7662,7 +7452,7 @@
           <w:p>
             <w:r/>
             <w:r>
-              <w:t>~14,300,000</w:t>
+              <w:t>~14,000,000</w:t>
             </w:r>
           </w:p>
         </w:tc>
@@ -7673,42 +7463,7 @@
           <w:p>
             <w:r/>
             <w:r>
-              <w:t>Secondary — eliminates majority of matvec cost</w:t>
-            </w:r>
-          </w:p>
-        </w:tc>
-      </w:tr>
-      <w:tr>
-        <w:tc>
-          <w:tcPr>
-            <w:tcW w:type="dxa" w:w="2880"/>
-          </w:tcPr>
-          <w:p>
-            <w:r/>
-            <w:r>
-              <w:t>GEMV v1→v2 upgrade</w:t>
-            </w:r>
-          </w:p>
-        </w:tc>
-        <w:tc>
-          <w:tcPr>
-            <w:tcW w:type="dxa" w:w="2880"/>
-          </w:tcPr>
-          <w:p>
-            <w:r/>
-            <w:r>
-              <w:t>~3,300,000</w:t>
-            </w:r>
-          </w:p>
-        </w:tc>
-        <w:tc>
-          <w:tcPr>
-            <w:tcW w:type="dxa" w:w="2880"/>
-          </w:tcPr>
-          <w:p>
-            <w:r/>
-            <w:r>
-              <w:t>Tertiary — 4× packed bus + 4× parallel MAC</w:t>
+              <w:t>Secondary — eliminates the bulk of matrix-vector cost (packed 4-lane design: 4× bus + 4× compute)</w:t>
             </w:r>
           </w:p>
         </w:tc>
@@ -7848,7 +7603,7 @@
               <w:rPr>
                 <w:b/>
               </w:rPr>
-              <w:t>ENC_CKSUM (accel_all v2)</w:t>
+              <w:t>ENC_CKSUM (accel_all)</w:t>
             </w:r>
           </w:p>
         </w:tc>
@@ -8438,46 +8193,6 @@
         <w:t xml:space="preserve"> for future extensions.</w:t>
       </w:r>
     </w:p>
-    <w:p>
-      <w:pPr>
-        <w:jc w:val="center"/>
-      </w:pPr>
-      <w:r>
-        <w:drawing>
-          <wp:inline xmlns:a="http://schemas.openxmlformats.org/drawingml/2006/main" xmlns:pic="http://schemas.openxmlformats.org/drawingml/2006/picture">
-            <wp:extent cx="5760720" cy="4503350"/>
-            <wp:docPr id="15" name="Picture 15"/>
-            <wp:cNvGraphicFramePr>
-              <a:graphicFrameLocks noChangeAspect="1"/>
-            </wp:cNvGraphicFramePr>
-            <a:graphic>
-              <a:graphicData uri="http://schemas.openxmlformats.org/drawingml/2006/picture">
-                <pic:pic>
-                  <pic:nvPicPr>
-                    <pic:cNvPr id="0" name="Figure9_GEMV_v1_v2_Cycles.png"/>
-                    <pic:cNvPicPr/>
-                  </pic:nvPicPr>
-                  <pic:blipFill>
-                    <a:blip r:embed="rId23"/>
-                    <a:stretch>
-                      <a:fillRect/>
-                    </a:stretch>
-                  </pic:blipFill>
-                  <pic:spPr>
-                    <a:xfrm>
-                      <a:off x="0" y="0"/>
-                      <a:ext cx="5760720" cy="4503350"/>
-                    </a:xfrm>
-                    <a:prstGeom prst="rect"/>
-                  </pic:spPr>
-                </pic:pic>
-              </a:graphicData>
-            </a:graphic>
-          </wp:inline>
-        </w:drawing>
-      </w:r>
-    </w:p>
-    <w:p/>
     <w:p>
       <w:pPr>
         <w:pStyle w:val="Heading1"/>
@@ -8942,7 +8657,7 @@
         <w:t>Data-path width is as important as compute parallelism.</w:t>
       </w:r>
       <w:r>
-        <w:t xml:space="preserve"> The GEMV v1-to-v2 improvement comes in equal parts from reducing CSR-bus traffic (4× via packed 32-bit writes) and from parallelizing the MAC unit (4× via the 4-lane dot product). Neglecting either half of this optimization would have left a 4× improvement on the table. This finding generalizes: for MMIO-coupled accelerators, memory and bus bandwidth is a co-bottleneck with raw arithmetic throughput.</w:t>
+        <w:t xml:space="preserve"> The GEMV peripheral's efficiency comes in equal parts from reducing CSR-bus traffic (4× via packed 32-bit writes) and from parallelizing the MAC unit (4× via the 4-lane dot product). Neglecting either half of this optimization would have left a 4× improvement on the table. This finding generalizes: for MMIO-coupled accelerators, memory and bus bandwidth is a co-bottleneck with raw arithmetic throughput.</w:t>
       </w:r>
     </w:p>
     <w:p>
@@ -9029,7 +8744,7 @@
         <w:t>Pipelined GEMV dot4 stage.</w:t>
       </w:r>
       <w:r>
-        <w:t xml:space="preserve"> The current v2 design does not meet timing at 100 MHz (WNS = −6.3 ns). Adding one pipeline register between the 4-lane multiplier array and the adder tree would close timing cleanly at 100 MHz while adding only one cycle of latency per output element — negligible at the scale of 32 output elements per call.</w:t>
+        <w:t xml:space="preserve"> The current GEMV design does not meet timing at 100 MHz (WNS = −6.3 ns). Adding one pipeline register between the 4-lane multiplier array and the adder tree would close timing cleanly at 100 MHz while adding only one cycle of latency per output element — negligible at the scale of 32 output elements per call.</w:t>
       </w:r>
     </w:p>
     <w:p>

</xml_diff>

<commit_message>
docs: shorten report (~25pp) and swap in supplied Figure 5
Apply the two edits interrupted by the previous session crash:
- condensed prose toward the ~25-page target
- replaced auto-generated Figure 5 with the user-supplied JPEG
  (drop fig5 from gen_figures_png; map points at .jpeg)
Rebuilt Project_Report.docx from the updated markdown.

Co-Authored-By: Claude Opus 4.8 <noreply@anthropic.com>
</commit_message>
<xml_diff>
--- a/Docs/Project_Report.docx
+++ b/Docs/Project_Report.docx
@@ -269,7 +269,7 @@
     <w:p>
       <w:r>
         <w:fldChar w:fldCharType="begin"/>
-        <w:instrText xml:space="preserve">TOC \o "1-3" \h \z \u</w:instrText>
+        <w:instrText xml:space="preserve">TOC \o "1-2" \h \z \u</w:instrText>
         <w:fldChar w:fldCharType="separate"/>
         <w:t>Right-click here and choose 'Update Field' to build the Table of Contents.</w:t>
         <w:fldChar w:fldCharType="end"/>
@@ -625,7 +625,7 @@
       <w:r>
         <w:drawing>
           <wp:inline xmlns:a="http://schemas.openxmlformats.org/drawingml/2006/main" xmlns:pic="http://schemas.openxmlformats.org/drawingml/2006/picture">
-            <wp:extent cx="5760720" cy="3605873"/>
+            <wp:extent cx="5120640" cy="3205221"/>
             <wp:docPr id="1" name="Picture 1"/>
             <wp:cNvGraphicFramePr>
               <a:graphicFrameLocks noChangeAspect="1"/>
@@ -646,7 +646,7 @@
                   <pic:spPr>
                     <a:xfrm>
                       <a:off x="0" y="0"/>
-                      <a:ext cx="5760720" cy="3605873"/>
+                      <a:ext cx="5120640" cy="3205221"/>
                     </a:xfrm>
                     <a:prstGeom prst="rect"/>
                   </pic:spPr>
@@ -742,12 +742,7 @@
     </w:p>
     <w:p>
       <w:r>
-        <w:t>A soft-core RISC-V CPU running at 100 MHz on an FPGA offers a flexible, reconfigurable compute substrate. In its unmodified form, however, it cannot match the throughput demands of always-on inference. The VexRiscv RV32IM ISA provides single-cycle multiplication in hardware (via the M extension), but sequential scalar code still requires separate load, sign-extend, multiply, and accumulate instructions for every multiply-add, producing significant loop overhead in high-dimensional dot products. Softmax exponentiation, implemented honestly as runtime fixed-point arithmetic, contributes disproportionately to total inference time.</w:t>
-      </w:r>
-    </w:p>
-    <w:p>
-      <w:r>
-        <w:t>This project demonstrates that targeted hardware acceleration — implemented with a small FPGA area budget — can close this gap substantially, achieving better than a 4.8× end-to-end speedup while occupying roughly 10% of available LUT resources and increasing power by only about 7%.</w:t>
+        <w:t>A 100 MHz soft-core RISC-V CPU is a flexible compute substrate but, unmodified, cannot meet always-on inference demands: even with the M-extension's single-cycle multiply, scalar code spends separate load/sign-extend/multiply/accumulate instructions on every multiply-add, and a runtime fixed-point softmax exp() dominates total time. This project shows that targeted hardware acceleration within a small FPGA budget closes this gap — a 4.8×+ end-to-end speedup at roughly 10% LUT and only ~7% more power.</w:t>
       </w:r>
     </w:p>
     <w:p>
@@ -869,21 +864,7 @@
     </w:p>
     <w:p>
       <w:r>
-        <w:t>This work differs in several important respects. The target is a commodity FPGA platform — the Digilent Nexys4DDR — offering full bitstream transparency and reproducibility without requiring a custom chip tape-out. The model retains full bit-exact correctness (no accuracy loss from the accelerators). The accelerators' LUT cost is +3.9 percentage points (6.13% → 10.04%) — roughly 7× smaller than KWT-Tiny's reported 29% area overhead. Both works attack the same fundamental bottlenecks — softmax exponential and attention inner products on embedded RISC-V — and arrive at comparable end-to-end speedups (4.82× vs. 5×) through different design trade-offs.</w:t>
-      </w:r>
-    </w:p>
-    <w:p>
-      <w:r>
-        <w:t xml:space="preserve">The </w:t>
-      </w:r>
-      <w:r>
-        <w:rPr>
-          <w:b/>
-        </w:rPr>
-        <w:t>Attention Is All You Need</w:t>
-      </w:r>
-      <w:r>
-        <w:t xml:space="preserve"> paper [2] by Vaswani et al. defines the Transformer architecture that this project implements in miniature. The architecture choices made in TinyFormer (single head, S=16, D=32) are direct simplifications of the original architecture, motivated by the resource constraints of a bare-metal FPGA implementation.</w:t>
+        <w:t>This work differs in several respects: it targets a commodity FPGA (Digilent Nexys4DDR) with full bitstream transparency and no chip tape-out; it keeps bit-exact correctness (no accuracy loss from the accelerators); and its LUT cost is +3.9 pp (6.13% → 10.04%) — roughly 7× smaller than KWT-Tiny's 29% overhead. Both attack the same bottlenecks (softmax and attention inner products on embedded RISC-V) and reach comparable speedups (4.82× vs. 5×). The Transformer architecture itself follows Vaswani et al. [2]; TinyFormer is a single-head, S=16, D=32 simplification suited to bare-metal FPGA constraints.</w:t>
       </w:r>
     </w:p>
     <w:p>
@@ -1611,7 +1592,7 @@
       <w:r>
         <w:drawing>
           <wp:inline xmlns:a="http://schemas.openxmlformats.org/drawingml/2006/main" xmlns:pic="http://schemas.openxmlformats.org/drawingml/2006/picture">
-            <wp:extent cx="5760720" cy="3442459"/>
+            <wp:extent cx="5120640" cy="3059963"/>
             <wp:docPr id="2" name="Picture 2"/>
             <wp:cNvGraphicFramePr>
               <a:graphicFrameLocks noChangeAspect="1"/>
@@ -1632,7 +1613,7 @@
                   <pic:spPr>
                     <a:xfrm>
                       <a:off x="0" y="0"/>
-                      <a:ext cx="5760720" cy="3442459"/>
+                      <a:ext cx="5120640" cy="3059963"/>
                     </a:xfrm>
                     <a:prstGeom prst="rect"/>
                   </pic:spPr>
@@ -1969,21 +1950,10 @@
         <w:rPr>
           <w:b/>
         </w:rPr>
-        <w:t>Execution:</w:t>
-      </w:r>
-      <w:r>
-        <w:t xml:space="preserve"> Single-cycle. The plugin intercepts the decoded instruction in the execute stage, computes four signed int8×int8 multiplications and a four-input adder tree using 4 DSP blocks, and writes the int32 result back in the writeback stage. No pipeline stall is introduced.</w:t>
-      </w:r>
-    </w:p>
-    <w:p>
-      <w:r>
-        <w:rPr>
-          <w:b/>
-        </w:rPr>
-        <w:t>Integration:</w:t>
-      </w:r>
-      <w:r>
-        <w:t xml:space="preserve"> The baseline inner loop for a 32-element dot product requires 32 iterations of load–sign-extend–multiply–accumulate (approximately 8 instructions per iteration, 256 total). With DOT8, the same dot product is expressed as 8 DOT8 calls over 4-lane packed inputs, each preceded by 2 pack operations, reducing the inner-loop instruction count by approximately 6.4×.</w:t>
+        <w:t>Execution and integration.</w:t>
+      </w:r>
+      <w:r>
+        <w:t xml:space="preserve"> Execution is single-cycle: the plugin intercepts the decoded instruction in the execute stage, performs four signed int8×int8 multiplies and a four-input adder tree (4 DSP blocks), and writes the int32 result in writeback, with no pipeline stall. A 32-element software dot product (32 iterations × ≈8 instructions ≈ 256) collapses to 8 DOT8 calls (2 packs each), cutting the inner-loop instruction count by ≈6.4×.</w:t>
       </w:r>
     </w:p>
     <w:p>
@@ -2005,7 +1975,7 @@
       <w:r>
         <w:drawing>
           <wp:inline xmlns:a="http://schemas.openxmlformats.org/drawingml/2006/main" xmlns:pic="http://schemas.openxmlformats.org/drawingml/2006/picture">
-            <wp:extent cx="5760720" cy="2777984"/>
+            <wp:extent cx="5120640" cy="2469319"/>
             <wp:docPr id="3" name="Picture 3"/>
             <wp:cNvGraphicFramePr>
               <a:graphicFrameLocks noChangeAspect="1"/>
@@ -2026,7 +1996,7 @@
                   <pic:spPr>
                     <a:xfrm>
                       <a:off x="0" y="0"/>
-                      <a:ext cx="5760720" cy="2777984"/>
+                      <a:ext cx="5120640" cy="2469319"/>
                     </a:xfrm>
                     <a:prstGeom prst="rect"/>
                   </pic:spPr>
@@ -2058,7 +2028,7 @@
         <w:t>exp_lut.v</w:t>
       </w:r>
       <w:r>
-        <w:t xml:space="preserve">) is a read-only lookup table with 16 entries corresponding to exp(0), exp(−1), through exp(−15), stored in Q10 fixed-point (scale 2^10). The values are held in a 16-entry </w:t>
+        <w:t xml:space="preserve">) is a 16-entry read-only ROM holding exp(0), exp(−1), … exp(−15) in Q10 fixed-point (scale 2^10). The values live in a </w:t>
       </w:r>
       <w:r>
         <w:rPr>
@@ -2068,17 +2038,7 @@
         <w:t>reg [15:0]</w:t>
       </w:r>
       <w:r>
-        <w:t xml:space="preserve"> array initialized in an </w:t>
-      </w:r>
-      <w:r>
-        <w:rPr>
-          <w:rFonts w:ascii="Consolas" w:hAnsi="Consolas"/>
-          <w:sz w:val="20"/>
-        </w:rPr>
-        <w:t>initial</w:t>
-      </w:r>
-      <w:r>
-        <w:t xml:space="preserve"> block and read purely combinationally — there is no clocked latency on the read path. The accelerator accepts a 5-bit signed index but uses only its low 4 bits as the table address (</w:t>
+        <w:t xml:space="preserve"> array read purely combinationally — no clocked latency — and a 5-bit signed index is truncated to the table address (</w:t>
       </w:r>
       <w:r>
         <w:rPr>
@@ -2088,7 +2048,7 @@
         <w:t>addr = index[3:0]</w:t>
       </w:r>
       <w:r>
-        <w:t xml:space="preserve">), so indices 0–15 map directly to exp(0) through exp(−15). The table values are defined to match the software golden table in </w:t>
+        <w:t xml:space="preserve">). The entries match the software golden table in </w:t>
       </w:r>
       <w:r>
         <w:rPr>
@@ -2098,18 +2058,7 @@
         <w:t>tinyformer.c</w:t>
       </w:r>
       <w:r>
-        <w:t xml:space="preserve"> byte-for-byte, guaranteeing numerical equivalence between baseline and accelerated softmax (see Appendix A).</w:t>
-      </w:r>
-    </w:p>
-    <w:p>
-      <w:r>
-        <w:rPr>
-          <w:b/>
-        </w:rPr>
-        <w:t>Operation:</w:t>
-      </w:r>
-      <w:r>
-        <w:t xml:space="preserve"> The CPU writes an index (0–15) to the index CSR register and reads the corresponding Q10 value from the value CSR register. The total per-lookup cost in the accelerated firmware is two MMIO operations (~12 cycles), replacing the runtime </w:t>
+        <w:t xml:space="preserve"> byte-for-byte (Appendix A), so baseline and accelerated softmax are numerically identical. Operationally the CPU writes the index CSR and reads the value CSR: two MMIO operations (~12 cycles), replacing the baseline's runtime </w:t>
       </w:r>
       <w:r>
         <w:rPr>
@@ -2119,7 +2068,7 @@
         <w:t>compute_exp_q10()</w:t>
       </w:r>
       <w:r>
-        <w:t xml:space="preserve"> loop of the baseline. Given the baseline's measured softmax cost (≈21,000 cycles per call, derived in Section 5.1), this is roughly a 1,700× per-call reduction.</w:t>
+        <w:t xml:space="preserve"> loop (≈21,000 cycles per call, Section 5.1) — a ~1,700× per-call reduction.</w:t>
       </w:r>
     </w:p>
     <w:p>
@@ -2141,7 +2090,7 @@
       <w:r>
         <w:drawing>
           <wp:inline xmlns:a="http://schemas.openxmlformats.org/drawingml/2006/main" xmlns:pic="http://schemas.openxmlformats.org/drawingml/2006/picture">
-            <wp:extent cx="5760720" cy="3627405"/>
+            <wp:extent cx="5120640" cy="3224360"/>
             <wp:docPr id="4" name="Picture 4"/>
             <wp:cNvGraphicFramePr>
               <a:graphicFrameLocks noChangeAspect="1"/>
@@ -2162,7 +2111,7 @@
                   <pic:spPr>
                     <a:xfrm>
                       <a:off x="0" y="0"/>
-                      <a:ext cx="5760720" cy="3627405"/>
+                      <a:ext cx="5120640" cy="3224360"/>
                     </a:xfrm>
                     <a:prstGeom prst="rect"/>
                   </pic:spPr>
@@ -2184,20 +2133,13 @@
     </w:p>
     <w:p>
       <w:r>
-        <w:t>The GEMV peripheral computes Y = W×X + b, where W is an int8 matrix, X is an int8 vector, b is an optional int32 bias vector, and Y is an int32 output vector.</w:t>
-      </w:r>
-    </w:p>
-    <w:p>
-      <w:r>
         <w:rPr>
           <w:b/>
         </w:rPr>
-        <w:t>Design (32-bit packed data path, 4-lane MAC):</w:t>
-      </w:r>
-    </w:p>
-    <w:p>
-      <w:r>
-        <w:t xml:space="preserve">The GEMV peripheral uses a 32-bit packed data path with a 4-lane parallel MAC. Both the </w:t>
+        <w:t>Design.</w:t>
+      </w:r>
+      <w:r>
+        <w:t xml:space="preserve"> The GEMV peripheral computes Y = W·X + b (int8 W and X, optional int32 bias, int32 Y) with a 32-bit packed data path and a 4-lane parallel MAC. The driver packs four int8 elements per </w:t>
       </w:r>
       <w:r>
         <w:rPr>
@@ -2207,7 +2149,7 @@
         <w:t>X_IN</w:t>
       </w:r>
       <w:r>
-        <w:t xml:space="preserve"> and </w:t>
+        <w:t>/</w:t>
       </w:r>
       <w:r>
         <w:rPr>
@@ -2217,7 +2159,7 @@
         <w:t>W_IN</w:t>
       </w:r>
       <w:r>
-        <w:t xml:space="preserve"> CSR registers are 32 bits wide; the firmware driver packs four int8 elements into each word using </w:t>
+        <w:t xml:space="preserve"> write (</w:t>
       </w:r>
       <w:r>
         <w:rPr>
@@ -2227,71 +2169,114 @@
         <w:t>pack4_i8()</w:t>
       </w:r>
       <w:r>
-        <w:t>, so a 32×32 matvec requires only about 272 CSR writes — a 4× reduction in bus traffic compared to a naïve one-byte-per-write design (which would need 1,088 writes). The internal X and W memories are 32-bit word arrays, and the FSM reads one packed word from each per clock cycle, computing four signed int8 multiply-accumulate operations in parallel (a 4-lane dot-product unit built from 4 DSP blocks). A 32×32 matvec therefore completes in 256 compute cycles — a further 4× improvement over a one-MAC-per-cycle design. The two optimisations are independent and multiply: 4× on the bus and 4× on compute.</w:t>
-      </w:r>
-    </w:p>
-    <w:p>
+        <w:t xml:space="preserve">), so a 32×32 matvec needs ≈272 CSR writes versus 1,088 for a byte-wide design — a 4× bus saving. Internally X and W are 32-bit word arrays; the FSM reads one packed word from each per cycle and computes four signed MACs in parallel (4 DSP blocks), completing a 32×32 matvec in </w:t>
+      </w:r>
       <w:r>
         <w:rPr>
           <w:b/>
         </w:rPr>
-        <w:t>Key features:</w:t>
+        <w:t>256 compute cycles</w:t>
+      </w:r>
+      <w:r>
+        <w:t xml:space="preserve"> — a further 4× over one MAC per cycle. The two savings are independent and multiply. LEN and OUT_DIM are each 32 or 64, runtime-selectable.</w:t>
       </w:r>
     </w:p>
     <w:p>
-      <w:pPr>
-        <w:pStyle w:val="ListBullet"/>
-      </w:pPr>
       <w:r>
         <w:rPr>
           <w:b/>
         </w:rPr>
-        <w:t>32-bit packed data path:</w:t>
-      </w:r>
-      <w:r>
-        <w:t xml:space="preserve"> 4× reduction in CSR-bus writes.</w:t>
-      </w:r>
-    </w:p>
-    <w:p>
-      <w:pPr>
-        <w:pStyle w:val="ListBullet"/>
-      </w:pPr>
+        <w:t>Control FSM.</w:t>
+      </w:r>
+      <w:r>
+        <w:t xml:space="preserve"> A separate always-on write path loads X/W/B with auto-incrementing indices (reset by </w:t>
+      </w:r>
+      <w:r>
+        <w:rPr>
+          <w:rFonts w:ascii="Consolas" w:hAnsi="Consolas"/>
+          <w:sz w:val="20"/>
+        </w:rPr>
+        <w:t>clear_done</w:t>
+      </w:r>
+      <w:r>
+        <w:t xml:space="preserve">). The compute FSM has three states: </w:t>
+      </w:r>
       <w:r>
         <w:rPr>
           <w:b/>
         </w:rPr>
-        <w:t>4-lane parallel MAC:</w:t>
-      </w:r>
-      <w:r>
-        <w:t xml:space="preserve"> 4× reduction in compute cycles.</w:t>
-      </w:r>
-    </w:p>
-    <w:p>
-      <w:pPr>
-        <w:pStyle w:val="ListBullet"/>
-      </w:pPr>
+        <w:t>S_IDLE</w:t>
+      </w:r>
+      <w:r>
+        <w:t xml:space="preserve"> waits for </w:t>
+      </w:r>
+      <w:r>
+        <w:rPr>
+          <w:rFonts w:ascii="Consolas" w:hAnsi="Consolas"/>
+          <w:sz w:val="20"/>
+        </w:rPr>
+        <w:t>start</w:t>
+      </w:r>
+      <w:r>
+        <w:t xml:space="preserve"> and preloads the accumulator with the row bias; </w:t>
+      </w:r>
       <w:r>
         <w:rPr>
           <w:b/>
         </w:rPr>
-        <w:t>Supported dimensions:</w:t>
-      </w:r>
-      <w:r>
-        <w:t xml:space="preserve"> LEN and OUT_DIM each 32 or 64, selected at runtime via control register bits.</w:t>
-      </w:r>
-    </w:p>
-    <w:p>
-      <w:pPr>
-        <w:pStyle w:val="ListBullet"/>
-      </w:pPr>
+        <w:t>S_COMPUTE</w:t>
+      </w:r>
+      <w:r>
+        <w:t xml:space="preserve"> sweeps the LEN/4 words per output row (8 for LEN=32), accumulating one </w:t>
+      </w:r>
+      <w:r>
+        <w:rPr>
+          <w:rFonts w:ascii="Consolas" w:hAnsi="Consolas"/>
+          <w:sz w:val="20"/>
+        </w:rPr>
+        <w:t>dot4</w:t>
+      </w:r>
+      <w:r>
+        <w:t xml:space="preserve"> per cycle, then latches </w:t>
+      </w:r>
+      <w:r>
+        <w:rPr>
+          <w:rFonts w:ascii="Consolas" w:hAnsi="Consolas"/>
+          <w:sz w:val="20"/>
+        </w:rPr>
+        <w:t>y_mem[row]</w:t>
+      </w:r>
+      <w:r>
+        <w:t xml:space="preserve"> and reloads the next bias; </w:t>
+      </w:r>
       <w:r>
         <w:rPr>
           <w:b/>
         </w:rPr>
-        <w:t>Output readout:</w:t>
-      </w:r>
-      <w:r>
-        <w:t xml:space="preserve"> After DONE asserts, the CPU reads Y values sequentially; a write to </w:t>
+        <w:t>S_DONE</w:t>
+      </w:r>
+      <w:r>
+        <w:t xml:space="preserve"> raises </w:t>
+      </w:r>
+      <w:r>
+        <w:rPr>
+          <w:rFonts w:ascii="Consolas" w:hAnsi="Consolas"/>
+          <w:sz w:val="20"/>
+        </w:rPr>
+        <w:t>done</w:t>
+      </w:r>
+      <w:r>
+        <w:t xml:space="preserve">, after which the CPU reads results via </w:t>
+      </w:r>
+      <w:r>
+        <w:rPr>
+          <w:rFonts w:ascii="Consolas" w:hAnsi="Consolas"/>
+          <w:sz w:val="20"/>
+        </w:rPr>
+        <w:t>Y_OUT</w:t>
+      </w:r>
+      <w:r>
+        <w:t>/</w:t>
       </w:r>
       <w:r>
         <w:rPr>
@@ -2301,28 +2286,7 @@
         <w:t>Y_NEXT</w:t>
       </w:r>
       <w:r>
-        <w:t xml:space="preserve"> advances the read pointer.</w:t>
-      </w:r>
-    </w:p>
-    <w:p>
-      <w:r>
-        <w:rPr>
-          <w:b/>
-        </w:rPr>
-        <w:t>Control FSM.</w:t>
-      </w:r>
-      <w:r>
-        <w:t xml:space="preserve"> The </w:t>
-      </w:r>
-      <w:r>
-        <w:rPr>
-          <w:rFonts w:ascii="Consolas" w:hAnsi="Consolas"/>
-          <w:sz w:val="20"/>
-        </w:rPr>
-        <w:t>gemv_core.v</w:t>
-      </w:r>
-      <w:r>
-        <w:t xml:space="preserve"> module separates data loading from computation. Writes to the X, W, and B memories are handled by an always-on write path with auto-incrementing word indices (reset by </w:t>
+        <w:t xml:space="preserve"> and issues </w:t>
       </w:r>
       <w:r>
         <w:rPr>
@@ -2332,138 +2296,7 @@
         <w:t>clear_done</w:t>
       </w:r>
       <w:r>
-        <w:t>), independent of the compute FSM. The compute FSM itself has only three states:</w:t>
-      </w:r>
-    </w:p>
-    <w:p>
-      <w:pPr>
-        <w:pStyle w:val="ListBullet"/>
-      </w:pPr>
-      <w:r>
-        <w:rPr>
-          <w:b/>
-        </w:rPr>
-        <w:t>S_IDLE</w:t>
-      </w:r>
-      <w:r>
-        <w:t xml:space="preserve"> — waits for the </w:t>
-      </w:r>
-      <w:r>
-        <w:rPr>
-          <w:rFonts w:ascii="Consolas" w:hAnsi="Consolas"/>
-          <w:sz w:val="20"/>
-        </w:rPr>
-        <w:t>start</w:t>
-      </w:r>
-      <w:r>
-        <w:t xml:space="preserve"> pulse; on start, preloads the accumulator with </w:t>
-      </w:r>
-      <w:r>
-        <w:rPr>
-          <w:rFonts w:ascii="Consolas" w:hAnsi="Consolas"/>
-          <w:sz w:val="20"/>
-        </w:rPr>
-        <w:t>b_mem[0]</w:t>
-      </w:r>
-      <w:r>
-        <w:t xml:space="preserve"> (or 0 if bias is disabled).</w:t>
-      </w:r>
-    </w:p>
-    <w:p>
-      <w:pPr>
-        <w:pStyle w:val="ListBullet"/>
-      </w:pPr>
-      <w:r>
-        <w:rPr>
-          <w:b/>
-        </w:rPr>
-        <w:t>S_COMPUTE</w:t>
-      </w:r>
-      <w:r>
-        <w:t xml:space="preserve"> — for each output row, iterates over the LEN/4 packed words of X and W (8 words for LEN=32, 16 for LEN=64), performing one 4-lane signed dot-product (</w:t>
-      </w:r>
-      <w:r>
-        <w:rPr>
-          <w:rFonts w:ascii="Consolas" w:hAnsi="Consolas"/>
-          <w:sz w:val="20"/>
-        </w:rPr>
-        <w:t>dot4</w:t>
-      </w:r>
-      <w:r>
-        <w:t xml:space="preserve">) per clock cycle and folding it into the accumulator. When a row completes, the accumulator is written to </w:t>
-      </w:r>
-      <w:r>
-        <w:rPr>
-          <w:rFonts w:ascii="Consolas" w:hAnsi="Consolas"/>
-          <w:sz w:val="20"/>
-        </w:rPr>
-        <w:t>y_mem[row]</w:t>
-      </w:r>
-      <w:r>
-        <w:t xml:space="preserve"> and reloaded with the next row's bias. A 32×32 matvec therefore takes 32 rows × 8 words = </w:t>
-      </w:r>
-      <w:r>
-        <w:rPr>
-          <w:b/>
-        </w:rPr>
-        <w:t>256 compute cycles</w:t>
-      </w:r>
-      <w:r>
         <w:t>.</w:t>
-      </w:r>
-    </w:p>
-    <w:p>
-      <w:pPr>
-        <w:pStyle w:val="ListBullet"/>
-      </w:pPr>
-      <w:r>
-        <w:rPr>
-          <w:b/>
-        </w:rPr>
-        <w:t>S_DONE</w:t>
-      </w:r>
-      <w:r>
-        <w:t xml:space="preserve"> — asserts </w:t>
-      </w:r>
-      <w:r>
-        <w:rPr>
-          <w:rFonts w:ascii="Consolas" w:hAnsi="Consolas"/>
-          <w:sz w:val="20"/>
-        </w:rPr>
-        <w:t>done</w:t>
-      </w:r>
-      <w:r>
-        <w:t xml:space="preserve">; the CPU polls this, reads out the 32 results via </w:t>
-      </w:r>
-      <w:r>
-        <w:rPr>
-          <w:rFonts w:ascii="Consolas" w:hAnsi="Consolas"/>
-          <w:sz w:val="20"/>
-        </w:rPr>
-        <w:t>Y_OUT</w:t>
-      </w:r>
-      <w:r>
-        <w:t>/</w:t>
-      </w:r>
-      <w:r>
-        <w:rPr>
-          <w:rFonts w:ascii="Consolas" w:hAnsi="Consolas"/>
-          <w:sz w:val="20"/>
-        </w:rPr>
-        <w:t>Y_NEXT</w:t>
-      </w:r>
-      <w:r>
-        <w:t xml:space="preserve">, then issues </w:t>
-      </w:r>
-      <w:r>
-        <w:rPr>
-          <w:rFonts w:ascii="Consolas" w:hAnsi="Consolas"/>
-          <w:sz w:val="20"/>
-        </w:rPr>
-        <w:t>clear_done</w:t>
-      </w:r>
-      <w:r>
-        <w:t xml:space="preserve"> to return the FSM to idle.</w:t>
       </w:r>
     </w:p>
     <w:p>
@@ -2485,7 +2318,7 @@
       <w:r>
         <w:drawing>
           <wp:inline xmlns:a="http://schemas.openxmlformats.org/drawingml/2006/main" xmlns:pic="http://schemas.openxmlformats.org/drawingml/2006/picture">
-            <wp:extent cx="5760720" cy="2645830"/>
+            <wp:extent cx="5120640" cy="2979365"/>
             <wp:docPr id="5" name="Picture 5"/>
             <wp:cNvGraphicFramePr>
               <a:graphicFrameLocks noChangeAspect="1"/>
@@ -2494,7 +2327,7 @@
               <a:graphicData uri="http://schemas.openxmlformats.org/drawingml/2006/picture">
                 <pic:pic>
                   <pic:nvPicPr>
-                    <pic:cNvPr id="0" name="Figure5_GEMV_Dataflow.png"/>
+                    <pic:cNvPr id="0" name="Figure5_GEMV_Dataflow.jpeg"/>
                     <pic:cNvPicPr/>
                   </pic:nvPicPr>
                   <pic:blipFill>
@@ -2506,7 +2339,7 @@
                   <pic:spPr>
                     <a:xfrm>
                       <a:off x="0" y="0"/>
-                      <a:ext cx="5760720" cy="2645830"/>
+                      <a:ext cx="5120640" cy="2979365"/>
                     </a:xfrm>
                     <a:prstGeom prst="rect"/>
                   </pic:spPr>
@@ -3271,7 +3104,7 @@
       <w:r>
         <w:drawing>
           <wp:inline xmlns:a="http://schemas.openxmlformats.org/drawingml/2006/main" xmlns:pic="http://schemas.openxmlformats.org/drawingml/2006/picture">
-            <wp:extent cx="5760720" cy="1515789"/>
+            <wp:extent cx="5120640" cy="1347368"/>
             <wp:docPr id="6" name="Picture 6"/>
             <wp:cNvGraphicFramePr>
               <a:graphicFrameLocks noChangeAspect="1"/>
@@ -3292,7 +3125,7 @@
                   <pic:spPr>
                     <a:xfrm>
                       <a:off x="0" y="0"/>
-                      <a:ext cx="5760720" cy="1515789"/>
+                      <a:ext cx="5120640" cy="1347368"/>
                     </a:xfrm>
                     <a:prstGeom prst="rect"/>
                   </pic:spPr>
@@ -5072,7 +4905,7 @@
     </w:p>
     <w:p>
       <w:r>
-        <w:t xml:space="preserve">The captures below were taken from the </w:t>
+        <w:t xml:space="preserve">The captures below are from the </w:t>
       </w:r>
       <w:r>
         <w:rPr>
@@ -5082,7 +4915,7 @@
         <w:t>tb_gemv</w:t>
       </w:r>
       <w:r>
-        <w:t xml:space="preserve"> xsim run. Signals are grouped into Clock/Reset, the CPU-write Load phase, the Start handshake, the FSM state/pointers, the 4-lane MAC datapath, and the Result read-back, so that the full operation can be read top-to-bottom.</w:t>
+        <w:t xml:space="preserve"> xsim run, with signals grouped (Clock/Reset, Load, Start, FSM state/pointers, MAC datapath, Read-back) so the operation reads top-to-bottom.</w:t>
       </w:r>
     </w:p>
     <w:p>
@@ -5104,7 +4937,7 @@
       <w:r>
         <w:drawing>
           <wp:inline xmlns:a="http://schemas.openxmlformats.org/drawingml/2006/main" xmlns:pic="http://schemas.openxmlformats.org/drawingml/2006/picture">
-            <wp:extent cx="5760720" cy="1839830"/>
+            <wp:extent cx="5120640" cy="1635404"/>
             <wp:docPr id="7" name="Picture 7"/>
             <wp:cNvGraphicFramePr>
               <a:graphicFrameLocks noChangeAspect="1"/>
@@ -5125,7 +4958,7 @@
                   <pic:spPr>
                     <a:xfrm>
                       <a:off x="0" y="0"/>
-                      <a:ext cx="5760720" cy="1839830"/>
+                      <a:ext cx="5120640" cy="1635404"/>
                     </a:xfrm>
                     <a:prstGeom prst="rect"/>
                   </pic:spPr>
@@ -5139,7 +4972,7 @@
     <w:p/>
     <w:p>
       <w:r>
-        <w:t xml:space="preserve">Figure 7 shows one complete matrix-vector operation end to end: reset, the three CPU load bursts (the long </w:t>
+        <w:t>Figure 7 shows one matrix-vector operation end to end: reset, the three CPU load bursts (</w:t>
       </w:r>
       <w:r>
         <w:rPr>
@@ -5149,7 +4982,7 @@
         <w:t>x_wr_en</w:t>
       </w:r>
       <w:r>
-        <w:t xml:space="preserve"> / </w:t>
+        <w:t>/</w:t>
       </w:r>
       <w:r>
         <w:rPr>
@@ -5159,7 +4992,7 @@
         <w:t>w_wr_en</w:t>
       </w:r>
       <w:r>
-        <w:t xml:space="preserve"> / </w:t>
+        <w:t>/</w:t>
       </w:r>
       <w:r>
         <w:rPr>
@@ -5169,7 +5002,7 @@
         <w:t>b_wr_en</w:t>
       </w:r>
       <w:r>
-        <w:t xml:space="preserve"> pulses as X, W, and the bias are streamed into the peripheral), the single </w:t>
+        <w:t xml:space="preserve">), the one-cycle </w:t>
       </w:r>
       <w:r>
         <w:rPr>
@@ -5179,7 +5012,7 @@
         <w:t>start</w:t>
       </w:r>
       <w:r>
-        <w:t xml:space="preserve"> pulse, the autonomous compute phase (</w:t>
+        <w:t>, the autonomous compute phase (</w:t>
       </w:r>
       <w:r>
         <w:rPr>
@@ -5199,7 +5032,7 @@
         <w:t>col</w:t>
       </w:r>
       <w:r>
-        <w:t xml:space="preserve"> sweeping), and finally </w:t>
+        <w:t xml:space="preserve"> sweeping), and </w:t>
       </w:r>
       <w:r>
         <w:rPr>
@@ -5209,7 +5042,7 @@
         <w:t>done</w:t>
       </w:r>
       <w:r>
-        <w:t xml:space="preserve"> with the result read-back. The key point is that the three load bursts dominate the timeline, but the CPU only "blocks" for the one-cycle </w:t>
+        <w:t xml:space="preserve"> with read-back. The load bursts dominate the timeline, yet the CPU blocks only for the single </w:t>
       </w:r>
       <w:r>
         <w:rPr>
@@ -5219,7 +5052,7 @@
         <w:t>start</w:t>
       </w:r>
       <w:r>
-        <w:t xml:space="preserve"> write — the compute phase then runs entirely inside the peripheral while the CPU is free.</w:t>
+        <w:t xml:space="preserve"> write — compute then runs entirely inside the peripheral.</w:t>
       </w:r>
     </w:p>
     <w:p>
@@ -5241,7 +5074,7 @@
       <w:r>
         <w:drawing>
           <wp:inline xmlns:a="http://schemas.openxmlformats.org/drawingml/2006/main" xmlns:pic="http://schemas.openxmlformats.org/drawingml/2006/picture">
-            <wp:extent cx="5760720" cy="1807426"/>
+            <wp:extent cx="5120640" cy="1606601"/>
             <wp:docPr id="8" name="Picture 8"/>
             <wp:cNvGraphicFramePr>
               <a:graphicFrameLocks noChangeAspect="1"/>
@@ -5262,7 +5095,7 @@
                   <pic:spPr>
                     <a:xfrm>
                       <a:off x="0" y="0"/>
-                      <a:ext cx="5760720" cy="1807426"/>
+                      <a:ext cx="5120640" cy="1606601"/>
                     </a:xfrm>
                     <a:prstGeom prst="rect"/>
                   </pic:spPr>
@@ -5276,7 +5109,7 @@
     <w:p/>
     <w:p>
       <w:r>
-        <w:t xml:space="preserve">Figure 8 zooms into roughly six clock cycles around the kick-off. On the rising edge during the one-cycle </w:t>
+        <w:t xml:space="preserve">Figure 8 zooms to ~6 cycles around kick-off: on the rising edge during the one-cycle </w:t>
       </w:r>
       <w:r>
         <w:rPr>
@@ -5316,17 +5149,7 @@
         <w:t>busy</w:t>
       </w:r>
       <w:r>
-        <w:t xml:space="preserve"> asserts; </w:t>
-      </w:r>
-      <w:r>
-        <w:rPr>
-          <w:rFonts w:ascii="Consolas" w:hAnsi="Consolas"/>
-          <w:sz w:val="20"/>
-        </w:rPr>
-        <w:t>start</w:t>
-      </w:r>
-      <w:r>
-        <w:t xml:space="preserve"> then returns to 0. This is the single-cycle handshake: one CSR write places the peripheral in COMPUTE and the CPU is immediately released to do other work.</w:t>
+        <w:t xml:space="preserve"> asserts. One CSR write starts the peripheral and the CPU is immediately free.</w:t>
       </w:r>
     </w:p>
     <w:p>
@@ -5348,7 +5171,7 @@
       <w:r>
         <w:drawing>
           <wp:inline xmlns:a="http://schemas.openxmlformats.org/drawingml/2006/main" xmlns:pic="http://schemas.openxmlformats.org/drawingml/2006/picture">
-            <wp:extent cx="5760720" cy="1818227"/>
+            <wp:extent cx="5120640" cy="1616202"/>
             <wp:docPr id="9" name="Picture 9"/>
             <wp:cNvGraphicFramePr>
               <a:graphicFrameLocks noChangeAspect="1"/>
@@ -5369,7 +5192,7 @@
                   <pic:spPr>
                     <a:xfrm>
                       <a:off x="0" y="0"/>
-                      <a:ext cx="5760720" cy="1818227"/>
+                      <a:ext cx="5120640" cy="1616202"/>
                     </a:xfrm>
                     <a:prstGeom prst="rect"/>
                   </pic:spPr>
@@ -5383,17 +5206,7 @@
     <w:p/>
     <w:p>
       <w:r>
-        <w:t xml:space="preserve">Figure 9 spans one full output row (~10 cycles). With </w:t>
-      </w:r>
-      <w:r>
-        <w:rPr>
-          <w:rFonts w:ascii="Consolas" w:hAnsi="Consolas"/>
-          <w:sz w:val="20"/>
-        </w:rPr>
-        <w:t>state = 1</w:t>
-      </w:r>
-      <w:r>
-        <w:t xml:space="preserve"> and </w:t>
+        <w:t xml:space="preserve">Figure 9 spans one output row. With </w:t>
       </w:r>
       <w:r>
         <w:rPr>
@@ -5420,10 +5233,10 @@
           <w:rFonts w:ascii="Consolas" w:hAnsi="Consolas"/>
           <w:sz w:val="20"/>
         </w:rPr>
-        <w:t>0 → 1 → … → 8</w:t>
-      </w:r>
-      <w:r>
-        <w:t xml:space="preserve">; on every clock </w:t>
+        <w:t>0 → 8</w:t>
+      </w:r>
+      <w:r>
+        <w:t xml:space="preserve">; each clock </w:t>
       </w:r>
       <w:r>
         <w:rPr>
@@ -5433,7 +5246,7 @@
         <w:t>x_word</w:t>
       </w:r>
       <w:r>
-        <w:t xml:space="preserve"> and </w:t>
+        <w:t>/</w:t>
       </w:r>
       <w:r>
         <w:rPr>
@@ -5443,7 +5256,7 @@
         <w:t>w_word</w:t>
       </w:r>
       <w:r>
-        <w:t xml:space="preserve"> present a fresh pair of packed 32-bit operands, </w:t>
+        <w:t xml:space="preserve"> present a fresh packed-operand pair, </w:t>
       </w:r>
       <w:r>
         <w:rPr>
@@ -5453,7 +5266,7 @@
         <w:t>dot4</w:t>
       </w:r>
       <w:r>
-        <w:t xml:space="preserve"> produces a new signed value (four signed int8 multiplies plus the adder tree, in a single cycle), and </w:t>
+        <w:t xml:space="preserve"> yields a new signed value (four int8 multiplies + adder tree in one cycle), and </w:t>
       </w:r>
       <w:r>
         <w:rPr>
@@ -5463,17 +5276,17 @@
         <w:t>acc</w:t>
       </w:r>
       <w:r>
-        <w:t xml:space="preserve"> accumulates monotonically. When </w:t>
+        <w:t xml:space="preserve"> accumulates. At </w:t>
       </w:r>
       <w:r>
         <w:rPr>
           <w:rFonts w:ascii="Consolas" w:hAnsi="Consolas"/>
           <w:sz w:val="20"/>
         </w:rPr>
-        <w:t>col</w:t>
-      </w:r>
-      <w:r>
-        <w:t xml:space="preserve"> reaches 8, </w:t>
+        <w:t>col = 8</w:t>
+      </w:r>
+      <w:r>
+        <w:t xml:space="preserve">, </w:t>
       </w:r>
       <w:r>
         <w:rPr>
@@ -5483,7 +5296,7 @@
         <w:t>y_mem[0]</w:t>
       </w:r>
       <w:r>
-        <w:t xml:space="preserve"> is latched, </w:t>
+        <w:t xml:space="preserve"> latches, </w:t>
       </w:r>
       <w:r>
         <w:rPr>
@@ -5493,17 +5306,7 @@
         <w:t>row</w:t>
       </w:r>
       <w:r>
-        <w:t xml:space="preserve"> advances to 1, </w:t>
-      </w:r>
-      <w:r>
-        <w:rPr>
-          <w:rFonts w:ascii="Consolas" w:hAnsi="Consolas"/>
-          <w:sz w:val="20"/>
-        </w:rPr>
-        <w:t>col</w:t>
-      </w:r>
-      <w:r>
-        <w:t xml:space="preserve"> resets, and </w:t>
+        <w:t xml:space="preserve"> advances and </w:t>
       </w:r>
       <w:r>
         <w:rPr>
@@ -5523,7 +5326,7 @@
         <w:t>b[1]</w:t>
       </w:r>
       <w:r>
-        <w:t xml:space="preserve">. This is the heart of the packed 4-lane design: 32 multiplies are completed in 8 cycles, versus 32 cycles for a one-byte-per-cycle MAC. The full compute phase between </w:t>
+        <w:t xml:space="preserve">. So 32 multiplies complete in 8 cycles (vs. 32 for a byte-wide MAC); the full </w:t>
       </w:r>
       <w:r>
         <w:rPr>
@@ -5533,7 +5336,7 @@
         <w:t>start</w:t>
       </w:r>
       <w:r>
-        <w:t xml:space="preserve"> and </w:t>
+        <w:t>→</w:t>
       </w:r>
       <w:r>
         <w:rPr>
@@ -5543,7 +5346,7 @@
         <w:t>done</w:t>
       </w:r>
       <w:r>
-        <w:t xml:space="preserve"> spans ≈290 cycles for a 32×32 matvec (the 256 multiply-accumulate cycles plus per-row bias-reload and bookkeeping).</w:t>
+        <w:t xml:space="preserve"> phase is ≈290 cycles for a 32×32 matvec (256 MAC cycles plus per-row bookkeeping).</w:t>
       </w:r>
     </w:p>
     <w:p>
@@ -5565,7 +5368,7 @@
       <w:r>
         <w:drawing>
           <wp:inline xmlns:a="http://schemas.openxmlformats.org/drawingml/2006/main" xmlns:pic="http://schemas.openxmlformats.org/drawingml/2006/picture">
-            <wp:extent cx="5760720" cy="1800225"/>
+            <wp:extent cx="5120640" cy="1600200"/>
             <wp:docPr id="10" name="Picture 10"/>
             <wp:cNvGraphicFramePr>
               <a:graphicFrameLocks noChangeAspect="1"/>
@@ -5586,7 +5389,7 @@
                   <pic:spPr>
                     <a:xfrm>
                       <a:off x="0" y="0"/>
-                      <a:ext cx="5760720" cy="1800225"/>
+                      <a:ext cx="5120640" cy="1600200"/>
                     </a:xfrm>
                     <a:prstGeom prst="rect"/>
                   </pic:spPr>
@@ -5600,7 +5403,7 @@
     <w:p/>
     <w:p>
       <w:r>
-        <w:t xml:space="preserve">Figure 10 shows the hand-off back to the CPU. </w:t>
+        <w:t xml:space="preserve">Figure 10 shows the hand-off: </w:t>
       </w:r>
       <w:r>
         <w:rPr>
@@ -5610,7 +5413,7 @@
         <w:t>busy</w:t>
       </w:r>
       <w:r>
-        <w:t xml:space="preserve"> deasserts and </w:t>
+        <w:t xml:space="preserve"> deasserts, </w:t>
       </w:r>
       <w:r>
         <w:rPr>
@@ -5630,7 +5433,7 @@
         <w:t>1 → 2</w:t>
       </w:r>
       <w:r>
-        <w:t xml:space="preserve"> (COMPUTE → DONE); </w:t>
+        <w:t xml:space="preserve"> (COMPUTE → DONE), </w:t>
       </w:r>
       <w:r>
         <w:rPr>
@@ -5640,7 +5443,7 @@
         <w:t>done</w:t>
       </w:r>
       <w:r>
-        <w:t xml:space="preserve"> latches high; a </w:t>
+        <w:t xml:space="preserve"> latches, and a </w:t>
       </w:r>
       <w:r>
         <w:rPr>
@@ -5650,17 +5453,7 @@
         <w:t>clear_done</w:t>
       </w:r>
       <w:r>
-        <w:t xml:space="preserve"> pulse then clears </w:t>
-      </w:r>
-      <w:r>
-        <w:rPr>
-          <w:rFonts w:ascii="Consolas" w:hAnsi="Consolas"/>
-          <w:sz w:val="20"/>
-        </w:rPr>
-        <w:t>done</w:t>
-      </w:r>
-      <w:r>
-        <w:t xml:space="preserve"> and resets the read pointer. On each subsequent </w:t>
+        <w:t xml:space="preserve"> pulse resets the read pointer. Each </w:t>
       </w:r>
       <w:r>
         <w:rPr>
@@ -5670,17 +5463,7 @@
         <w:t>y_rd_en</w:t>
       </w:r>
       <w:r>
-        <w:t xml:space="preserve"> pulse, </w:t>
-      </w:r>
-      <w:r>
-        <w:rPr>
-          <w:rFonts w:ascii="Consolas" w:hAnsi="Consolas"/>
-          <w:sz w:val="20"/>
-        </w:rPr>
-        <w:t>y_rd_data</w:t>
-      </w:r>
-      <w:r>
-        <w:t xml:space="preserve"> presents the next int32 result. For this deterministic stimulus the four outputs read out as −8, −6, −4, −2 (rows 0–3), which match the hand-computed software golden exactly — confirming the peripheral is bit-exact, not merely fast.</w:t>
+        <w:t xml:space="preserve"> pulse presents the next int32 result; for this stimulus the outputs read −8, −6, −4, −2 (rows 0–3), matching the software golden exactly — the peripheral is bit-exact, not just fast.</w:t>
       </w:r>
     </w:p>
     <w:p>
@@ -5735,7 +5518,7 @@
       <w:r>
         <w:drawing>
           <wp:inline xmlns:a="http://schemas.openxmlformats.org/drawingml/2006/main" xmlns:pic="http://schemas.openxmlformats.org/drawingml/2006/picture">
-            <wp:extent cx="5760720" cy="799300"/>
+            <wp:extent cx="5120640" cy="710489"/>
             <wp:docPr id="11" name="Picture 11"/>
             <wp:cNvGraphicFramePr>
               <a:graphicFrameLocks noChangeAspect="1"/>
@@ -5756,7 +5539,7 @@
                   <pic:spPr>
                     <a:xfrm>
                       <a:off x="0" y="0"/>
-                      <a:ext cx="5760720" cy="799300"/>
+                      <a:ext cx="5120640" cy="710489"/>
                     </a:xfrm>
                     <a:prstGeom prst="rect"/>
                   </pic:spPr>
@@ -5780,7 +5563,7 @@
         <w:t>index</w:t>
       </w:r>
       <w:r>
-        <w:t xml:space="preserve"> through every legal value </w:t>
+        <w:t xml:space="preserve"> through </w:t>
       </w:r>
       <w:r>
         <w:rPr>
@@ -5790,7 +5573,7 @@
         <w:t>0 → 15</w:t>
       </w:r>
       <w:r>
-        <w:t xml:space="preserve">, one per clock, while </w:t>
+        <w:t xml:space="preserve">, one per clock, sampling </w:t>
       </w:r>
       <w:r>
         <w:rPr>
@@ -5800,7 +5583,7 @@
         <w:t>value</w:t>
       </w:r>
       <w:r>
-        <w:t xml:space="preserve"> is sampled on the same cycle and checked against the golden table; the internal address </w:t>
+        <w:t xml:space="preserve"> on the same cycle and checking it against the golden table (</w:t>
       </w:r>
       <w:r>
         <w:rPr>
@@ -5810,16 +5593,16 @@
         <w:t>addr = index[3:0]</w:t>
       </w:r>
       <w:r>
-        <w:t xml:space="preserve"> is shown beneath. Two properties are visible directly: (1) </w:t>
+        <w:t xml:space="preserve"> shown beneath). It shows two properties: </w:t>
       </w:r>
       <w:r>
         <w:rPr>
           <w:b/>
         </w:rPr>
-        <w:t>zero-cycle, combinational behaviour</w:t>
-      </w:r>
-      <w:r>
-        <w:t xml:space="preserve"> — every </w:t>
+        <w:t>zero-cycle combinational behaviour</w:t>
+      </w:r>
+      <w:r>
+        <w:t xml:space="preserve"> — each </w:t>
       </w:r>
       <w:r>
         <w:rPr>
@@ -5829,7 +5612,7 @@
         <w:t>index</w:t>
       </w:r>
       <w:r>
-        <w:t xml:space="preserve"> transition is reflected in </w:t>
+        <w:t xml:space="preserve"> transition appears in </w:t>
       </w:r>
       <w:r>
         <w:rPr>
@@ -5839,7 +5622,7 @@
         <w:t>value</w:t>
       </w:r>
       <w:r>
-        <w:t xml:space="preserve"> on the same cycle, with no pipeline register, so a softmax exponent is available the moment the CPU writes the index; and (2) </w:t>
+        <w:t xml:space="preserve"> the same cycle, so a softmax exponent is ready immediately; and </w:t>
       </w:r>
       <w:r>
         <w:rPr>
@@ -5848,7 +5631,7 @@
         <w:t>monotonic decay</w:t>
       </w:r>
       <w:r>
-        <w:t xml:space="preserve"> — the outputs descend smoothly from </w:t>
+        <w:t xml:space="preserve"> — outputs fall from </w:t>
       </w:r>
       <w:r>
         <w:rPr>
@@ -5858,7 +5641,7 @@
         <w:t>0x0400 = 1024</w:t>
       </w:r>
       <w:r>
-        <w:t xml:space="preserve"> (the Q10 representation of 1.0) at </w:t>
+        <w:t xml:space="preserve"> (Q10 for 1.0) at </w:t>
       </w:r>
       <w:r>
         <w:rPr>
@@ -5868,7 +5651,7 @@
         <w:t>index = 0</w:t>
       </w:r>
       <w:r>
-        <w:t xml:space="preserve"> down to </w:t>
+        <w:t xml:space="preserve"> to </w:t>
       </w:r>
       <w:r>
         <w:rPr>
@@ -5888,7 +5671,7 @@
         <w:t>index = 15</w:t>
       </w:r>
       <w:r>
-        <w:t xml:space="preserve">. These values match the software helper </w:t>
+        <w:t xml:space="preserve">. These match </w:t>
       </w:r>
       <w:r>
         <w:rPr>
@@ -5898,37 +5681,7 @@
         <w:t>compute_exp_q10()</w:t>
       </w:r>
       <w:r>
-        <w:t xml:space="preserve"> in </w:t>
-      </w:r>
-      <w:r>
-        <w:rPr>
-          <w:rFonts w:ascii="Consolas" w:hAnsi="Consolas"/>
-          <w:sz w:val="20"/>
-        </w:rPr>
-        <w:t>tinyformer.c</w:t>
-      </w:r>
-      <w:r>
-        <w:t xml:space="preserve"> bit-for-bit, so the EXP-LUT is a drop-in numerical replacement rather than an approximation. All 16 entries are covered in 16 cycles, and the console reports </w:t>
-      </w:r>
-      <w:r>
-        <w:rPr>
-          <w:rFonts w:ascii="Consolas" w:hAnsi="Consolas"/>
-          <w:sz w:val="20"/>
-        </w:rPr>
-        <w:t>ok swp idx=k</w:t>
-      </w:r>
-      <w:r>
-        <w:t xml:space="preserve"> for every </w:t>
-      </w:r>
-      <w:r>
-        <w:rPr>
-          <w:rFonts w:ascii="Consolas" w:hAnsi="Consolas"/>
-          <w:sz w:val="20"/>
-        </w:rPr>
-        <w:t>k</w:t>
-      </w:r>
-      <w:r>
-        <w:t>.</w:t>
+        <w:t xml:space="preserve"> bit-for-bit, so the EXP-LUT is a drop-in replacement, not an approximation. All 16 entries are covered in 16 cycles.</w:t>
       </w:r>
     </w:p>
     <w:p>
@@ -5950,7 +5703,7 @@
       <w:r>
         <w:drawing>
           <wp:inline xmlns:a="http://schemas.openxmlformats.org/drawingml/2006/main" xmlns:pic="http://schemas.openxmlformats.org/drawingml/2006/picture">
-            <wp:extent cx="5760720" cy="788499"/>
+            <wp:extent cx="5120640" cy="700888"/>
             <wp:docPr id="12" name="Picture 12"/>
             <wp:cNvGraphicFramePr>
               <a:graphicFrameLocks noChangeAspect="1"/>
@@ -5971,7 +5724,7 @@
                   <pic:spPr>
                     <a:xfrm>
                       <a:off x="0" y="0"/>
-                      <a:ext cx="5760720" cy="788499"/>
+                      <a:ext cx="5120640" cy="700888"/>
                     </a:xfrm>
                     <a:prstGeom prst="rect"/>
                   </pic:spPr>
@@ -6277,7 +6030,7 @@
     <w:p/>
     <w:p>
       <w:r>
-        <w:t xml:space="preserve">Each plateau holds rock-steady for the full five cycles with no glitches (the LUT is a pure combinational ROM with no internal state), and every transition is an instantaneous step to the new entry. This confirms the accelerator delivers a usable softmax weight with zero latency: the CPU's only per-exponent cost is the two CSR transactions (write index, read value) — roughly 12 cycles, versus the ≈21,000-cycle software </w:t>
+        <w:t xml:space="preserve">Each plateau holds steady with no glitches (a pure combinational ROM), and every transition is an instantaneous step. The per-exponent cost is just two CSR transactions (~12 cycles) versus the ≈21,000-cycle software </w:t>
       </w:r>
       <w:r>
         <w:rPr>
@@ -6287,17 +6040,7 @@
         <w:t>exp()</w:t>
       </w:r>
       <w:r>
-        <w:t xml:space="preserve"> it replaces. Across 2,560 softmax exponents per inference, the EXP-LUT accounts for ≈53.8 M of the cycles eliminated by </w:t>
-      </w:r>
-      <w:r>
-        <w:rPr>
-          <w:rFonts w:ascii="Consolas" w:hAnsi="Consolas"/>
-          <w:sz w:val="20"/>
-        </w:rPr>
-        <w:t>accel_all</w:t>
-      </w:r>
-      <w:r>
-        <w:t xml:space="preserve"> — the single largest contributor to the 4.82× speedup.</w:t>
+        <w:t>. Across 2,560 exponents per inference, the EXP-LUT eliminates ≈53.8 M cycles — the single largest contributor to the 4.82× speedup.</w:t>
       </w:r>
     </w:p>
     <w:p>
@@ -6419,7 +6162,7 @@
       <w:r>
         <w:drawing>
           <wp:inline xmlns:a="http://schemas.openxmlformats.org/drawingml/2006/main" xmlns:pic="http://schemas.openxmlformats.org/drawingml/2006/picture">
-            <wp:extent cx="5760720" cy="2789401"/>
+            <wp:extent cx="5120640" cy="2479468"/>
             <wp:docPr id="13" name="Picture 13"/>
             <wp:cNvGraphicFramePr>
               <a:graphicFrameLocks noChangeAspect="1"/>
@@ -6440,7 +6183,7 @@
                   <pic:spPr>
                     <a:xfrm>
                       <a:off x="0" y="0"/>
-                      <a:ext cx="5760720" cy="2789401"/>
+                      <a:ext cx="5120640" cy="2479468"/>
                     </a:xfrm>
                     <a:prstGeom prst="rect"/>
                   </pic:spPr>
@@ -7329,7 +7072,7 @@
       <w:r>
         <w:drawing>
           <wp:inline xmlns:a="http://schemas.openxmlformats.org/drawingml/2006/main" xmlns:pic="http://schemas.openxmlformats.org/drawingml/2006/picture">
-            <wp:extent cx="5760720" cy="3986615"/>
+            <wp:extent cx="5120640" cy="3543658"/>
             <wp:docPr id="14" name="Picture 14"/>
             <wp:cNvGraphicFramePr>
               <a:graphicFrameLocks noChangeAspect="1"/>
@@ -7350,7 +7093,7 @@
                   <pic:spPr>
                     <a:xfrm>
                       <a:off x="0" y="0"/>
-                      <a:ext cx="5760720" cy="3986615"/>
+                      <a:ext cx="5120640" cy="3543658"/>
                     </a:xfrm>
                     <a:prstGeom prst="rect"/>
                   </pic:spPr>
@@ -8707,7 +8450,7 @@
         <w:t>Bottleneck identification is essential and non-obvious.</w:t>
       </w:r>
       <w:r>
-        <w:t xml:space="preserve"> The 71% cycle share of softmax exp() was not predictable from instruction-count analysis alone. Without on-chip cycle-accurate profiling, design effort might have been misallocated to attention dot-products, which represent only 1% of measured cycles and deliver only a minor improvement when accelerated.</w:t>
+        <w:t xml:space="preserve"> The 71% cycle share of softmax exp() was not predictable from instruction counts; without on-chip profiling, effort might have gone to attention dot-products, which are only 1% of cycles.</w:t>
       </w:r>
     </w:p>
     <w:p>
@@ -8724,7 +8467,7 @@
         <w:t>The simplest accelerator delivers the largest gain.</w:t>
       </w:r>
       <w:r>
-        <w:t xml:space="preserve"> The EXP-LUT peripheral — a combinational ROM with two CSR registers — accounts for the majority of the total cycle reduction despite being simpler to implement than either the custom instruction or the GEMV core. This outcome reflects the importance of targeting the true bottleneck rather than the most technically interesting operation.</w:t>
+        <w:t xml:space="preserve"> The EXP-LUT — a combinational ROM with two CSR registers — accounts for most of the cycle reduction despite being the simplest block, underscoring the value of targeting the true bottleneck over the most interesting one.</w:t>
       </w:r>
     </w:p>
     <w:p>
@@ -8738,10 +8481,10 @@
         <w:rPr>
           <w:b/>
         </w:rPr>
-        <w:t>Data-path width is as important as compute parallelism.</w:t>
-      </w:r>
-      <w:r>
-        <w:t xml:space="preserve"> The GEMV peripheral's efficiency comes in equal parts from reducing CSR-bus traffic (4× via packed 32-bit writes) and from parallelizing the MAC unit (4× via the 4-lane dot product). Neglecting either half of this optimization would have left a 4× improvement on the table. This finding generalizes: for MMIO-coupled accelerators, memory and bus bandwidth is a co-bottleneck with raw arithmetic throughput.</w:t>
+        <w:t>Data-path width matters as much as compute parallelism.</w:t>
+      </w:r>
+      <w:r>
+        <w:t xml:space="preserve"> GEMV's efficiency comes equally from cutting CSR-bus traffic (4×, packed writes) and parallelizing the MAC (4×, 4-lane); for MMIO-coupled accelerators, bus bandwidth is a co-bottleneck with arithmetic throughput.</w:t>
       </w:r>
     </w:p>
     <w:p>
@@ -8755,10 +8498,20 @@
         <w:rPr>
           <w:b/>
         </w:rPr>
-        <w:t>Correctness must precede performance measurement.</w:t>
-      </w:r>
-      <w:r>
-        <w:t xml:space="preserve"> The ENC_CKSUM gate prevented reporting speedups that might have reflected skipped computation or numerical corruption. The discipline of requiring bit-identical encoder output before any benchmarking is essential to the validity of all reported results.</w:t>
+        <w:t>Correctness must precede performance.</w:t>
+      </w:r>
+      <w:r>
+        <w:t xml:space="preserve"> Requiring a bit-identical </w:t>
+      </w:r>
+      <w:r>
+        <w:rPr>
+          <w:rFonts w:ascii="Consolas" w:hAnsi="Consolas"/>
+          <w:sz w:val="20"/>
+        </w:rPr>
+        <w:t>ENC_CKSUM</w:t>
+      </w:r>
+      <w:r>
+        <w:t xml:space="preserve"> before any benchmark prevented reporting speedups that reflected skipped or corrupted computation.</w:t>
       </w:r>
     </w:p>
     <w:p>
@@ -8772,10 +8525,10 @@
         <w:rPr>
           <w:b/>
         </w:rPr>
-        <w:t>4.82× speedup at ~10% LUT cost is competitive with published work.</w:t>
-      </w:r>
-      <w:r>
-        <w:t xml:space="preserve"> KWT-Tiny [1] reports 5× speedup with 29% area overhead; this work achieves 4.82× with a +3.9 pp LUT overhead (total 10.04%) — roughly 7× lower added area for a comparable speedup — while preserving full bit-exact correctness and using an open, reproducible FPGA platform. The honest counterpoint is that area and power both rose slightly against an initial goal of reducing them; the project treats this as the expected cost of dedicated hardware rather than a failure of the design.</w:t>
+        <w:t>4.82× at ~10% LUT is competitive.</w:t>
+      </w:r>
+      <w:r>
+        <w:t xml:space="preserve"> KWT-Tiny [1] reports 5× at 29% area overhead; this work reaches 4.82× for a +3.9 pp LUT overhead (≈7× lower added area), with full bit-exact accuracy on an open FPGA platform. Honestly, area and power both rose slightly against the initial goal of reducing them — the expected cost of dedicated hardware.</w:t>
       </w:r>
     </w:p>
     <w:p>
@@ -8789,10 +8542,10 @@
         <w:rPr>
           <w:b/>
         </w:rPr>
-        <w:t>The universality-effectiveness trade-off is bounded by the bottleneck.</w:t>
-      </w:r>
-      <w:r>
-        <w:t xml:space="preserve"> Accelerating the softmax (highly specific to the attention mechanism) and GEMV (general but dimension-parameterized) simultaneously required accepting that the bitstream is tailored to TinyFormer's fixed dimensions. For a fully universal accelerator that worked across arbitrary model sizes, the GEMV peripheral would need tiling and DMA support; the EXP-LUT would need a larger, software-programmable table.</w:t>
+        <w:t>Universality vs. effectiveness is bounded by the bottleneck.</w:t>
+      </w:r>
+      <w:r>
+        <w:t xml:space="preserve"> Accelerating softmax and GEMV ties the bitstream to TinyFormer's fixed dimensions; a fully general accelerator would need GEMV tiling/DMA and a larger, programmable EXP-LUT.</w:t>
       </w:r>
     </w:p>
     <w:p>
@@ -9009,7 +8762,7 @@
                 <w:rFonts w:ascii="Consolas" w:hAnsi="Consolas"/>
                 <w:sz w:val="20"/>
               </w:rPr>
-              <w:t>accel_*/</w:t>
+              <w:t>accel_all/</w:t>
             </w:r>
           </w:p>
         </w:tc>
@@ -9020,7 +8773,7 @@
           <w:p>
             <w:r/>
             <w:r>
-              <w:t>Per-mode main files (six modes total)</w:t>
+              <w:t>Per-mode main files (baseline and accel_all)</w:t>
             </w:r>
           </w:p>
         </w:tc>

</xml_diff>

<commit_message>
docs: template-style title page + condense report toward ~25pp
- Replace left-aligned metadata table with a centered, template-style
  title page (title, project no., report type, students+IDs, supervisor,
  institution, date); fixes the sparse/empty front page.
- Single explicit page breaks (cover->TOC, ->Abstract); no double breaks.
- Condense prose across all sections (~13% fewer words) with all facts,
  numbers, tables, and figures preserved.
- Smaller figure cap (max 5.2x4.2in) and tighter paragraph/line spacing
  to pack content toward the ~25-page target.

Co-Authored-By: Claude Opus 4.8 <noreply@anthropic.com>
</commit_message>
<xml_diff>
--- a/Docs/Project_Report.docx
+++ b/Docs/Project_Report.docx
@@ -2,257 +2,163 @@
 <file path=word/document.xml><?xml version="1.0" encoding="utf-8"?>
 <w:document xmlns:wpc="http://schemas.microsoft.com/office/word/2010/wordprocessingCanvas" xmlns:mo="http://schemas.microsoft.com/office/mac/office/2008/main" xmlns:mc="http://schemas.openxmlformats.org/markup-compatibility/2006" xmlns:mv="urn:schemas-microsoft-com:mac:vml" xmlns:o="urn:schemas-microsoft-com:office:office" xmlns:r="http://schemas.openxmlformats.org/officeDocument/2006/relationships" xmlns:m="http://schemas.openxmlformats.org/officeDocument/2006/math" xmlns:v="urn:schemas-microsoft-com:vml" xmlns:wp14="http://schemas.microsoft.com/office/word/2010/wordprocessingDrawing" xmlns:wp="http://schemas.openxmlformats.org/drawingml/2006/wordprocessingDrawing" xmlns:w10="urn:schemas-microsoft-com:office:word" xmlns:w="http://schemas.openxmlformats.org/wordprocessingml/2006/main" xmlns:w14="http://schemas.microsoft.com/office/word/2010/wordml" xmlns:wpg="http://schemas.microsoft.com/office/word/2010/wordprocessingGroup" xmlns:wpi="http://schemas.microsoft.com/office/word/2010/wordprocessingInk" xmlns:wne="http://schemas.microsoft.com/office/word/2006/wordml" xmlns:wps="http://schemas.microsoft.com/office/word/2010/wordprocessingShape" mc:Ignorable="w14 wp14">
   <w:body>
+    <w:p/>
+    <w:p/>
+    <w:p/>
     <w:p>
       <w:pPr>
-        <w:pStyle w:val="Title"/>
+        <w:spacing w:before="0" w:after="360"/>
         <w:jc w:val="center"/>
       </w:pPr>
       <w:r>
+        <w:rPr>
+          <w:b/>
+          <w:i w:val="0"/>
+          <w:sz w:val="44"/>
+        </w:rPr>
         <w:t>TinyFormer: Hardware-Accelerated Transformer Inference on FPGA</w:t>
       </w:r>
     </w:p>
-    <w:tbl>
-      <w:tblPr>
-        <w:tblStyle w:val="TableGrid"/>
-        <w:tblW w:type="auto" w:w="0"/>
+    <w:p>
+      <w:pPr>
+        <w:spacing w:before="0" w:after="80"/>
         <w:jc w:val="center"/>
-        <w:tblLook w:firstColumn="1" w:firstRow="1" w:lastColumn="0" w:lastRow="0" w:noHBand="0" w:noVBand="1" w:val="04A0"/>
-      </w:tblPr>
-      <w:tblGrid>
-        <w:gridCol w:w="4320"/>
-        <w:gridCol w:w="4320"/>
-      </w:tblGrid>
-      <w:tr>
-        <w:tc>
-          <w:tcPr>
-            <w:tcW w:type="dxa" w:w="4320"/>
-            <w:shd w:val="clear" w:color="auto" w:fill="D9E2F3"/>
-          </w:tcPr>
-          <w:p>
-            <w:r>
-              <w:rPr>
-                <w:b/>
-              </w:rPr>
-            </w:r>
-            <w:r>
-              <w:rPr>
-                <w:b/>
-              </w:rPr>
-              <w:t>Project Title</w:t>
-            </w:r>
-          </w:p>
-        </w:tc>
-        <w:tc>
-          <w:tcPr>
-            <w:tcW w:type="dxa" w:w="4320"/>
-            <w:shd w:val="clear" w:color="auto" w:fill="D9E2F3"/>
-          </w:tcPr>
-          <w:p>
-            <w:r>
-              <w:rPr>
-                <w:b/>
-              </w:rPr>
-            </w:r>
-            <w:r>
-              <w:rPr>
-                <w:b/>
-              </w:rPr>
-              <w:t>TinyFormer: Hardware-Accelerated Transformer Inference on FPGA</w:t>
-            </w:r>
-          </w:p>
-        </w:tc>
-      </w:tr>
-      <w:tr>
-        <w:tc>
-          <w:tcPr>
-            <w:tcW w:type="dxa" w:w="4320"/>
-          </w:tcPr>
-          <w:p>
-            <w:r/>
-            <w:r>
-              <w:rPr>
-                <w:b/>
-              </w:rPr>
-              <w:t>Project Number</w:t>
-            </w:r>
-          </w:p>
-        </w:tc>
-        <w:tc>
-          <w:tcPr>
-            <w:tcW w:type="dxa" w:w="4320"/>
-          </w:tcPr>
-          <w:p>
-            <w:r/>
-            <w:r>
-              <w:t>[Project Number]</w:t>
-            </w:r>
-          </w:p>
-        </w:tc>
-      </w:tr>
-      <w:tr>
-        <w:tc>
-          <w:tcPr>
-            <w:tcW w:type="dxa" w:w="4320"/>
-          </w:tcPr>
-          <w:p>
-            <w:r/>
-            <w:r>
-              <w:rPr>
-                <w:b/>
-              </w:rPr>
-              <w:t>Student</w:t>
-            </w:r>
-          </w:p>
-        </w:tc>
-        <w:tc>
-          <w:tcPr>
-            <w:tcW w:type="dxa" w:w="4320"/>
-          </w:tcPr>
-          <w:p>
-            <w:r/>
-            <w:r>
-              <w:t>Ron Weinstein</w:t>
-            </w:r>
-          </w:p>
-        </w:tc>
-      </w:tr>
-      <w:tr>
-        <w:tc>
-          <w:tcPr>
-            <w:tcW w:type="dxa" w:w="4320"/>
-          </w:tcPr>
-          <w:p>
-            <w:r/>
-            <w:r>
-              <w:rPr>
-                <w:b/>
-              </w:rPr>
-              <w:t>ID</w:t>
-            </w:r>
-          </w:p>
-        </w:tc>
-        <w:tc>
-          <w:tcPr>
-            <w:tcW w:type="dxa" w:w="4320"/>
-          </w:tcPr>
-          <w:p>
-            <w:r/>
-            <w:r>
-              <w:t>[ID]</w:t>
-            </w:r>
-          </w:p>
-        </w:tc>
-      </w:tr>
-      <w:tr>
-        <w:tc>
-          <w:tcPr>
-            <w:tcW w:type="dxa" w:w="4320"/>
-          </w:tcPr>
-          <w:p>
-            <w:r/>
-            <w:r>
-              <w:rPr>
-                <w:b/>
-              </w:rPr>
-              <w:t>Student</w:t>
-            </w:r>
-          </w:p>
-        </w:tc>
-        <w:tc>
-          <w:tcPr>
-            <w:tcW w:type="dxa" w:w="4320"/>
-          </w:tcPr>
-          <w:p>
-            <w:r/>
-            <w:r>
-              <w:t>Yehonatan Grobgeld</w:t>
-            </w:r>
-          </w:p>
-        </w:tc>
-      </w:tr>
-      <w:tr>
-        <w:tc>
-          <w:tcPr>
-            <w:tcW w:type="dxa" w:w="4320"/>
-          </w:tcPr>
-          <w:p>
-            <w:r/>
-            <w:r>
-              <w:rPr>
-                <w:b/>
-              </w:rPr>
-              <w:t>ID</w:t>
-            </w:r>
-          </w:p>
-        </w:tc>
-        <w:tc>
-          <w:tcPr>
-            <w:tcW w:type="dxa" w:w="4320"/>
-          </w:tcPr>
-          <w:p>
-            <w:r/>
-            <w:r>
-              <w:t>[ID]</w:t>
-            </w:r>
-          </w:p>
-        </w:tc>
-      </w:tr>
-      <w:tr>
-        <w:tc>
-          <w:tcPr>
-            <w:tcW w:type="dxa" w:w="4320"/>
-          </w:tcPr>
-          <w:p>
-            <w:r/>
-            <w:r>
-              <w:rPr>
-                <w:b/>
-              </w:rPr>
-              <w:t>Supervisor</w:t>
-            </w:r>
-          </w:p>
-        </w:tc>
-        <w:tc>
-          <w:tcPr>
-            <w:tcW w:type="dxa" w:w="4320"/>
-          </w:tcPr>
-          <w:p>
-            <w:r/>
-            <w:r>
-              <w:t>Oren Ganon</w:t>
-            </w:r>
-          </w:p>
-        </w:tc>
-      </w:tr>
-      <w:tr>
-        <w:tc>
-          <w:tcPr>
-            <w:tcW w:type="dxa" w:w="4320"/>
-          </w:tcPr>
-          <w:p>
-            <w:r/>
-            <w:r>
-              <w:rPr>
-                <w:b/>
-              </w:rPr>
-              <w:t>Project Carried Out at</w:t>
-            </w:r>
-          </w:p>
-        </w:tc>
-        <w:tc>
-          <w:tcPr>
-            <w:tcW w:type="dxa" w:w="4320"/>
-          </w:tcPr>
-          <w:p>
-            <w:r/>
-            <w:r>
-              <w:t>Faculty of Engineering, Tel Aviv University</w:t>
-            </w:r>
-          </w:p>
-        </w:tc>
-      </w:tr>
-    </w:tbl>
-    <w:p/>
+      </w:pPr>
+      <w:r>
+        <w:rPr>
+          <w:b w:val="0"/>
+          <w:i w:val="0"/>
+          <w:sz w:val="26"/>
+        </w:rPr>
+        <w:t>Project No. [Project Number]</w:t>
+      </w:r>
+    </w:p>
+    <w:p>
+      <w:pPr>
+        <w:spacing w:before="0" w:after="560"/>
+        <w:jc w:val="center"/>
+      </w:pPr>
+      <w:r>
+        <w:rPr>
+          <w:b/>
+          <w:i w:val="0"/>
+          <w:sz w:val="30"/>
+        </w:rPr>
+        <w:t>Final Project Report</w:t>
+      </w:r>
+    </w:p>
+    <w:p>
+      <w:pPr>
+        <w:spacing w:before="0" w:after="80"/>
+        <w:jc w:val="center"/>
+      </w:pPr>
+      <w:r>
+        <w:rPr>
+          <w:b/>
+          <w:i w:val="0"/>
+          <w:sz w:val="24"/>
+        </w:rPr>
+        <w:t>Submitted by:</w:t>
+      </w:r>
+    </w:p>
+    <w:p>
+      <w:pPr>
+        <w:spacing w:before="0" w:after="40"/>
+        <w:jc w:val="center"/>
+      </w:pPr>
+      <w:r>
+        <w:rPr>
+          <w:b w:val="0"/>
+          <w:i w:val="0"/>
+          <w:sz w:val="24"/>
+        </w:rPr>
+        <w:t>Ron Weinstein   —   [ID]</w:t>
+      </w:r>
+    </w:p>
+    <w:p>
+      <w:pPr>
+        <w:spacing w:before="0" w:after="40"/>
+        <w:jc w:val="center"/>
+      </w:pPr>
+      <w:r>
+        <w:rPr>
+          <w:b w:val="0"/>
+          <w:i w:val="0"/>
+          <w:sz w:val="24"/>
+        </w:rPr>
+        <w:t>Yehonatan Grobgeld   —   [ID]</w:t>
+      </w:r>
+    </w:p>
+    <w:p>
+      <w:pPr>
+        <w:spacing w:before="360" w:after="80"/>
+        <w:jc w:val="center"/>
+      </w:pPr>
+      <w:r>
+        <w:rPr>
+          <w:b/>
+          <w:i w:val="0"/>
+          <w:sz w:val="24"/>
+        </w:rPr>
+        <w:t>Supervisor:</w:t>
+      </w:r>
+    </w:p>
+    <w:p>
+      <w:pPr>
+        <w:spacing w:before="0" w:after="40"/>
+        <w:jc w:val="center"/>
+      </w:pPr>
+      <w:r>
+        <w:rPr>
+          <w:b w:val="0"/>
+          <w:i w:val="0"/>
+          <w:sz w:val="24"/>
+        </w:rPr>
+        <w:t>Oren Ganon</w:t>
+      </w:r>
+    </w:p>
+    <w:p>
+      <w:pPr>
+        <w:spacing w:before="360" w:after="80"/>
+        <w:jc w:val="center"/>
+      </w:pPr>
+      <w:r>
+        <w:rPr>
+          <w:b/>
+          <w:i w:val="0"/>
+          <w:sz w:val="24"/>
+        </w:rPr>
+        <w:t>Project carried out at:</w:t>
+      </w:r>
+    </w:p>
+    <w:p>
+      <w:pPr>
+        <w:spacing w:before="0" w:after="40"/>
+        <w:jc w:val="center"/>
+      </w:pPr>
+      <w:r>
+        <w:rPr>
+          <w:b w:val="0"/>
+          <w:i w:val="0"/>
+          <w:sz w:val="24"/>
+        </w:rPr>
+        <w:t>Faculty of Engineering, Tel Aviv University</w:t>
+      </w:r>
+    </w:p>
+    <w:p>
+      <w:pPr>
+        <w:spacing w:before="560" w:after="120"/>
+        <w:jc w:val="center"/>
+      </w:pPr>
+      <w:r>
+        <w:rPr>
+          <w:b w:val="0"/>
+          <w:i w:val="0"/>
+          <w:sz w:val="24"/>
+        </w:rPr>
+        <w:t>June 2026</w:t>
+      </w:r>
+    </w:p>
     <w:p>
       <w:r>
         <w:br w:type="page"/>
@@ -506,12 +412,12 @@
     </w:p>
     <w:p>
       <w:r>
-        <w:t>This project implements and accelerates a compact Transformer encoder — TinyFormer — on an FPGA-hosted RISC-V soft-core targeting human activity recognition. The platform is a Digilent Nexys4DDR board running a LiteX-generated SoC with a VexRiscv RV32IM CPU at 100 MHz. The model performs 6-class classification over the UCI Human Activity Recognition (UCI HAR) dataset, with all weights and activations quantized to int8. The encoder processes input sequences of shape 16×32 (16 timesteps, 32-dimensional feature vectors) through a full Transformer encoder block: Q/K/V linear projections, scaled dot-product attention with softmax, output projection, residual connections, and a two-layer feed-forward network.</w:t>
+        <w:t>This project implements and accelerates a compact Transformer encoder — TinyFormer — on an FPGA-hosted RISC-V soft-core for human activity recognition. The platform is a Digilent Nexys4DDR board running a LiteX-generated SoC with a VexRiscv RV32IM CPU at 100 MHz. The model performs 6-class classification on the UCI Human Activity Recognition (UCI HAR) dataset, with all weights and activations quantized to int8. The encoder processes 16×32 input sequences (16 timesteps, 32-dim features) through a full encoder block: Q/K/V projections, scaled dot-product attention with softmax, output projection, residual connections, and a two-layer feed-forward network.</w:t>
       </w:r>
     </w:p>
     <w:p>
       <w:r>
-        <w:t xml:space="preserve">A pure-software baseline measured at </w:t>
+        <w:t xml:space="preserve">A pure-software baseline of </w:t>
       </w:r>
       <w:r>
         <w:rPr>
@@ -520,7 +426,7 @@
         <w:t>75.9 million cycles (759 ms)</w:t>
       </w:r>
       <w:r>
-        <w:t xml:space="preserve"> per inference reveals that 71% of cycles are consumed by softmax exponential computation and 21% by matrix-vector multiplications. Three targeted hardware accelerators were designed, verified, and integrated to eliminate these bottlenecks:</w:t>
+        <w:t xml:space="preserve"> per inference spends 71% of cycles on softmax exponentials and 21% on matrix-vector multiplications. Three targeted accelerators were designed, verified, and integrated to remove these bottlenecks:</w:t>
       </w:r>
     </w:p>
     <w:p>
@@ -576,7 +482,7 @@
     </w:p>
     <w:p>
       <w:r>
-        <w:t xml:space="preserve">The final combined system achieves a </w:t>
+        <w:t xml:space="preserve">The combined system achieves a </w:t>
       </w:r>
       <w:r>
         <w:rPr>
@@ -585,7 +491,7 @@
         <w:t>4.82× end-to-end speedup</w:t>
       </w:r>
       <w:r>
-        <w:t xml:space="preserve"> (759.00 ms → 157.55 ms). Bit-identical correctness is verified by a 32-bit additive checksum over the encoder's 16×32 int8 output for every inference, so model accuracy is unchanged by acceleration. Total LUT utilization is </w:t>
+        <w:t xml:space="preserve"> (759.00 ms → 157.55 ms). A 32-bit additive checksum over the encoder's 16×32 int8 output confirms bit-identical results on every inference, so accuracy is unchanged by acceleration. LUT utilization rises from 6.13% to </w:t>
       </w:r>
       <w:r>
         <w:rPr>
@@ -594,7 +500,7 @@
         <w:t>10.04%</w:t>
       </w:r>
       <w:r>
-        <w:t xml:space="preserve"> (up from 6.13% for the plain soft-core), leaving roughly 90% of the FPGA fabric free for future extensions. Power rises only modestly, from </w:t>
+        <w:t xml:space="preserve"> — leaving ~90% of the fabric free — and power from </w:t>
       </w:r>
       <w:r>
         <w:rPr>
@@ -603,7 +509,7 @@
         <w:t>0.740 W to 0.792 W</w:t>
       </w:r>
       <w:r>
-        <w:t xml:space="preserve"> (1.07×, ≈7%) — a deliberate area/power-for-speed trade-off in exchange for the 4.82× gain.</w:t>
+        <w:t xml:space="preserve"> (1.07×, ≈7%): a deliberate area/power-for-speed trade in exchange for the 4.82× gain.</w:t>
       </w:r>
     </w:p>
     <w:p>
@@ -625,7 +531,7 @@
       <w:r>
         <w:drawing>
           <wp:inline xmlns:a="http://schemas.openxmlformats.org/drawingml/2006/main" xmlns:pic="http://schemas.openxmlformats.org/drawingml/2006/picture">
-            <wp:extent cx="5120640" cy="3205221"/>
+            <wp:extent cx="4754880" cy="2976276"/>
             <wp:docPr id="1" name="Picture 1"/>
             <wp:cNvGraphicFramePr>
               <a:graphicFrameLocks noChangeAspect="1"/>
@@ -646,7 +552,7 @@
                   <pic:spPr>
                     <a:xfrm>
                       <a:off x="0" y="0"/>
-                      <a:ext cx="5120640" cy="3205221"/>
+                      <a:ext cx="4754880" cy="2976276"/>
                     </a:xfrm>
                     <a:prstGeom prst="rect"/>
                   </pic:spPr>
@@ -737,7 +643,7 @@
     </w:p>
     <w:p>
       <w:r>
-        <w:t>Transformer-based models have emerged as the dominant architecture for sequence modeling — from natural language processing to audio classification and inertial-sensor-based activity recognition. Even compact Transformer variants, however, impose two predictable bottlenecks on embedded RISC-V processors: (1) the matrix-vector multiplications in the linear projection layers, and (2) the softmax exponential function in the self-attention mechanism.</w:t>
+        <w:t>Transformers are now the dominant architecture for sequence modeling, from NLP to audio and inertial-sensor activity recognition. Even compact variants impose two predictable bottlenecks on embedded RISC-V cores: (1) the matrix-vector multiplications in the linear projections, and (2) the softmax exponential in self-attention.</w:t>
       </w:r>
     </w:p>
     <w:p>
@@ -772,7 +678,7 @@
         <w:t>Establish correctness first.</w:t>
       </w:r>
       <w:r>
-        <w:t xml:space="preserve"> A complete, verified pure-software baseline is built before any hardware is touched. Every inference produces a 32-bit additive checksum over the encoder output that serves as the correctness gate for all subsequent accelerated builds.</w:t>
+        <w:t xml:space="preserve"> A verified pure-software baseline is built before any hardware. Every inference produces a 32-bit additive checksum over the encoder output — the correctness gate for all accelerated builds.</w:t>
       </w:r>
     </w:p>
     <w:p>
@@ -803,10 +709,10 @@
         <w:rPr>
           <w:b/>
         </w:rPr>
-        <w:t>Design accelerators that target measured bottlenecks.</w:t>
-      </w:r>
-      <w:r>
-        <w:t xml:space="preserve"> Each accelerator addresses a specific, quantified cycle contributor.</w:t>
+        <w:t>Design accelerators for measured bottlenecks.</w:t>
+      </w:r>
+      <w:r>
+        <w:t xml:space="preserve"> Each accelerator targets a specific, quantified cycle contributor.</w:t>
       </w:r>
     </w:p>
     <w:p>
@@ -820,10 +726,10 @@
         <w:rPr>
           <w:b/>
         </w:rPr>
-        <w:t>Verify correctness before benchmarking.</w:t>
-      </w:r>
-      <w:r>
-        <w:t xml:space="preserve"> An accelerated build may not be benchmarked until its checksum matches the baseline on every test sample.</w:t>
+        <w:t>Verify before benchmarking.</w:t>
+      </w:r>
+      <w:r>
+        <w:t xml:space="preserve"> A build is benchmarked only after its checksum matches the baseline on every sample.</w:t>
       </w:r>
     </w:p>
     <w:p>
@@ -840,7 +746,7 @@
         <w:t>Report on-chip measurements.</w:t>
       </w:r>
       <w:r>
-        <w:t xml:space="preserve"> All performance numbers come from the LiteX hardware timer, not host-side wall-clock, which is unreliable at the granularity required.</w:t>
+        <w:t xml:space="preserve"> All numbers come from the LiteX hardware timer, not host wall-clock, which is unreliable at this granularity.</w:t>
       </w:r>
     </w:p>
     <w:p>
@@ -859,7 +765,7 @@
         <w:t>KWT-Tiny [1]</w:t>
       </w:r>
       <w:r>
-        <w:t xml:space="preserve"> presents a RISC-V accelerated keyword spotting Transformer targeting a custom ASIC chip with 64 kB RAM. They achieve a 5× speedup through custom instructions for GELU and softmax, with a 29% area overhead. Their approach requires aggressive model compression (369× size reduction) and accepts a 10% accuracy loss due to class reduction.</w:t>
+        <w:t xml:space="preserve"> is a RISC-V accelerated keyword-spotting Transformer on a custom ASIC with 64 kB RAM, reaching a 5× speedup via custom GELU/softmax instructions at 29% area overhead, but requiring aggressive model compression (369× size reduction) and accepting a 10% accuracy loss from class reduction.</w:t>
       </w:r>
     </w:p>
     <w:p>
@@ -885,12 +791,7 @@
     </w:p>
     <w:p>
       <w:r>
-        <w:t>The Transformer encoder [2] processes an input sequence of token vectors through a self-attention mechanism followed by a feed-forward network (FFN), with residual connections around each sub-layer.</w:t>
-      </w:r>
-    </w:p>
-    <w:p>
-      <w:r>
-        <w:t>Given an input matrix X of shape (S×D) — sequence length S, model dimension D — the encoder computes:</w:t>
+        <w:t>The Transformer encoder [2] processes a sequence of token vectors through self-attention then a feed-forward network (FFN), with residual connections around each sub-layer. Given an input X of shape (S×D) — sequence length S, model dimension D — it computes:</w:t>
       </w:r>
     </w:p>
     <w:p>
@@ -907,7 +808,7 @@
         <w:t>Linear projections:</w:t>
       </w:r>
       <w:r>
-        <w:t xml:space="preserve"> Query, Key, and Value matrices are computed as Q = XW_q, K = XW_k, V = XW_v, where W_q, W_k, W_v are D×D weight matrices.</w:t>
+        <w:t xml:space="preserve"> Q = XW_q, K = XW_k, V = XW_v (D×D weight matrices).</w:t>
       </w:r>
     </w:p>
     <w:p>
@@ -924,7 +825,7 @@
         <w:t>Scaled dot-product attention:</w:t>
       </w:r>
       <w:r>
-        <w:t xml:space="preserve"> Attention scores A = softmax(QK^T / √D), then context C = AV.</w:t>
+        <w:t xml:space="preserve"> A = softmax(QK^T / √D), then context C = AV.</w:t>
       </w:r>
     </w:p>
     <w:p>
@@ -941,7 +842,7 @@
         <w:t>Output projection:</w:t>
       </w:r>
       <w:r>
-        <w:t xml:space="preserve"> The context is projected back through W_o: Out = CW_o.</w:t>
+        <w:t xml:space="preserve"> Out = CW_o.</w:t>
       </w:r>
     </w:p>
     <w:p>
@@ -958,12 +859,12 @@
         <w:t>Residual and FFN:</w:t>
       </w:r>
       <w:r>
-        <w:t xml:space="preserve"> The residual Y = X + Out is passed through a two-layer feed-forward network: Z = Y + FFN(Y), where FFN applies two linear layers with a ReLU activation in between.</w:t>
+        <w:t xml:space="preserve"> Y = X + Out, then Z = Y + FFN(Y), where FFN is two linear layers with a ReLU between them.</w:t>
       </w:r>
     </w:p>
     <w:p>
       <w:r>
-        <w:t>TinyFormer uses S=16, D=32, FFN hidden size=64, and a single attention head.</w:t>
+        <w:t>TinyFormer uses S=16, D=32, FFN hidden size 64, and a single head.</w:t>
       </w:r>
     </w:p>
     <w:p>
@@ -1337,12 +1238,12 @@
     </w:p>
     <w:p>
       <w:r>
-        <w:t>All weights and activations in TinyFormer are quantized to int8 (8-bit signed integers, range −128 to +127). Accumulators are promoted to int32 to prevent overflow during multiply-accumulate operations. After each linear layer, results are scaled back to int8 using a fixed arithmetic right-shift of 7 bits, followed by saturation to the int8 range. This approach eliminates all floating-point operations from the inference path, which is essential for efficient FPGA and bare-metal RISC-V implementation.</w:t>
+        <w:t>All weights and activations are quantized to int8 (−128 to +127), with int32 accumulators to prevent multiply-accumulate overflow. After each linear layer, results are scaled back to int8 by a fixed arithmetic right-shift of 7 bits and saturation. This removes all floating-point from the inference path — essential for efficient bare-metal RISC-V on FPGA.</w:t>
       </w:r>
     </w:p>
     <w:p>
       <w:r>
-        <w:t xml:space="preserve">The softmax function requires exponentiation. In the baseline, </w:t>
+        <w:t xml:space="preserve">Softmax requires exponentiation. The baseline computes </w:t>
       </w:r>
       <w:r>
         <w:rPr>
@@ -1352,7 +1253,7 @@
         <w:t>exp(−k)</w:t>
       </w:r>
       <w:r>
-        <w:t xml:space="preserve"> is computed genuinely at runtime by </w:t>
+        <w:t xml:space="preserve"> genuinely at runtime in </w:t>
       </w:r>
       <w:r>
         <w:rPr>
@@ -1362,7 +1263,7 @@
         <w:t>compute_exp_q10()</w:t>
       </w:r>
       <w:r>
-        <w:t xml:space="preserve">: a fixed-iteration arithmetic loop followed by a multiplicative-decay loop using a single mathematical constant </w:t>
+        <w:t xml:space="preserve">: a fixed-iteration loop plus a multiplicative-decay loop using one constant </w:t>
       </w:r>
       <w:r>
         <w:rPr>
@@ -1372,7 +1273,7 @@
         <w:t>decay_q15 = 24149 ≈ 0.7368 × 2^15</w:t>
       </w:r>
       <w:r>
-        <w:t xml:space="preserve"> (one constant, *not* a lookup table). The function is declared </w:t>
+        <w:t xml:space="preserve"> (*not* a lookup table). It is declared </w:t>
       </w:r>
       <w:r>
         <w:rPr>
@@ -1382,7 +1283,7 @@
         <w:t>__attribute__((noinline, optimize("O0")))</w:t>
       </w:r>
       <w:r>
-        <w:t xml:space="preserve"> so that the compiler cannot unroll, constant-fold, or memoize it — the per-call work is genuinely paid on every softmax lookup. In the accelerated builds, this entire loop is replaced by a single read from a 16-entry lookup table covering exp(0) through exp(−15), stored in Q10 fixed-point format (values scaled by 2^10 = 1024). The softmax denominator </w:t>
+        <w:t xml:space="preserve"> so the compiler cannot unroll, constant-fold, or memoize it — the work is genuinely paid on every call. Accelerated builds replace this entire loop with a single read from a 16-entry Q10 table (scale 2^10 = 1024) covering exp(0)…exp(−15). The denominator </w:t>
       </w:r>
       <w:r>
         <w:rPr>
@@ -1392,7 +1293,7 @@
         <w:t>sum_exp</w:t>
       </w:r>
       <w:r>
-        <w:t xml:space="preserve"> is accumulated in 32-bit fixed-point, and the per-key attention weight is then computed as </w:t>
+        <w:t xml:space="preserve"> is accumulated in 32-bit fixed-point, and each attention weight is </w:t>
       </w:r>
       <w:r>
         <w:rPr>
@@ -1402,7 +1303,7 @@
         <w:t>w_q15 = (exp_value &lt;&lt; 15) / sum_exp</w:t>
       </w:r>
       <w:r>
-        <w:t xml:space="preserve"> in Q15 format before the weighted sum over the value vectors.</w:t>
+        <w:t xml:space="preserve"> in Q15 before the weighted sum over the value vectors.</w:t>
       </w:r>
     </w:p>
     <w:p>
@@ -1415,12 +1316,7 @@
     </w:p>
     <w:p>
       <w:r>
-        <w:t>LiteX [3] is an open-source FPGA SoC builder that generates a complete system — including CPU instantiation, memory controllers, bus fabric, and peripheral CSR (Control and Status Register) maps — from Python descriptions. In this project, LiteX generates the VexRiscv RV32IM soft-core, connects it to DDR2 SDRAM, exposes a UART peripheral for serial output, and provides the infrastructure into which the three custom accelerators are integrated as memory-mapped peripherals.</w:t>
-      </w:r>
-    </w:p>
-    <w:p>
-      <w:r>
-        <w:t>The LiteX framework generates C header files (</w:t>
+        <w:t>LiteX [3] is an open-source FPGA SoC builder that generates a complete system — CPU, memory controllers, bus fabric, and peripheral CSR (Control and Status Register) maps — from Python. Here it generates the VexRiscv RV32IM soft-core, connects DDR2 SDRAM and a UART, and provides the infrastructure into which the three accelerators are integrated as memory-mapped peripherals. It also emits C headers (</w:t>
       </w:r>
       <w:r>
         <w:rPr>
@@ -1430,7 +1326,7 @@
         <w:t>generated/csr.h</w:t>
       </w:r>
       <w:r>
-        <w:t>) that expose each peripheral's CSR registers as typed C accessor macros, allowing the firmware to interact with hardware peripherals using standard C without hand-crafted MMIO pointer arithmetic.</w:t>
+        <w:t>) exposing each peripheral's CSRs as typed accessor macros, so firmware uses standard C without hand-crafted MMIO pointer arithmetic.</w:t>
       </w:r>
     </w:p>
     <w:p>
@@ -1443,7 +1339,7 @@
     </w:p>
     <w:p>
       <w:r>
-        <w:t>VexRiscv [4] is a flexible, plugin-based RISC-V CPU written in SpinalHDL. Its plugin architecture allows new functional units to be inserted at the decode, execute, and writeback pipeline stages without modifying the core. The RISC-V ISA reserves the custom-0 through custom-3 opcodes for non-standard extensions. This project uses custom-0 (opcode 0x0B) with funct7=0x01 for the DOT8 instruction. The plugin intercepts the decoded instruction in the execute stage, computes four signed int8 multiply-accumulate operations using 4 DSP blocks, and writes the int32 result back in the writeback stage.</w:t>
+        <w:t>VexRiscv [4] is a flexible, plugin-based RISC-V CPU in SpinalHDL whose plugins insert new functional units at the decode/execute/writeback stages without modifying the core. The RISC-V ISA reserves custom-0…custom-3 opcodes for extensions; this project uses custom-0 (opcode 0x0B, funct7=0x01) for DOT8. The plugin intercepts the decoded instruction in execute, computes four signed int8 multiply-accumulates on 4 DSP blocks, and writes the int32 result in writeback.</w:t>
       </w:r>
     </w:p>
     <w:p>
@@ -1456,7 +1352,7 @@
     </w:p>
     <w:p>
       <w:r>
-        <w:t>Memory-mapped I/O (MMIO) peripherals appear to the CPU as ordinary memory addresses. The CPU writes to control registers and reads from status and result registers using standard load/store instructions. In LiteX, peripherals are described as Python modules that generate both the synthesizable RTL (Verilog or Migen) and the C header definitions automatically, ensuring consistency between hardware and software without manual address bookkeeping.</w:t>
+        <w:t>MMIO peripherals appear to the CPU as ordinary memory addresses: it writes control registers and reads status/result registers with standard load/store instructions. In LiteX, peripherals are Python modules that auto-generate both the synthesizable RTL and the matching C headers, keeping hardware and software consistent without manual address bookkeeping.</w:t>
       </w:r>
     </w:p>
     <w:p>
@@ -1469,7 +1365,7 @@
     </w:p>
     <w:p>
       <w:r>
-        <w:t>Several alternative algorithms and architectures were evaluated before settling on the DOT8 + EXP-LUT + GEMV combination. They are summarized here and revisited against the chosen design in the results analysis (Section 5).</w:t>
+        <w:t>Several alternatives were evaluated before settling on DOT8 + EXP-LUT + GEMV:</w:t>
       </w:r>
     </w:p>
     <w:p>
@@ -1483,7 +1379,7 @@
         <w:t>Software-only optimization.</w:t>
       </w:r>
       <w:r>
-        <w:t xml:space="preserve"> Loop unrolling, manual instruction scheduling, and </w:t>
+        <w:t xml:space="preserve"> Unrolling, scheduling, and </w:t>
       </w:r>
       <w:r>
         <w:rPr>
@@ -1493,7 +1389,7 @@
         <w:t>-O3</w:t>
       </w:r>
       <w:r>
-        <w:t xml:space="preserve"> on the baseline can reduce cycles somewhat, but they cannot overcome the fundamental cost of computing softmax exponentials and high-dimensional dot-products one scalar operation at a time on a scalar RV32IM core. This approach is the baseline against which all accelerators are measured.</w:t>
+        <w:t xml:space="preserve"> reduce baseline cycles somewhat but cannot overcome computing exponentials and high-dimensional dot-products one scalar op at a time on RV32IM — this is the baseline all accelerators are measured against.</w:t>
       </w:r>
     </w:p>
     <w:p>
@@ -1507,7 +1403,7 @@
         <w:t>Full systolic-array GEMM.</w:t>
       </w:r>
       <w:r>
-        <w:t xml:space="preserve"> A 2-D systolic array would maximize matrix-multiply throughput, but TinyFormer's workload is matrix-*vector* (S processed token-by-token), and a full array would consume far more than the 10% LUT budget and leave most PEs idle. A single 4-lane streaming MAC (GEMV) was chosen as the right granularity for the problem size.</w:t>
+        <w:t xml:space="preserve"> A 2-D array maximizes matrix-multiply throughput, but TinyFormer's workload is matrix-*vector* (token-by-token); a full array would blow the 10% LUT budget and leave most PEs idle. A single 4-lane streaming MAC (GEMV) is the right granularity.</w:t>
       </w:r>
     </w:p>
     <w:p>
@@ -1521,7 +1417,7 @@
         <w:t>Exponential by polynomial/CORDIC instead of a LUT.</w:t>
       </w:r>
       <w:r>
-        <w:t xml:space="preserve"> The softmax exponential could be computed in hardware with a Taylor/CORDIC pipeline. This is more general (arbitrary input range) but larger and slower than a 16-entry ROM; since the attention logits occupy a known, small range after max-subtraction, a fixed Q10 LUT is exact for this model and essentially free in area.</w:t>
+        <w:t xml:space="preserve"> A Taylor/CORDIC pipeline is more general but larger and slower than a 16-entry ROM; since attention logits occupy a known small range after max-subtraction, a fixed Q10 LUT is exact here and essentially free in area.</w:t>
       </w:r>
     </w:p>
     <w:p>
@@ -1535,7 +1431,7 @@
         <w:t>Per-channel / power-of-two quantization.</w:t>
       </w:r>
       <w:r>
-        <w:t xml:space="preserve"> More sophisticated quantization (per-channel scales, learned step sizes) would reduce the int8 accuracy gap relative to the uniform right-shift-by-7 scheme used here, at the cost of more complex requantization logic. This was deferred (see Section 6.2) because correctness, not maximum accuracy, was the gating requirement.</w:t>
+        <w:t xml:space="preserve"> Per-channel scales or learned step sizes would shrink the int8 accuracy gap of the uniform shift-by-7 scheme, at the cost of more complex requantization; deferred (Section 6.2) since correctness, not maximum accuracy, was the gating requirement.</w:t>
       </w:r>
     </w:p>
     <w:p>
@@ -1549,7 +1445,7 @@
         <w:t>DMA-fed accelerators.</w:t>
       </w:r>
       <w:r>
-        <w:t xml:space="preserve"> Instead of the CPU streaming W and X over the CSR bus, a DMA engine could fetch operands directly from DDR2. This removes CPU bus traffic entirely but adds bus-master complexity; it was scoped as future work after the packed-CSR GEMV already delivered the bulk of the available speedup.</w:t>
+        <w:t xml:space="preserve"> A DMA engine could fetch W/X from DDR2 directly instead of CPU CSR streaming, removing bus traffic at the cost of bus-master complexity; scoped as future work after packed-CSR GEMV already delivered most of the available speedup.</w:t>
       </w:r>
     </w:p>
     <w:p>
@@ -1570,7 +1466,7 @@
     </w:p>
     <w:p>
       <w:r>
-        <w:t>The system runs on a Digilent Nexys4DDR board hosting a Xilinx Artix-7 xc7a100t FPGA. The LiteX SoC includes a VexRiscv RV32IM soft-core at 100 MHz, DDR2 SDRAM as main memory, a UART peripheral for serial output, and three custom accelerator blocks. The SoC bus fabric, memory map, and peripheral CSR layout are generated by the LiteX build system from Python source.</w:t>
+        <w:t>The system runs on a Digilent Nexys4DDR board with a Xilinx Artix-7 xc7a100t FPGA. The LiteX SoC comprises a VexRiscv RV32IM soft-core at 100 MHz, DDR2 SDRAM, a UART, and the three accelerator blocks; the bus fabric, memory map, and CSR layout are generated from Python by LiteX.</w:t>
       </w:r>
     </w:p>
     <w:p>
@@ -1592,7 +1488,7 @@
       <w:r>
         <w:drawing>
           <wp:inline xmlns:a="http://schemas.openxmlformats.org/drawingml/2006/main" xmlns:pic="http://schemas.openxmlformats.org/drawingml/2006/picture">
-            <wp:extent cx="5120640" cy="3059963"/>
+            <wp:extent cx="4754880" cy="2841395"/>
             <wp:docPr id="2" name="Picture 2"/>
             <wp:cNvGraphicFramePr>
               <a:graphicFrameLocks noChangeAspect="1"/>
@@ -1613,7 +1509,7 @@
                   <pic:spPr>
                     <a:xfrm>
                       <a:off x="0" y="0"/>
-                      <a:ext cx="5120640" cy="3059963"/>
+                      <a:ext cx="4754880" cy="2841395"/>
                     </a:xfrm>
                     <a:prstGeom prst="rect"/>
                   </pic:spPr>
@@ -1643,7 +1539,7 @@
     </w:p>
     <w:p>
       <w:r>
-        <w:t>The DOT8 accelerator adds a single new instruction to the VexRiscv pipeline via the plugin interface. The instruction computes the signed int8 dot-product of two 4-element vectors packed into two 32-bit registers:</w:t>
+        <w:t>The DOT8 accelerator adds one instruction to the VexRiscv pipeline via the plugin interface, computing the signed int8 dot-product of two 4-element vectors packed into two 32-bit registers:</w:t>
       </w:r>
     </w:p>
     <w:p>
@@ -1657,7 +1553,7 @@
     </w:p>
     <w:p>
       <w:r>
-        <w:t>where a[i] and b[i] are the i-th signed byte (lanes 0–3 in little-endian order) of the source registers, and the result is a signed int32.</w:t>
+        <w:t>where a[i], b[i] are the i-th signed bytes (lanes 0–3, little-endian) of the sources and the result is signed int32.</w:t>
       </w:r>
     </w:p>
     <w:p>
@@ -1668,7 +1564,7 @@
         <w:t>Encoding:</w:t>
       </w:r>
       <w:r>
-        <w:t xml:space="preserve"> The instruction is a standard RISC-V R-type, using opcode custom-0 (0x0B) and funct7=0x01. funct3 is reserved for future variant selection (e.g. an 8-lane or multiply-accumulate form).</w:t>
+        <w:t xml:space="preserve"> A standard RISC-V R-type using opcode custom-0 (0x0B), funct7=0x01; funct3 is reserved for future variants (e.g. an 8-lane or MAC form).</w:t>
       </w:r>
     </w:p>
     <w:tbl>
@@ -1942,7 +1838,7 @@
     <w:p/>
     <w:p>
       <w:r>
-        <w:t>rs1 and rs2 each carry four packed signed int8 lanes (lane 0 in the LSB byte); rd receives the int32 dot-product. Each lane is sign-extended to int32 before multiplication.</w:t>
+        <w:t>rs1/rs2 each carry four packed signed int8 lanes (lane 0 in the LSB byte), each sign-extended to int32 before multiplication; rd receives the int32 dot-product.</w:t>
       </w:r>
     </w:p>
     <w:p>
@@ -1975,7 +1871,7 @@
       <w:r>
         <w:drawing>
           <wp:inline xmlns:a="http://schemas.openxmlformats.org/drawingml/2006/main" xmlns:pic="http://schemas.openxmlformats.org/drawingml/2006/picture">
-            <wp:extent cx="5120640" cy="2469319"/>
+            <wp:extent cx="4754880" cy="2292939"/>
             <wp:docPr id="3" name="Picture 3"/>
             <wp:cNvGraphicFramePr>
               <a:graphicFrameLocks noChangeAspect="1"/>
@@ -1996,7 +1892,7 @@
                   <pic:spPr>
                     <a:xfrm>
                       <a:off x="0" y="0"/>
-                      <a:ext cx="5120640" cy="2469319"/>
+                      <a:ext cx="4754880" cy="2292939"/>
                     </a:xfrm>
                     <a:prstGeom prst="rect"/>
                   </pic:spPr>
@@ -2028,7 +1924,7 @@
         <w:t>exp_lut.v</w:t>
       </w:r>
       <w:r>
-        <w:t xml:space="preserve">) is a 16-entry read-only ROM holding exp(0), exp(−1), … exp(−15) in Q10 fixed-point (scale 2^10). The values live in a </w:t>
+        <w:t xml:space="preserve">) is a 16-entry read-only ROM holding exp(0)…exp(−15) in Q10 fixed-point (scale 2^10), read purely combinationally from a </w:t>
       </w:r>
       <w:r>
         <w:rPr>
@@ -2038,7 +1934,7 @@
         <w:t>reg [15:0]</w:t>
       </w:r>
       <w:r>
-        <w:t xml:space="preserve"> array read purely combinationally — no clocked latency — and a 5-bit signed index is truncated to the table address (</w:t>
+        <w:t xml:space="preserve"> array (no clocked latency); a 5-bit signed index is truncated to the address (</w:t>
       </w:r>
       <w:r>
         <w:rPr>
@@ -2048,7 +1944,7 @@
         <w:t>addr = index[3:0]</w:t>
       </w:r>
       <w:r>
-        <w:t xml:space="preserve">). The entries match the software golden table in </w:t>
+        <w:t xml:space="preserve">). Entries match the golden table in </w:t>
       </w:r>
       <w:r>
         <w:rPr>
@@ -2058,7 +1954,7 @@
         <w:t>tinyformer.c</w:t>
       </w:r>
       <w:r>
-        <w:t xml:space="preserve"> byte-for-byte (Appendix A), so baseline and accelerated softmax are numerically identical. Operationally the CPU writes the index CSR and reads the value CSR: two MMIO operations (~12 cycles), replacing the baseline's runtime </w:t>
+        <w:t xml:space="preserve"> byte-for-byte (Appendix A), so baseline and accelerated softmax are numerically identical. The CPU writes the index CSR and reads the value CSR — two MMIO ops (~12 cycles) — replacing the baseline's </w:t>
       </w:r>
       <w:r>
         <w:rPr>
@@ -2068,7 +1964,7 @@
         <w:t>compute_exp_q10()</w:t>
       </w:r>
       <w:r>
-        <w:t xml:space="preserve"> loop (≈21,000 cycles per call, Section 5.1) — a ~1,700× per-call reduction.</w:t>
+        <w:t xml:space="preserve"> loop (≈21,000 cycles/call, Section 5.1), a ~1,700× per-call reduction.</w:t>
       </w:r>
     </w:p>
     <w:p>
@@ -2090,7 +1986,7 @@
       <w:r>
         <w:drawing>
           <wp:inline xmlns:a="http://schemas.openxmlformats.org/drawingml/2006/main" xmlns:pic="http://schemas.openxmlformats.org/drawingml/2006/picture">
-            <wp:extent cx="5120640" cy="3224360"/>
+            <wp:extent cx="4754880" cy="2994049"/>
             <wp:docPr id="4" name="Picture 4"/>
             <wp:cNvGraphicFramePr>
               <a:graphicFrameLocks noChangeAspect="1"/>
@@ -2111,7 +2007,7 @@
                   <pic:spPr>
                     <a:xfrm>
                       <a:off x="0" y="0"/>
-                      <a:ext cx="5120640" cy="3224360"/>
+                      <a:ext cx="4754880" cy="2994049"/>
                     </a:xfrm>
                     <a:prstGeom prst="rect"/>
                   </pic:spPr>
@@ -2139,7 +2035,7 @@
         <w:t>Design.</w:t>
       </w:r>
       <w:r>
-        <w:t xml:space="preserve"> The GEMV peripheral computes Y = W·X + b (int8 W and X, optional int32 bias, int32 Y) with a 32-bit packed data path and a 4-lane parallel MAC. The driver packs four int8 elements per </w:t>
+        <w:t xml:space="preserve"> GEMV computes Y = W·X + b (int8 W/X, optional int32 bias, int32 Y) with a 32-bit packed data path and a 4-lane parallel MAC. The driver packs four int8 elements per </w:t>
       </w:r>
       <w:r>
         <w:rPr>
@@ -2169,7 +2065,7 @@
         <w:t>pack4_i8()</w:t>
       </w:r>
       <w:r>
-        <w:t xml:space="preserve">), so a 32×32 matvec needs ≈272 CSR writes versus 1,088 for a byte-wide design — a 4× bus saving. Internally X and W are 32-bit word arrays; the FSM reads one packed word from each per cycle and computes four signed MACs in parallel (4 DSP blocks), completing a 32×32 matvec in </w:t>
+        <w:t xml:space="preserve">), so a 32×32 matvec needs ≈272 CSR writes vs. 1,088 byte-wide — a 4× bus saving. Internally X/W are 32-bit word arrays; the FSM reads one packed word from each per cycle and does four signed MACs in parallel (4 DSP blocks), completing a 32×32 matvec in </w:t>
       </w:r>
       <w:r>
         <w:rPr>
@@ -2178,7 +2074,7 @@
         <w:t>256 compute cycles</w:t>
       </w:r>
       <w:r>
-        <w:t xml:space="preserve"> — a further 4× over one MAC per cycle. The two savings are independent and multiply. LEN and OUT_DIM are each 32 or 64, runtime-selectable.</w:t>
+        <w:t xml:space="preserve"> — a further 4× over one MAC/cycle. The two savings are independent and multiply. LEN and OUT_DIM are 32 or 64, runtime-selectable.</w:t>
       </w:r>
     </w:p>
     <w:p>
@@ -2227,7 +2123,7 @@
         <w:t>S_COMPUTE</w:t>
       </w:r>
       <w:r>
-        <w:t xml:space="preserve"> sweeps the LEN/4 words per output row (8 for LEN=32), accumulating one </w:t>
+        <w:t xml:space="preserve"> sweeps LEN/4 words per row (8 for LEN=32), accumulating one </w:t>
       </w:r>
       <w:r>
         <w:rPr>
@@ -2237,7 +2133,7 @@
         <w:t>dot4</w:t>
       </w:r>
       <w:r>
-        <w:t xml:space="preserve"> per cycle, then latches </w:t>
+        <w:t xml:space="preserve">/cycle, then latches </w:t>
       </w:r>
       <w:r>
         <w:rPr>
@@ -2266,7 +2162,7 @@
         <w:t>done</w:t>
       </w:r>
       <w:r>
-        <w:t xml:space="preserve">, after which the CPU reads results via </w:t>
+        <w:t xml:space="preserve"> for the CPU to read via </w:t>
       </w:r>
       <w:r>
         <w:rPr>
@@ -2286,7 +2182,7 @@
         <w:t>Y_NEXT</w:t>
       </w:r>
       <w:r>
-        <w:t xml:space="preserve"> and issues </w:t>
+        <w:t xml:space="preserve"> then </w:t>
       </w:r>
       <w:r>
         <w:rPr>
@@ -2318,7 +2214,7 @@
       <w:r>
         <w:drawing>
           <wp:inline xmlns:a="http://schemas.openxmlformats.org/drawingml/2006/main" xmlns:pic="http://schemas.openxmlformats.org/drawingml/2006/picture">
-            <wp:extent cx="5120640" cy="2979365"/>
+            <wp:extent cx="4754880" cy="2766553"/>
             <wp:docPr id="5" name="Picture 5"/>
             <wp:cNvGraphicFramePr>
               <a:graphicFrameLocks noChangeAspect="1"/>
@@ -2339,7 +2235,7 @@
                   <pic:spPr>
                     <a:xfrm>
                       <a:off x="0" y="0"/>
-                      <a:ext cx="5120640" cy="2979365"/>
+                      <a:ext cx="4754880" cy="2766553"/>
                     </a:xfrm>
                     <a:prstGeom prst="rect"/>
                   </pic:spPr>
@@ -2361,7 +2257,7 @@
     </w:p>
     <w:p>
       <w:r>
-        <w:t>Resource and power figures are reported for both firmware configurations on the same xc7a100t bitstream at 100 MHz. The accelerators were measured against the plain-VexRiscv baseline.</w:t>
+        <w:t>Resource and power figures are reported for both configurations on the same xc7a100t bitstream at 100 MHz, measured against the plain-VexRiscv baseline.</w:t>
       </w:r>
     </w:p>
     <w:p>
@@ -2651,7 +2547,7 @@
     <w:p/>
     <w:p>
       <w:r>
-        <w:t>The 8 DSP blocks in the accelerated build comprise 4 for the DOT8 multiplier array and 4 for the GEMV 4-lane MAC; the plain VexRiscv RV32IM multiplier is mapped to logic and uses no DSPs, which is why the baseline DSP utilization is 0%. The accelerated build additionally occupies 47 of 135 RAMB36 block-RAMs (≈34.8%) and 968 LUTs as distributed RAM for SoC memory and peripheral storage. At 10.04% LUT utilization, roughly 90% of the FPGA fabric remains free for future extensions.</w:t>
+        <w:t>The 8 DSP blocks split as 4 for the DOT8 multiplier array and 4 for the GEMV 4-lane MAC; the plain RV32IM multiplier maps to logic (hence 0% baseline DSP). The accelerated build also uses 47 of 135 RAMB36 block-RAMs (≈34.8%) and 968 LUTs of distributed RAM. At 10.04% LUT, ~90% of the fabric remains free.</w:t>
       </w:r>
     </w:p>
     <w:p>
@@ -2662,7 +2558,7 @@
         <w:t>Timing.</w:t>
       </w:r>
       <w:r>
-        <w:t xml:space="preserve"> The Vivado implementation reports WNS = −6.309 ns on the worst path inside </w:t>
+        <w:t xml:space="preserve"> Vivado reports WNS = −6.309 ns on the worst path inside </w:t>
       </w:r>
       <w:r>
         <w:rPr>
@@ -2672,7 +2568,7 @@
         <w:t>gemv_core.v</w:t>
       </w:r>
       <w:r>
-        <w:t xml:space="preserve"> (the 4-lane multiply + adder-tree + accumulator-add chain). The design routes cleanly with zero routing errors and produces bit-identical encoder output across all test samples at room temperature. For a production deployment, the dot4 stage should be pipelined (adding one cycle of latency) or </w:t>
+        <w:t xml:space="preserve"> (the 4-lane multiply + adder-tree + accumulator chain). The design routes cleanly and is bit-identical across all samples at room temperature; for production the dot4 stage should be pipelined (one extra cycle) or </w:t>
       </w:r>
       <w:r>
         <w:rPr>
@@ -2682,7 +2578,7 @@
         <w:t>sys_clk_freq</w:t>
       </w:r>
       <w:r>
-        <w:t xml:space="preserve"> should be reduced to approximately 75 MHz to close timing cleanly.</w:t>
+        <w:t xml:space="preserve"> reduced to ≈75 MHz to close timing.</w:t>
       </w:r>
     </w:p>
     <w:p>
@@ -2703,7 +2599,7 @@
     </w:p>
     <w:p>
       <w:r>
-        <w:t xml:space="preserve">The firmware is organized as a set of shared common sources plus mode-specific main files. Both configurations share the same TinyFormer encoder implementation, and hardware paths are selected at compile time using feature macros. This report focuses on the two end-point configurations — the pure-software baseline and the fully-accelerated </w:t>
+        <w:t xml:space="preserve">The firmware is shared common sources plus mode-specific main files; both configurations share the same encoder, with hardware paths selected at compile time via feature macros. This report focuses on the two end-points — the pure-software baseline and the fully-accelerated </w:t>
       </w:r>
       <w:r>
         <w:rPr>
@@ -2913,7 +2809,7 @@
     <w:p/>
     <w:p>
       <w:r>
-        <w:t>When a macro is not defined, the corresponding hardware is never accessed — no custom instruction opcode is issued, no MMIO register is touched — so the same codebase runs correctly on a plain VexRiscv (baseline) or with all three accelerators enabled (</w:t>
+        <w:t>When a macro is undefined, that hardware is never accessed — no custom opcode, no MMIO touch — so one codebase runs correctly on a plain VexRiscv (baseline) or with all three accelerators (</w:t>
       </w:r>
       <w:r>
         <w:rPr>
@@ -2936,7 +2832,7 @@
     </w:p>
     <w:p>
       <w:r>
-        <w:t xml:space="preserve">The encoder implements the full Transformer encoder pipeline in portable C with no dynamic allocation, no OS, and no libc dependency. The code compiles with </w:t>
+        <w:t xml:space="preserve">The encoder implements the full pipeline in portable C with no dynamic allocation, OS, or libc, compiled with </w:t>
       </w:r>
       <w:r>
         <w:rPr>
@@ -2971,7 +2867,7 @@
         <w:t>Q/K/V linear projections:</w:t>
       </w:r>
       <w:r>
-        <w:t xml:space="preserve"> Each input token (row of X) is multiplied by the weight matrices W_q, W_k, W_v via row-major int8 matrix-vector multiplication with int32 accumulation. Results are right-shifted by 7 bits and saturated to int8 using the </w:t>
+        <w:t xml:space="preserve"> Each input token (row of X) is multiplied by W_q, W_k, W_v via row-major int8 matrix-vector multiply with int32 accumulation, then right-shifted by 7 and saturated to int8 (</w:t>
       </w:r>
       <w:r>
         <w:rPr>
@@ -2981,7 +2877,7 @@
         <w:t>saturate_int32_to_int8</w:t>
       </w:r>
       <w:r>
-        <w:t xml:space="preserve"> macro. This produces Q, K, and V tensors of shape 16×32. In </w:t>
+        <w:t xml:space="preserve">), producing 16×32 Q, K, V. In </w:t>
       </w:r>
       <w:r>
         <w:rPr>
@@ -2991,7 +2887,7 @@
         <w:t>accel_all</w:t>
       </w:r>
       <w:r>
-        <w:t>, all projections use the GEMV peripheral.</w:t>
+        <w:t>, all projections use GEMV.</w:t>
       </w:r>
     </w:p>
     <w:p>
@@ -3008,7 +2904,7 @@
         <w:t>Streaming scaled dot-product attention:</w:t>
       </w:r>
       <w:r>
-        <w:t xml:space="preserve"> One query position is processed at a time, reusing 1D scratch buffers (</w:t>
+        <w:t xml:space="preserve"> Queries are processed one at a time, reusing 1D scratch buffers (</w:t>
       </w:r>
       <w:r>
         <w:rPr>
@@ -3028,7 +2924,7 @@
         <w:t>exp_buf[16]</w:t>
       </w:r>
       <w:r>
-        <w:t xml:space="preserve">) rather than allocating a full 16×16 attention matrix. For each query position: (a) the int32 dot-product against each of the 16 key positions is computed and right-shifted by 5 bits to approximate the 1/√D scaling; (b) the per-query maximum score is subtracted for numerical stability and the result further right-shifted by 3 bits to compress the dynamic range into roughly [−15, 0] before being clamped and used as the exp index; (c) exp values are obtained (via EXP-LUT in accelerated builds, </w:t>
+        <w:t xml:space="preserve">) instead of a full 16×16 matrix. Per query: (a) the int32 dot-product against each of the 16 keys is right-shifted by 5 to approximate 1/√D; (b) the per-query max is subtracted for stability and shifted by a further 3 to compress the range to ≈[−15, 0], then clamped as the exp index; (c) exp values are looked up (EXP-LUT, or </w:t>
       </w:r>
       <w:r>
         <w:rPr>
@@ -3038,7 +2934,7 @@
         <w:t>compute_exp_q10()</w:t>
       </w:r>
       <w:r>
-        <w:t xml:space="preserve"> in the baseline) and summed; (d) each weight is normalized to Q15 as </w:t>
+        <w:t xml:space="preserve"> in baseline) and summed; (d) each weight is normalized to Q15 as </w:t>
       </w:r>
       <w:r>
         <w:rPr>
@@ -3048,7 +2944,7 @@
         <w:t>(exp_buf[j] &lt;&lt; 15) / sum_exp</w:t>
       </w:r>
       <w:r>
-        <w:t xml:space="preserve"> and the Q15-weighted sum over the value vectors, right-shifted by 15, produces the context vector. The inner dot-product loops use the DOT8 instruction in accelerated builds.</w:t>
+        <w:t>, and the Q15-weighted value sum, right-shifted by 15, gives the context vector. Inner dot-products use DOT8 in accelerated builds.</w:t>
       </w:r>
     </w:p>
     <w:p>
@@ -3065,7 +2961,7 @@
         <w:t>Output projection and residual:</w:t>
       </w:r>
       <w:r>
-        <w:t xml:space="preserve"> The context output is projected through W_o and added to the original input via saturating int8 addition.</w:t>
+        <w:t xml:space="preserve"> Context is projected through W_o and added to the input via saturating int8 addition.</w:t>
       </w:r>
     </w:p>
     <w:p>
@@ -3082,7 +2978,7 @@
         <w:t>Two-layer FFN with residual:</w:t>
       </w:r>
       <w:r>
-        <w:t xml:space="preserve"> W_ff1 (32→64) with ReLU activation, followed by W_ff2 (64→32), with the result added back via a second residual connection. Both layers use the GEMV peripheral in accelerated builds.</w:t>
+        <w:t xml:space="preserve"> W_ff1 (32→64) with ReLU, then W_ff2 (64→32), added back via a second residual. Both layers use GEMV in accelerated builds.</w:t>
       </w:r>
     </w:p>
     <w:p>
@@ -3104,7 +3000,7 @@
       <w:r>
         <w:drawing>
           <wp:inline xmlns:a="http://schemas.openxmlformats.org/drawingml/2006/main" xmlns:pic="http://schemas.openxmlformats.org/drawingml/2006/picture">
-            <wp:extent cx="5120640" cy="1347368"/>
+            <wp:extent cx="4754880" cy="1251128"/>
             <wp:docPr id="6" name="Picture 6"/>
             <wp:cNvGraphicFramePr>
               <a:graphicFrameLocks noChangeAspect="1"/>
@@ -3125,7 +3021,7 @@
                   <pic:spPr>
                     <a:xfrm>
                       <a:off x="0" y="0"/>
-                      <a:ext cx="5120640" cy="1347368"/>
+                      <a:ext cx="4754880" cy="1251128"/>
                     </a:xfrm>
                     <a:prstGeom prst="rect"/>
                   </pic:spPr>
@@ -3619,7 +3515,17 @@
     </w:p>
     <w:p>
       <w:r>
-        <w:t>Each accelerator exposes a dedicated, compile-time-selectable software driver:</w:t>
+        <w:t xml:space="preserve">Each accelerator exposes a compile-time-selectable driver, each with a pure-C fallback when its </w:t>
+      </w:r>
+      <w:r>
+        <w:rPr>
+          <w:rFonts w:ascii="Consolas" w:hAnsi="Consolas"/>
+          <w:sz w:val="20"/>
+        </w:rPr>
+        <w:t>USE_*_HW</w:t>
+      </w:r>
+      <w:r>
+        <w:t xml:space="preserve"> macro is undefined:</w:t>
       </w:r>
     </w:p>
     <w:p>
@@ -3630,7 +3536,7 @@
         <w:rPr>
           <w:b/>
         </w:rPr>
-        <w:t>`hw_extensions/dot8/sw/dot8.h`</w:t>
+        <w:t>`dot8/sw/dot8.h`</w:t>
       </w:r>
       <w:r>
         <w:t xml:space="preserve"> — packing helper </w:t>
@@ -3643,27 +3549,17 @@
         <w:t>dot8_pack()</w:t>
       </w:r>
       <w:r>
-        <w:t xml:space="preserve"> and inline-assembly </w:t>
+        <w:t xml:space="preserve"> and inline-asm </w:t>
       </w:r>
       <w:r>
         <w:rPr>
           <w:rFonts w:ascii="Consolas" w:hAnsi="Consolas"/>
           <w:sz w:val="20"/>
         </w:rPr>
-        <w:t>dot8_4_lanes(a_packed, b_packed)</w:t>
-      </w:r>
-      <w:r>
-        <w:t xml:space="preserve"> that emits the custom-0 instruction. When </w:t>
-      </w:r>
-      <w:r>
-        <w:rPr>
-          <w:rFonts w:ascii="Consolas" w:hAnsi="Consolas"/>
-          <w:sz w:val="20"/>
-        </w:rPr>
-        <w:t>USE_DOT8_HW</w:t>
-      </w:r>
-      <w:r>
-        <w:t xml:space="preserve"> is not defined, the same function falls back to a pure C dot-product.</w:t>
+        <w:t>dot8_4_lanes(a, b)</w:t>
+      </w:r>
+      <w:r>
+        <w:t xml:space="preserve"> emitting the custom-0 instruction.</w:t>
       </w:r>
     </w:p>
     <w:p>
@@ -3674,7 +3570,7 @@
         <w:rPr>
           <w:b/>
         </w:rPr>
-        <w:t>`hw_extensions/exp_lut/sw/exp_lut.c`</w:t>
+        <w:t>`exp_lut/sw/exp_lut.c`</w:t>
       </w:r>
       <w:r>
         <w:t xml:space="preserve"> — </w:t>
@@ -3687,17 +3583,7 @@
         <w:t>exp_lut_hw(idx)</w:t>
       </w:r>
       <w:r>
-        <w:t xml:space="preserve"> that writes the index CSR and reads the value CSR. Falls back to an internal golden table when </w:t>
-      </w:r>
-      <w:r>
-        <w:rPr>
-          <w:rFonts w:ascii="Consolas" w:hAnsi="Consolas"/>
-          <w:sz w:val="20"/>
-        </w:rPr>
-        <w:t>USE_EXP_LUT_HW</w:t>
-      </w:r>
-      <w:r>
-        <w:t xml:space="preserve"> is not defined.</w:t>
+        <w:t xml:space="preserve"> writes the index CSR and reads the value CSR.</w:t>
       </w:r>
     </w:p>
     <w:p>
@@ -3708,10 +3594,10 @@
         <w:rPr>
           <w:b/>
         </w:rPr>
-        <w:t>`hw_extensions/gemv/sw/gemv.c`</w:t>
-      </w:r>
-      <w:r>
-        <w:t xml:space="preserve"> — full GEMV driver: </w:t>
+        <w:t>`gemv/sw/gemv.c`</w:t>
+      </w:r>
+      <w:r>
+        <w:t xml:space="preserve"> — full driver: </w:t>
       </w:r>
       <w:r>
         <w:rPr>
@@ -3721,87 +3607,77 @@
         <w:t>gemv_init</w:t>
       </w:r>
       <w:r>
-        <w:t xml:space="preserve">, </w:t>
+        <w:t>/</w:t>
       </w:r>
       <w:r>
         <w:rPr>
           <w:rFonts w:ascii="Consolas" w:hAnsi="Consolas"/>
           <w:sz w:val="20"/>
         </w:rPr>
-        <w:t>gemv_load_x</w:t>
-      </w:r>
-      <w:r>
-        <w:t xml:space="preserve">, </w:t>
+        <w:t>load_x</w:t>
+      </w:r>
+      <w:r>
+        <w:t>/</w:t>
       </w:r>
       <w:r>
         <w:rPr>
           <w:rFonts w:ascii="Consolas" w:hAnsi="Consolas"/>
           <w:sz w:val="20"/>
         </w:rPr>
-        <w:t>gemv_load_w</w:t>
-      </w:r>
-      <w:r>
-        <w:t xml:space="preserve">, </w:t>
+        <w:t>load_w</w:t>
+      </w:r>
+      <w:r>
+        <w:t>/</w:t>
       </w:r>
       <w:r>
         <w:rPr>
           <w:rFonts w:ascii="Consolas" w:hAnsi="Consolas"/>
           <w:sz w:val="20"/>
         </w:rPr>
-        <w:t>gemv_load_b</w:t>
-      </w:r>
-      <w:r>
-        <w:t xml:space="preserve">, </w:t>
+        <w:t>load_b</w:t>
+      </w:r>
+      <w:r>
+        <w:t>/</w:t>
       </w:r>
       <w:r>
         <w:rPr>
           <w:rFonts w:ascii="Consolas" w:hAnsi="Consolas"/>
           <w:sz w:val="20"/>
         </w:rPr>
-        <w:t>gemv_start</w:t>
-      </w:r>
-      <w:r>
-        <w:t xml:space="preserve">, </w:t>
+        <w:t>start</w:t>
+      </w:r>
+      <w:r>
+        <w:t>/</w:t>
       </w:r>
       <w:r>
         <w:rPr>
           <w:rFonts w:ascii="Consolas" w:hAnsi="Consolas"/>
           <w:sz w:val="20"/>
         </w:rPr>
-        <w:t>gemv_wait_done</w:t>
-      </w:r>
-      <w:r>
-        <w:t xml:space="preserve">, </w:t>
+        <w:t>wait_done</w:t>
+      </w:r>
+      <w:r>
+        <w:t>/</w:t>
       </w:r>
       <w:r>
         <w:rPr>
           <w:rFonts w:ascii="Consolas" w:hAnsi="Consolas"/>
           <w:sz w:val="20"/>
         </w:rPr>
-        <w:t>gemv_read_y</w:t>
-      </w:r>
-      <w:r>
-        <w:t xml:space="preserve">, </w:t>
+        <w:t>read_y</w:t>
+      </w:r>
+      <w:r>
+        <w:t>/</w:t>
       </w:r>
       <w:r>
         <w:rPr>
           <w:rFonts w:ascii="Consolas" w:hAnsi="Consolas"/>
           <w:sz w:val="20"/>
         </w:rPr>
-        <w:t>gemv_clear_done</w:t>
-      </w:r>
-      <w:r>
-        <w:t xml:space="preserve">. Falls back to pure-C matvec when </w:t>
-      </w:r>
-      <w:r>
-        <w:rPr>
-          <w:rFonts w:ascii="Consolas" w:hAnsi="Consolas"/>
-          <w:sz w:val="20"/>
-        </w:rPr>
-        <w:t>USE_GEMV_HW</w:t>
-      </w:r>
-      <w:r>
-        <w:t xml:space="preserve"> is not defined.</w:t>
+        <w:t>clear_done</w:t>
+      </w:r>
+      <w:r>
+        <w:t>.</w:t>
       </w:r>
     </w:p>
     <w:p>
@@ -3824,15 +3700,7 @@
         <w:t>demo_runner.c</w:t>
       </w:r>
       <w:r>
-        <w:t xml:space="preserve"> iterates over 10 pre-embedded int8 test samples. For each sample it:</w:t>
-      </w:r>
-    </w:p>
-    <w:p>
-      <w:pPr>
-        <w:pStyle w:val="ListParagraph"/>
-      </w:pPr>
-      <w:r>
-        <w:t xml:space="preserve">1. Calls </w:t>
+        <w:t xml:space="preserve"> iterates over 10 pre-embedded int8 samples; for each it: (1) calls </w:t>
       </w:r>
       <w:r>
         <w:rPr>
@@ -3842,15 +3710,7 @@
         <w:t>tinyformer_encode()</w:t>
       </w:r>
       <w:r>
-        <w:t xml:space="preserve"> (the full encoder pipeline).</w:t>
-      </w:r>
-    </w:p>
-    <w:p>
-      <w:pPr>
-        <w:pStyle w:val="ListParagraph"/>
-      </w:pPr>
-      <w:r>
-        <w:t>2. Computes a 32-bit additive checksum (</w:t>
+        <w:t>; (2) computes a 32-bit additive checksum (</w:t>
       </w:r>
       <w:r>
         <w:rPr>
@@ -3860,36 +3720,7 @@
         <w:t>ENC_CKSUM</w:t>
       </w:r>
       <w:r>
-        <w:t>) over the 16×32 encoder output.</w:t>
-      </w:r>
-    </w:p>
-    <w:p>
-      <w:pPr>
-        <w:pStyle w:val="ListParagraph"/>
-      </w:pPr>
-      <w:r>
-        <w:t>3. Mean-pools the encoder output to a D-dimensional vector.</w:t>
-      </w:r>
-    </w:p>
-    <w:p>
-      <w:pPr>
-        <w:pStyle w:val="ListParagraph"/>
-      </w:pPr>
-      <w:r>
-        <w:t>4. Applies the quantized linear classifier to produce a class prediction.</w:t>
-      </w:r>
-    </w:p>
-    <w:p>
-      <w:pPr>
-        <w:pStyle w:val="ListParagraph"/>
-      </w:pPr>
-      <w:r>
-        <w:t>5. Prints the checksum, predicted class, and expected class over UART.</w:t>
-      </w:r>
-    </w:p>
-    <w:p>
-      <w:r>
-        <w:t xml:space="preserve">The on-chip LiteX </w:t>
+        <w:t xml:space="preserve">) over the 16×32 output; (3) mean-pools to a D-vector; (4) applies the quantized linear classifier; (5) prints checksum, predicted, and expected class over UART. The on-chip </w:t>
       </w:r>
       <w:r>
         <w:rPr>
@@ -3899,7 +3730,7 @@
         <w:t>timer0</w:t>
       </w:r>
       <w:r>
-        <w:t xml:space="preserve"> peripheral is read before and after </w:t>
+        <w:t xml:space="preserve"> is read around </w:t>
       </w:r>
       <w:r>
         <w:rPr>
@@ -3909,7 +3740,7 @@
         <w:t>demo_run()</w:t>
       </w:r>
       <w:r>
-        <w:t xml:space="preserve"> to measure elapsed cycles with cycle-accurate precision, converted to milliseconds at </w:t>
+        <w:t xml:space="preserve"> for cycle-accurate timing, converted to ms at </w:t>
       </w:r>
       <w:r>
         <w:rPr>
@@ -3940,7 +3771,7 @@
     </w:p>
     <w:p>
       <w:r>
-        <w:t>Before any FPGA implementation, TinyFormer was trained and validated on a host machine using PyTorch. This pipeline serves as the algorithmic reference and provides the quantized weights used in firmware.</w:t>
+        <w:t>Before any FPGA work, TinyFormer was trained and validated on a host with PyTorch. This pipeline is the algorithmic reference and the source of the quantized firmware weights.</w:t>
       </w:r>
     </w:p>
     <w:p>
@@ -3951,7 +3782,7 @@
         <w:t>Dataset Preparation.</w:t>
       </w:r>
       <w:r>
-        <w:t xml:space="preserve"> The UCI Human Activity Recognition (UCI HAR) dataset [5] contains inertial sensor recordings (body accelerometer and gyroscope) from 30 subjects performing 6 activities: walking, walking upstairs, walking downstairs, sitting, standing, and laying. Raw signals consist of 6 channels (acc x/y/z, gyro x/y/z) at 128 timesteps per sample. The preprocessing pipeline (</w:t>
+        <w:t xml:space="preserve"> The UCI Human Activity Recognition (UCI HAR) dataset [5] holds inertial recordings (body accelerometer + gyroscope) from 30 subjects across 6 activities (walking, walking up/down stairs, sitting, standing, laying): 6 channels (acc/gyro x/y/z) at 128 timesteps per sample. Preprocessing (</w:t>
       </w:r>
       <w:r>
         <w:rPr>
@@ -3972,10 +3803,10 @@
         <w:rPr>
           <w:b/>
         </w:rPr>
-        <w:t>Time downsampling:</w:t>
-      </w:r>
-      <w:r>
-        <w:t xml:space="preserve"> Each 128-timestep signal is average-pooled in chunks of 8 down to 16 timesteps, matching TinyFormer's sequence length S=16.</w:t>
+        <w:t>Downsampling:</w:t>
+      </w:r>
+      <w:r>
+        <w:t xml:space="preserve"> each 128-step signal is average-pooled in chunks of 8 to 16 steps (S=16).</w:t>
       </w:r>
     </w:p>
     <w:p>
@@ -3989,7 +3820,7 @@
         <w:t>Feature engineering:</w:t>
       </w:r>
       <w:r>
-        <w:t xml:space="preserve"> For each of the 16 timesteps, a 32-dimensional feature vector (matching D=32) is constructed from 14 engineered features, with the remaining 18 dimensions zero-padded. The feature layout is shown in Table 5.</w:t>
+        <w:t xml:space="preserve"> each step gets a 32-dim vector (D=32) from 14 engineered features, the other 18 dims zero-padded (Table 5).</w:t>
       </w:r>
     </w:p>
     <w:p>
@@ -4003,7 +3834,7 @@
         <w:t>Normalization:</w:t>
       </w:r>
       <w:r>
-        <w:t xml:space="preserve"> Per-feature z-score normalization is applied using mean and standard deviation computed over all training samples and timesteps; the same statistics are applied to the test set.</w:t>
+        <w:t xml:space="preserve"> per-feature z-score from training-set statistics, applied to the test set too.</w:t>
       </w:r>
     </w:p>
     <w:p>
@@ -4017,12 +3848,12 @@
         <w:t>Labels:</w:t>
       </w:r>
       <w:r>
-        <w:t xml:space="preserve"> Original labels (1–6) are remapped to 0–5.</w:t>
+        <w:t xml:space="preserve"> remapped from 1–6 to 0–5.</w:t>
       </w:r>
     </w:p>
     <w:p>
       <w:r>
-        <w:t>The resulting dataset has shape (N, 16, 32). The 18 zero-padded dimensions are a deliberate design choice: they round the feature dimension up to D=32, which keeps it a multiple of 4 (required by the DOT8 4-lane packing and the GEMV 32-bit packed data path) and a power of two (simplifying the right-shift scaling).</w:t>
+        <w:t>The result has shape (N, 16, 32). The 18 zero-padded dims are deliberate: they round D up to 32 — a multiple of 4 (needed by DOT8 4-lane packing and the GEMV 32-bit data path) and a power of two (simplifying right-shift scaling).</w:t>
       </w:r>
     </w:p>
     <w:p>
@@ -4359,13 +4190,8 @@
         <w:t>Training.</w:t>
       </w:r>
       <w:r>
-        <w:t xml:space="preserve"> A TinyFormer encoder (S=16, D=32, FFN=64, 1 head) plus a linear classifier head (D=32 to 6 classes) is trained in PyTorch using cross-entropy loss and the Adam optimizer. The training script produces:</w:t>
-      </w:r>
-    </w:p>
-    <w:p>
-      <w:pPr>
-        <w:pStyle w:val="ListBullet"/>
-      </w:pPr>
+        <w:t xml:space="preserve"> The encoder (S=16, D=32, FFN=64, 1 head) plus a linear classifier head (D=32 → 6 classes) is trained in PyTorch with cross-entropy loss and Adam, producing </w:t>
+      </w:r>
       <w:r>
         <w:rPr>
           <w:rFonts w:ascii="Consolas" w:hAnsi="Consolas"/>
@@ -4374,13 +4200,8 @@
         <w:t>artifacts/state_dict.pt</w:t>
       </w:r>
       <w:r>
-        <w:t xml:space="preserve"> — encoder weights (W_q, W_k, W_v, W_o, W_ff1, W_ff2 and corresponding biases).</w:t>
-      </w:r>
-    </w:p>
-    <w:p>
-      <w:pPr>
-        <w:pStyle w:val="ListBullet"/>
-      </w:pPr>
+        <w:t xml:space="preserve"> (encoder weights and biases) and </w:t>
+      </w:r>
       <w:r>
         <w:rPr>
           <w:rFonts w:ascii="Consolas" w:hAnsi="Consolas"/>
@@ -4389,7 +4210,7 @@
         <w:t>artifacts/classifier.npz</w:t>
       </w:r>
       <w:r>
-        <w:t xml:space="preserve"> — classifier head weights and biases.</w:t>
+        <w:t xml:space="preserve"> (classifier head).</w:t>
       </w:r>
     </w:p>
     <w:p>
@@ -4400,7 +4221,7 @@
         <w:t>Weight Export.</w:t>
       </w:r>
       <w:r>
-        <w:t xml:space="preserve"> A dedicated export script (</w:t>
+        <w:t xml:space="preserve"> </w:t>
       </w:r>
       <w:r>
         <w:rPr>
@@ -4410,7 +4231,7 @@
         <w:t>tools/export_weights.py</w:t>
       </w:r>
       <w:r>
-        <w:t>) quantizes floating-point weights to int8 using symmetric per-tensor scaling and generates C source files (</w:t>
+        <w:t xml:space="preserve"> quantizes the float weights to int8 with symmetric per-tensor scaling and emits C sources (</w:t>
       </w:r>
       <w:r>
         <w:rPr>
@@ -4440,7 +4261,7 @@
         <w:t>demo_classifier.c/h</w:t>
       </w:r>
       <w:r>
-        <w:t>) in the row-major layout expected by the firmware. A fixed set of 10 test samples with ground-truth labels is embedded for on-device validation.</w:t>
+        <w:t>) in the firmware's row-major layout, embedding 10 labelled test samples for on-device validation.</w:t>
       </w:r>
     </w:p>
     <w:p>
@@ -4451,7 +4272,7 @@
         <w:t>Software Reference.</w:t>
       </w:r>
       <w:r>
-        <w:t xml:space="preserve"> The Python pipeline also serves as the numerical reference. The int8 C implementation in </w:t>
+        <w:t xml:space="preserve"> The Python pipeline is also the numerical reference: the int8 C code in </w:t>
       </w:r>
       <w:r>
         <w:rPr>
@@ -4461,7 +4282,7 @@
         <w:t>tinyformer.c</w:t>
       </w:r>
       <w:r>
-        <w:t xml:space="preserve"> is validated against Python-computed encoder outputs prior to hardware bring-up to confirm that quantization error is within the expected range.</w:t>
+        <w:t xml:space="preserve"> is validated against Python encoder outputs before hardware bring-up to confirm quantization error is within range.</w:t>
       </w:r>
     </w:p>
     <w:p>
@@ -4474,7 +4295,7 @@
     </w:p>
     <w:p>
       <w:r>
-        <w:t>Classification accuracy in this project originates entirely from the PyTorch training stage; the bare-metal C runtime only *executes* the exported network and does not train. Accuracy is therefore best reported in three stages, following the staged-reporting methodology used by KWT-Tiny [1]:</w:t>
+        <w:t>Accuracy originates entirely in PyTorch training; the bare-metal C runtime only *executes* the exported network. It is reported in three stages, following KWT-Tiny [1]:</w:t>
       </w:r>
     </w:p>
     <w:p>
@@ -4491,17 +4312,7 @@
         <w:t>Float reference (PyTorch).</w:t>
       </w:r>
       <w:r>
-        <w:t xml:space="preserve"> The encoder plus linear classifier head are trained with cross-entropy loss and Adam. The training script (</w:t>
-      </w:r>
-      <w:r>
-        <w:rPr>
-          <w:rFonts w:ascii="Consolas" w:hAnsi="Consolas"/>
-          <w:sz w:val="20"/>
-        </w:rPr>
-        <w:t>train_tinyformer_uci_har.py</w:t>
-      </w:r>
-      <w:r>
-        <w:t>) prints train and test accuracy each epoch; the test accuracy of the trained float model is the upper-bound reference. *(Measured value to be inserted from the final training run: test accuracy ≈ [__]%.)*</w:t>
+        <w:t xml:space="preserve"> The encoder + classifier head trained with cross-entropy and Adam; the float test accuracy is the upper-bound reference. *(Value from the final run: ≈ [__]%.)*</w:t>
       </w:r>
     </w:p>
     <w:p>
@@ -4518,7 +4329,7 @@
         <w:t>Quantized C path (int8).</w:t>
       </w:r>
       <w:r>
-        <w:t xml:space="preserve"> Exporting weights and activations to int8 with symmetric per-tensor scaling and the fixed right-shift-by-7 requantization introduces a small, expected quantization loss relative to the float reference. This is the accuracy actually realized on the FPGA. The crude uniform shift-by-7 scaling (rather than per-channel scaling) is the dominant source of this gap and is noted as a candidate for future refinement (Section 6.2).</w:t>
+        <w:t xml:space="preserve"> Exporting to int8 with symmetric per-tensor scaling and the fixed shift-by-7 requantization adds a small, expected loss — the accuracy actually realized on the FPGA. The crude uniform shift (vs. per-channel) is the dominant source of this gap (future work, Section 6.2).</w:t>
       </w:r>
     </w:p>
     <w:p>
@@ -4535,16 +4346,7 @@
         <w:t>Accelerated path.</w:t>
       </w:r>
       <w:r>
-        <w:t xml:space="preserve"> Because the correctness gate (Section 5.4) proves the encoder output is </w:t>
-      </w:r>
-      <w:r>
-        <w:rPr>
-          <w:b/>
-        </w:rPr>
-        <w:t>bit-identical</w:t>
-      </w:r>
-      <w:r>
-        <w:t xml:space="preserve"> between the baseline int8 path and every accelerated build, the accelerated path has </w:t>
+        <w:t xml:space="preserve"> Since the correctness gate (Section 5.4) proves bit-identical encoder output between baseline and every accelerated build, the accelerated path has </w:t>
       </w:r>
       <w:r>
         <w:rPr>
@@ -4553,7 +4355,7 @@
         <w:t>exactly</w:t>
       </w:r>
       <w:r>
-        <w:t xml:space="preserve"> the same accuracy as the quantized C path — the accelerators introduce zero additional accuracy loss by construction. This is a key advantage over approaches that approximate transcendental functions in hardware: the EXP-LUT, DOT8, and GEMV blocks each reproduce the software result exactly, so acceleration is decoupled from quality.</w:t>
+        <w:t xml:space="preserve"> the quantized C path's accuracy — zero added loss by construction. EXP-LUT, DOT8, and GEMV each reproduce the software result exactly, decoupling acceleration from quality.</w:t>
       </w:r>
     </w:p>
     <w:p>
@@ -4574,7 +4376,7 @@
         <w:t>demo_labels = {0,1,2,3,4,5,4,4,4,4}</w:t>
       </w:r>
       <w:r>
-        <w:t xml:space="preserve">, spanning all six activity classes) are embedded in firmware. The demo runner classifies each on-target and prints </w:t>
+        <w:t xml:space="preserve">, spanning all six classes) are embedded; the demo runner classifies each and prints </w:t>
       </w:r>
       <w:r>
         <w:rPr>
@@ -4594,7 +4396,7 @@
         <w:t>exp</w:t>
       </w:r>
       <w:r>
-        <w:t xml:space="preserve"> per sample. Because predictions are bit-identical across all modes, this serves as a deterministic end-to-end functional check on hardware rather than a statistical accuracy estimate, which is established on the full held-out test set in PyTorch.</w:t>
+        <w:t>. Being bit-identical across modes, this is a deterministic hardware functional check, not a statistical accuracy estimate (the latter from the full held-out test set in PyTorch).</w:t>
       </w:r>
     </w:p>
     <w:p>
@@ -4607,7 +4409,7 @@
     </w:p>
     <w:p>
       <w:r>
-        <w:t>Both MMIO peripherals were verified in standalone SystemVerilog simulation using Vivado 2025.2's xsim simulator before integration into the LiteX SoC. This two-stage verification strategy (standalone simulation, then in-system self-test) catches hardware bugs before they are obscured by SoC integration complexity.</w:t>
+        <w:t>Both MMIO peripherals were verified in standalone SystemVerilog simulation (Vivado 2025.2 xsim) before SoC integration. This two-stage strategy — standalone simulation, then in-system self-test — catches bugs before SoC integration obscures them.</w:t>
       </w:r>
     </w:p>
     <w:p>
@@ -4819,7 +4621,7 @@
         <w:t>$fatal</w:t>
       </w:r>
       <w:r>
-        <w:t>. A PASS message is printed on successful completion. The testbench also generates a VCD waveform file (</w:t>
+        <w:t>; a PASS prints on success. The testbench also writes a VCD (</w:t>
       </w:r>
       <w:r>
         <w:rPr>
@@ -4840,7 +4642,7 @@
         <w:t>LUT Testbench (`tb_lut.sv`).</w:t>
       </w:r>
       <w:r>
-        <w:t xml:space="preserve"> A full address sweep (indices 0–15) compares each output against a golden file (</w:t>
+        <w:t xml:space="preserve"> A full sweep (indices 0–15) compares each output against the golden file (</w:t>
       </w:r>
       <w:r>
         <w:rPr>
@@ -4850,7 +4652,7 @@
         <w:t>expected_lut.mem</w:t>
       </w:r>
       <w:r>
-        <w:t xml:space="preserve">). The golden values are the Q10 fixed-point representations of exp(0) through exp(−15), matching the software LUT in </w:t>
+        <w:t xml:space="preserve">) — the Q10 representations of exp(0)…exp(−15), matching </w:t>
       </w:r>
       <w:r>
         <w:rPr>
@@ -4915,7 +4717,7 @@
         <w:t>tb_gemv</w:t>
       </w:r>
       <w:r>
-        <w:t xml:space="preserve"> xsim run, with signals grouped (Clock/Reset, Load, Start, FSM state/pointers, MAC datapath, Read-back) so the operation reads top-to-bottom.</w:t>
+        <w:t xml:space="preserve"> xsim run, signals grouped (Clock/Reset, Load, Start, FSM state/pointers, MAC datapath, Read-back) to read top-to-bottom.</w:t>
       </w:r>
     </w:p>
     <w:p>
@@ -4937,7 +4739,7 @@
       <w:r>
         <w:drawing>
           <wp:inline xmlns:a="http://schemas.openxmlformats.org/drawingml/2006/main" xmlns:pic="http://schemas.openxmlformats.org/drawingml/2006/picture">
-            <wp:extent cx="5120640" cy="1635404"/>
+            <wp:extent cx="4754880" cy="1518590"/>
             <wp:docPr id="7" name="Picture 7"/>
             <wp:cNvGraphicFramePr>
               <a:graphicFrameLocks noChangeAspect="1"/>
@@ -4958,7 +4760,7 @@
                   <pic:spPr>
                     <a:xfrm>
                       <a:off x="0" y="0"/>
-                      <a:ext cx="5120640" cy="1635404"/>
+                      <a:ext cx="4754880" cy="1518590"/>
                     </a:xfrm>
                     <a:prstGeom prst="rect"/>
                   </pic:spPr>
@@ -4972,7 +4774,7 @@
     <w:p/>
     <w:p>
       <w:r>
-        <w:t>Figure 7 shows one matrix-vector operation end to end: reset, the three CPU load bursts (</w:t>
+        <w:t>Figure 7 shows one matvec end to end: reset, the three CPU load bursts (</w:t>
       </w:r>
       <w:r>
         <w:rPr>
@@ -5042,7 +4844,7 @@
         <w:t>done</w:t>
       </w:r>
       <w:r>
-        <w:t xml:space="preserve"> with read-back. The load bursts dominate the timeline, yet the CPU blocks only for the single </w:t>
+        <w:t xml:space="preserve"> with read-back. The load bursts dominate, yet the CPU blocks only for the single </w:t>
       </w:r>
       <w:r>
         <w:rPr>
@@ -5052,7 +4854,7 @@
         <w:t>start</w:t>
       </w:r>
       <w:r>
-        <w:t xml:space="preserve"> write — compute then runs entirely inside the peripheral.</w:t>
+        <w:t xml:space="preserve"> write — compute runs entirely inside the peripheral.</w:t>
       </w:r>
     </w:p>
     <w:p>
@@ -5074,7 +4876,7 @@
       <w:r>
         <w:drawing>
           <wp:inline xmlns:a="http://schemas.openxmlformats.org/drawingml/2006/main" xmlns:pic="http://schemas.openxmlformats.org/drawingml/2006/picture">
-            <wp:extent cx="5120640" cy="1606601"/>
+            <wp:extent cx="4754880" cy="1491844"/>
             <wp:docPr id="8" name="Picture 8"/>
             <wp:cNvGraphicFramePr>
               <a:graphicFrameLocks noChangeAspect="1"/>
@@ -5095,7 +4897,7 @@
                   <pic:spPr>
                     <a:xfrm>
                       <a:off x="0" y="0"/>
-                      <a:ext cx="5120640" cy="1606601"/>
+                      <a:ext cx="4754880" cy="1491844"/>
                     </a:xfrm>
                     <a:prstGeom prst="rect"/>
                   </pic:spPr>
@@ -5109,7 +4911,7 @@
     <w:p/>
     <w:p>
       <w:r>
-        <w:t xml:space="preserve">Figure 8 zooms to ~6 cycles around kick-off: on the rising edge during the one-cycle </w:t>
+        <w:t xml:space="preserve">Figure 8 zooms to ~6 cycles around kick-off: on the </w:t>
       </w:r>
       <w:r>
         <w:rPr>
@@ -5149,7 +4951,7 @@
         <w:t>busy</w:t>
       </w:r>
       <w:r>
-        <w:t xml:space="preserve"> asserts. One CSR write starts the peripheral and the CPU is immediately free.</w:t>
+        <w:t xml:space="preserve"> asserts. One CSR write starts the peripheral; the CPU is immediately free.</w:t>
       </w:r>
     </w:p>
     <w:p>
@@ -5171,7 +4973,7 @@
       <w:r>
         <w:drawing>
           <wp:inline xmlns:a="http://schemas.openxmlformats.org/drawingml/2006/main" xmlns:pic="http://schemas.openxmlformats.org/drawingml/2006/picture">
-            <wp:extent cx="5120640" cy="1616202"/>
+            <wp:extent cx="4754880" cy="1500759"/>
             <wp:docPr id="9" name="Picture 9"/>
             <wp:cNvGraphicFramePr>
               <a:graphicFrameLocks noChangeAspect="1"/>
@@ -5192,7 +4994,7 @@
                   <pic:spPr>
                     <a:xfrm>
                       <a:off x="0" y="0"/>
-                      <a:ext cx="5120640" cy="1616202"/>
+                      <a:ext cx="4754880" cy="1500759"/>
                     </a:xfrm>
                     <a:prstGeom prst="rect"/>
                   </pic:spPr>
@@ -5206,7 +5008,7 @@
     <w:p/>
     <w:p>
       <w:r>
-        <w:t xml:space="preserve">Figure 9 spans one output row. With </w:t>
+        <w:t xml:space="preserve">Figure 9 spans one output row: with </w:t>
       </w:r>
       <w:r>
         <w:rPr>
@@ -5216,7 +5018,7 @@
         <w:t>row = 0</w:t>
       </w:r>
       <w:r>
-        <w:t xml:space="preserve"> held, </w:t>
+        <w:t xml:space="preserve">, </w:t>
       </w:r>
       <w:r>
         <w:rPr>
@@ -5256,7 +5058,7 @@
         <w:t>w_word</w:t>
       </w:r>
       <w:r>
-        <w:t xml:space="preserve"> present a fresh packed-operand pair, </w:t>
+        <w:t xml:space="preserve"> present a packed-operand pair, </w:t>
       </w:r>
       <w:r>
         <w:rPr>
@@ -5266,7 +5068,7 @@
         <w:t>dot4</w:t>
       </w:r>
       <w:r>
-        <w:t xml:space="preserve"> yields a new signed value (four int8 multiplies + adder tree in one cycle), and </w:t>
+        <w:t xml:space="preserve"> yields a signed value (four int8 multiplies + adder tree in one cycle), and </w:t>
       </w:r>
       <w:r>
         <w:rPr>
@@ -5306,7 +5108,7 @@
         <w:t>row</w:t>
       </w:r>
       <w:r>
-        <w:t xml:space="preserve"> advances and </w:t>
+        <w:t xml:space="preserve"> advances, </w:t>
       </w:r>
       <w:r>
         <w:rPr>
@@ -5326,7 +5128,7 @@
         <w:t>b[1]</w:t>
       </w:r>
       <w:r>
-        <w:t xml:space="preserve">. So 32 multiplies complete in 8 cycles (vs. 32 for a byte-wide MAC); the full </w:t>
+        <w:t xml:space="preserve">. So 32 multiplies finish in 8 cycles (vs. 32 byte-wide); the full </w:t>
       </w:r>
       <w:r>
         <w:rPr>
@@ -5346,7 +5148,7 @@
         <w:t>done</w:t>
       </w:r>
       <w:r>
-        <w:t xml:space="preserve"> phase is ≈290 cycles for a 32×32 matvec (256 MAC cycles plus per-row bookkeeping).</w:t>
+        <w:t xml:space="preserve"> phase is ≈290 cycles for a 32×32 matvec (256 MAC + per-row bookkeeping).</w:t>
       </w:r>
     </w:p>
     <w:p>
@@ -5368,7 +5170,7 @@
       <w:r>
         <w:drawing>
           <wp:inline xmlns:a="http://schemas.openxmlformats.org/drawingml/2006/main" xmlns:pic="http://schemas.openxmlformats.org/drawingml/2006/picture">
-            <wp:extent cx="5120640" cy="1600200"/>
+            <wp:extent cx="4754880" cy="1485900"/>
             <wp:docPr id="10" name="Picture 10"/>
             <wp:cNvGraphicFramePr>
               <a:graphicFrameLocks noChangeAspect="1"/>
@@ -5389,7 +5191,7 @@
                   <pic:spPr>
                     <a:xfrm>
                       <a:off x="0" y="0"/>
-                      <a:ext cx="5120640" cy="1600200"/>
+                      <a:ext cx="4754880" cy="1485900"/>
                     </a:xfrm>
                     <a:prstGeom prst="rect"/>
                   </pic:spPr>
@@ -5443,7 +5245,7 @@
         <w:t>done</w:t>
       </w:r>
       <w:r>
-        <w:t xml:space="preserve"> latches, and a </w:t>
+        <w:t xml:space="preserve"> latches, a </w:t>
       </w:r>
       <w:r>
         <w:rPr>
@@ -5453,7 +5255,7 @@
         <w:t>clear_done</w:t>
       </w:r>
       <w:r>
-        <w:t xml:space="preserve"> pulse resets the read pointer. Each </w:t>
+        <w:t xml:space="preserve"> pulse resets the read pointer, and each </w:t>
       </w:r>
       <w:r>
         <w:rPr>
@@ -5463,7 +5265,7 @@
         <w:t>y_rd_en</w:t>
       </w:r>
       <w:r>
-        <w:t xml:space="preserve"> pulse presents the next int32 result; for this stimulus the outputs read −8, −6, −4, −2 (rows 0–3), matching the software golden exactly — the peripheral is bit-exact, not just fast.</w:t>
+        <w:t xml:space="preserve"> presents the next int32 result. Outputs read −8, −6, −4, −2 (rows 0–3), matching the software golden exactly — bit-exact, not just fast.</w:t>
       </w:r>
     </w:p>
     <w:p>
@@ -5476,7 +5278,7 @@
     </w:p>
     <w:p>
       <w:r>
-        <w:t xml:space="preserve">The following captures are from the </w:t>
+        <w:t xml:space="preserve">These captures are from the </w:t>
       </w:r>
       <w:r>
         <w:rPr>
@@ -5486,7 +5288,7 @@
         <w:t>tb_lut</w:t>
       </w:r>
       <w:r>
-        <w:t xml:space="preserve"> xsim run, which verifies the exponential lookup peripheral against the golden table </w:t>
+        <w:t xml:space="preserve"> xsim run, which verifies the lookup peripheral against the golden table </w:t>
       </w:r>
       <w:r>
         <w:rPr>
@@ -5518,7 +5320,7 @@
       <w:r>
         <w:drawing>
           <wp:inline xmlns:a="http://schemas.openxmlformats.org/drawingml/2006/main" xmlns:pic="http://schemas.openxmlformats.org/drawingml/2006/picture">
-            <wp:extent cx="5120640" cy="710489"/>
+            <wp:extent cx="4754880" cy="659740"/>
             <wp:docPr id="11" name="Picture 11"/>
             <wp:cNvGraphicFramePr>
               <a:graphicFrameLocks noChangeAspect="1"/>
@@ -5539,7 +5341,7 @@
                   <pic:spPr>
                     <a:xfrm>
                       <a:off x="0" y="0"/>
-                      <a:ext cx="5120640" cy="710489"/>
+                      <a:ext cx="4754880" cy="659740"/>
                     </a:xfrm>
                     <a:prstGeom prst="rect"/>
                   </pic:spPr>
@@ -5563,7 +5365,7 @@
         <w:t>index</w:t>
       </w:r>
       <w:r>
-        <w:t xml:space="preserve"> through </w:t>
+        <w:t xml:space="preserve"> </w:t>
       </w:r>
       <w:r>
         <w:rPr>
@@ -5583,7 +5385,7 @@
         <w:t>value</w:t>
       </w:r>
       <w:r>
-        <w:t xml:space="preserve"> on the same cycle and checking it against the golden table (</w:t>
+        <w:t xml:space="preserve"> the same cycle against the golden table (</w:t>
       </w:r>
       <w:r>
         <w:rPr>
@@ -5593,7 +5395,7 @@
         <w:t>addr = index[3:0]</w:t>
       </w:r>
       <w:r>
-        <w:t xml:space="preserve"> shown beneath). It shows two properties: </w:t>
+        <w:t xml:space="preserve">). It shows two properties: </w:t>
       </w:r>
       <w:r>
         <w:rPr>
@@ -5602,17 +5404,7 @@
         <w:t>zero-cycle combinational behaviour</w:t>
       </w:r>
       <w:r>
-        <w:t xml:space="preserve"> — each </w:t>
-      </w:r>
-      <w:r>
-        <w:rPr>
-          <w:rFonts w:ascii="Consolas" w:hAnsi="Consolas"/>
-          <w:sz w:val="20"/>
-        </w:rPr>
-        <w:t>index</w:t>
-      </w:r>
-      <w:r>
-        <w:t xml:space="preserve"> transition appears in </w:t>
+        <w:t xml:space="preserve"> — each transition appears in </w:t>
       </w:r>
       <w:r>
         <w:rPr>
@@ -5622,7 +5414,7 @@
         <w:t>value</w:t>
       </w:r>
       <w:r>
-        <w:t xml:space="preserve"> the same cycle, so a softmax exponent is ready immediately; and </w:t>
+        <w:t xml:space="preserve"> the same cycle, so an exponent is ready immediately; and </w:t>
       </w:r>
       <w:r>
         <w:rPr>
@@ -5641,17 +5433,7 @@
         <w:t>0x0400 = 1024</w:t>
       </w:r>
       <w:r>
-        <w:t xml:space="preserve"> (Q10 for 1.0) at </w:t>
-      </w:r>
-      <w:r>
-        <w:rPr>
-          <w:rFonts w:ascii="Consolas" w:hAnsi="Consolas"/>
-          <w:sz w:val="20"/>
-        </w:rPr>
-        <w:t>index = 0</w:t>
-      </w:r>
-      <w:r>
-        <w:t xml:space="preserve"> to </w:t>
+        <w:t xml:space="preserve"> (Q10 for 1.0) at index 0 to </w:t>
       </w:r>
       <w:r>
         <w:rPr>
@@ -5661,17 +5443,7 @@
         <w:t>0x000C = 12</w:t>
       </w:r>
       <w:r>
-        <w:t xml:space="preserve"> (≈ 0.0117) at </w:t>
-      </w:r>
-      <w:r>
-        <w:rPr>
-          <w:rFonts w:ascii="Consolas" w:hAnsi="Consolas"/>
-          <w:sz w:val="20"/>
-        </w:rPr>
-        <w:t>index = 15</w:t>
-      </w:r>
-      <w:r>
-        <w:t xml:space="preserve">. These match </w:t>
+        <w:t xml:space="preserve"> (≈0.0117) at index 15. These match </w:t>
       </w:r>
       <w:r>
         <w:rPr>
@@ -5681,7 +5453,7 @@
         <w:t>compute_exp_q10()</w:t>
       </w:r>
       <w:r>
-        <w:t xml:space="preserve"> bit-for-bit, so the EXP-LUT is a drop-in replacement, not an approximation. All 16 entries are covered in 16 cycles.</w:t>
+        <w:t xml:space="preserve"> bit-for-bit: a drop-in replacement, not an approximation. All 16 entries are covered in 16 cycles.</w:t>
       </w:r>
     </w:p>
     <w:p>
@@ -5703,7 +5475,7 @@
       <w:r>
         <w:drawing>
           <wp:inline xmlns:a="http://schemas.openxmlformats.org/drawingml/2006/main" xmlns:pic="http://schemas.openxmlformats.org/drawingml/2006/picture">
-            <wp:extent cx="5120640" cy="700888"/>
+            <wp:extent cx="4754880" cy="650824"/>
             <wp:docPr id="12" name="Picture 12"/>
             <wp:cNvGraphicFramePr>
               <a:graphicFrameLocks noChangeAspect="1"/>
@@ -5724,7 +5496,7 @@
                   <pic:spPr>
                     <a:xfrm>
                       <a:off x="0" y="0"/>
-                      <a:ext cx="5120640" cy="700888"/>
+                      <a:ext cx="4754880" cy="650824"/>
                     </a:xfrm>
                     <a:prstGeom prst="rect"/>
                   </pic:spPr>
@@ -5738,7 +5510,7 @@
     <w:p/>
     <w:p>
       <w:r>
-        <w:t xml:space="preserve">Figure 12 drives four representative indices — </w:t>
+        <w:t xml:space="preserve">Figure 12 holds four representative indices — </w:t>
       </w:r>
       <w:r>
         <w:rPr>
@@ -5748,7 +5520,7 @@
         <w:t>0, 4, 8, 15</w:t>
       </w:r>
       <w:r>
-        <w:t xml:space="preserve"> — and holds each for five clock cycles, covering the high, mid, and low ends of the table:</w:t>
+        <w:t xml:space="preserve"> — for five cycles each, covering the high, mid, and low ends of the table:</w:t>
       </w:r>
     </w:p>
     <w:tbl>
@@ -6030,7 +5802,7 @@
     <w:p/>
     <w:p>
       <w:r>
-        <w:t xml:space="preserve">Each plateau holds steady with no glitches (a pure combinational ROM), and every transition is an instantaneous step. The per-exponent cost is just two CSR transactions (~12 cycles) versus the ≈21,000-cycle software </w:t>
+        <w:t xml:space="preserve">Each plateau holds steady with no glitches (pure combinational ROM) and every transition is an instantaneous step. The per-exponent cost is two CSR transactions (~12 cycles) versus the ≈21,000-cycle software </w:t>
       </w:r>
       <w:r>
         <w:rPr>
@@ -6110,7 +5882,7 @@
     </w:p>
     <w:p>
       <w:r>
-        <w:t>The self-tests are designed so that they can run even when the corresponding hardware is absent (using software fallbacks where applicable), allowing SoC and toolchain validation before the hardware peripherals are enabled.</w:t>
+        <w:t>The self-tests also run when the corresponding hardware is absent (via software fallbacks), allowing SoC and toolchain validation before the peripherals are enabled.</w:t>
       </w:r>
     </w:p>
     <w:p>
@@ -6131,7 +5903,7 @@
     </w:p>
     <w:p>
       <w:r>
-        <w:t xml:space="preserve">The baseline firmware (pure software, no accelerators, runtime fixed-point exp() computation) was measured at </w:t>
+        <w:t xml:space="preserve">The baseline firmware (pure software, runtime fixed-point exp()) measured </w:t>
       </w:r>
       <w:r>
         <w:rPr>
@@ -6140,7 +5912,7 @@
         <w:t>75,900,400 cycles (759.00 ms)</w:t>
       </w:r>
       <w:r>
-        <w:t xml:space="preserve"> per inference across 10 samples. The on-chip hardware timer is the authoritative measurement source; Python wall-clock timing is unreliable at this granularity due to pyserial buffering behavior.</w:t>
+        <w:t xml:space="preserve"> per inference across 10 samples. The on-chip hardware timer is the authoritative source; Python wall-clock timing is unreliable here due to pyserial buffering.</w:t>
       </w:r>
     </w:p>
     <w:p>
@@ -6162,7 +5934,7 @@
       <w:r>
         <w:drawing>
           <wp:inline xmlns:a="http://schemas.openxmlformats.org/drawingml/2006/main" xmlns:pic="http://schemas.openxmlformats.org/drawingml/2006/picture">
-            <wp:extent cx="5120640" cy="2479468"/>
+            <wp:extent cx="4754880" cy="2302363"/>
             <wp:docPr id="13" name="Picture 13"/>
             <wp:cNvGraphicFramePr>
               <a:graphicFrameLocks noChangeAspect="1"/>
@@ -6183,7 +5955,7 @@
                   <pic:spPr>
                     <a:xfrm>
                       <a:off x="0" y="0"/>
-                      <a:ext cx="5120640" cy="2479468"/>
+                      <a:ext cx="4754880" cy="2302363"/>
                     </a:xfrm>
                     <a:prstGeom prst="rect"/>
                   </pic:spPr>
@@ -6746,7 +6518,7 @@
     <w:p/>
     <w:p>
       <w:r>
-        <w:t xml:space="preserve">The 71% cycle share of softmax exp() reflects a deliberate methodological choice: the baseline uses genuine runtime fixed-point arithmetic (a fixed-iteration loop plus multiplicative decay with constant </w:t>
+        <w:t xml:space="preserve">The 71% softmax share reflects a deliberate choice: the baseline uses genuine runtime fixed-point arithmetic (fixed-iteration loop plus multiplicative decay, constant </w:t>
       </w:r>
       <w:r>
         <w:rPr>
@@ -6756,7 +6528,7 @@
         <w:t>decay_q15 = 24,149</w:t>
       </w:r>
       <w:r>
-        <w:t xml:space="preserve">) rather than a precomputed table. The computation function is marked </w:t>
+        <w:t xml:space="preserve">), not a precomputed table, and is marked </w:t>
       </w:r>
       <w:r>
         <w:rPr>
@@ -6766,7 +6538,7 @@
         <w:t>__attribute__((noinline, optimize("O0")))</w:t>
       </w:r>
       <w:r>
-        <w:t xml:space="preserve"> to prevent the compiler from constant-folding or memoizing it across calls. This is essential for a fair EXP-LUT comparison: if the baseline read from a software table, gcc would resolve it at compile time and the hardware LUT would show no advantage. We note for transparency that the *absolute* softmax share — and therefore the headline end-to-end speedup — depends on this modeling choice; the EXP-LUT genuinely replaces real runtime exp() work, not an already-tabulated lookup. The per-call cost (~21,000 cycles) is derived from the measured total (53.8 M cycles ÷ 2,560 calls).</w:t>
+        <w:t xml:space="preserve"> so gcc cannot constant-fold or memoize it. This is essential for a fair EXP-LUT comparison: a software table would be resolved at compile time and the hardware LUT would show no advantage. For transparency, the *absolute* softmax share — and thus the headline speedup — depends on this modeling choice; the EXP-LUT replaces real runtime exp() work. The per-call cost (~21,000 cycles) is the measured total (53.8 M cycles ÷ 2,560 calls).</w:t>
       </w:r>
     </w:p>
     <w:p>
@@ -6779,7 +6551,7 @@
     </w:p>
     <w:p>
       <w:r>
-        <w:t xml:space="preserve">All measurements were taken on the same FPGA bitstream, with only the firmware binary changing between modes. The on-chip LiteX </w:t>
+        <w:t xml:space="preserve">All measurements use the same bitstream, only the firmware binary changing between modes; the on-chip </w:t>
       </w:r>
       <w:r>
         <w:rPr>
@@ -6789,7 +6561,7 @@
         <w:t>timer0</w:t>
       </w:r>
       <w:r>
-        <w:t xml:space="preserve"> provides cycle-accurate measurement independent of host-side serial latency.</w:t>
+        <w:t xml:space="preserve"> provides cycle-accurate timing independent of host serial latency.</w:t>
       </w:r>
     </w:p>
     <w:p>
@@ -7072,7 +6844,7 @@
       <w:r>
         <w:drawing>
           <wp:inline xmlns:a="http://schemas.openxmlformats.org/drawingml/2006/main" xmlns:pic="http://schemas.openxmlformats.org/drawingml/2006/picture">
-            <wp:extent cx="5120640" cy="3543658"/>
+            <wp:extent cx="4754880" cy="3290539"/>
             <wp:docPr id="14" name="Picture 14"/>
             <wp:cNvGraphicFramePr>
               <a:graphicFrameLocks noChangeAspect="1"/>
@@ -7093,7 +6865,7 @@
                   <pic:spPr>
                     <a:xfrm>
                       <a:off x="0" y="0"/>
-                      <a:ext cx="5120640" cy="3543658"/>
+                      <a:ext cx="4754880" cy="3290539"/>
                     </a:xfrm>
                     <a:prstGeom prst="rect"/>
                   </pic:spPr>
@@ -7121,7 +6893,7 @@
         <w:t>EXP-LUT</w:t>
       </w:r>
       <w:r>
-        <w:t xml:space="preserve"> eliminates the dominant bottleneck (71% of baseline cycles) by replacing a ~21,000-cycle per-call runtime computation with a ~12-cycle MMIO lookup — approximately 1,700× faster per call. Despite its hardware simplicity (a combinational ROM), this accelerator delivers the largest fraction of the total cycle reduction.</w:t>
+        <w:t xml:space="preserve"> eliminates the dominant bottleneck (71% of baseline cycles), replacing a ~21,000-cycle runtime computation with a ~12-cycle MMIO lookup (~1,700× per call). Despite being the simplest block (a combinational ROM), it delivers the largest share of the reduction.</w:t>
       </w:r>
     </w:p>
     <w:p>
@@ -7132,7 +6904,7 @@
         <w:t>GEMV</w:t>
       </w:r>
       <w:r>
-        <w:t xml:space="preserve"> is the single largest contributor in absolute cycle savings. Comparing the baseline software matvec to the GEMV peripheral, the speedup per 32×32 matvec call is approximately 8× (from ~17,000 cycles to ~2,000 cycles). This improvement comes equally from two independent optimizations: (1) the 4× reduction in CSR-bus writes due to the 32-bit packed data path, and (2) the 4× reduction in compute cycles due to the parallel 4-lane MAC.</w:t>
+        <w:t xml:space="preserve"> is the largest absolute saver: per 32×32 matvec it is ~8× faster (~17,000 → ~2,000 cycles), coming equally from the 4× fewer CSR writes (packed data path) and the 4× fewer compute cycles (4-lane MAC).</w:t>
       </w:r>
     </w:p>
     <w:p>
@@ -7143,7 +6915,7 @@
         <w:t>DOT8</w:t>
       </w:r>
       <w:r>
-        <w:t xml:space="preserve"> contributes a modest speedup consistent with the initial 1% cycle share of attention dot products. Its contribution is small in the final measurement because the dominant bottlenecks (softmax and matvec) are addressed by the other two accelerators.</w:t>
+        <w:t xml:space="preserve"> contributes a modest speedup matching the initial 1% share of attention dot-products; it is small in the final measurement because softmax and matvec dominate and are handled by the other two blocks.</w:t>
       </w:r>
     </w:p>
     <w:p>
@@ -7342,7 +7114,7 @@
     </w:p>
     <w:p>
       <w:r>
-        <w:t xml:space="preserve">Before any performance numbers were reported, every accelerated build was required to pass the </w:t>
+        <w:t xml:space="preserve">Before any performance number, every accelerated build had to pass the </w:t>
       </w:r>
       <w:r>
         <w:rPr>
@@ -7352,7 +7124,7 @@
         <w:t>ENC_CKSUM</w:t>
       </w:r>
       <w:r>
-        <w:t xml:space="preserve"> correctness gate: the 32-bit additive checksum over the encoder's 16×32 int8 output must be bit-identical between baseline and the accelerated build for every test sample.</w:t>
+        <w:t xml:space="preserve"> gate: the 32-bit additive checksum over the 16×32 int8 output must be bit-identical to the baseline for every sample.</w:t>
       </w:r>
     </w:p>
     <w:p>
@@ -7918,7 +7690,7 @@
     <w:p/>
     <w:p>
       <w:r>
-        <w:t>All 10 checksums match. Predicted classes also match the baseline for every sample. This confirms that the reported 4.82× speedup reflects genuine acceleration, not skipped computation or degraded numerical correctness.</w:t>
+        <w:t>All 10 checksums and predicted classes match the baseline, confirming the 4.82× speedup is genuine acceleration, not skipped computation or degraded correctness.</w:t>
       </w:r>
     </w:p>
     <w:p>
@@ -7931,13 +7703,13 @@
     </w:p>
     <w:p>
       <w:r>
-        <w:t xml:space="preserve">Relative to a plain VexRiscv baseline, the three accelerators add </w:t>
+        <w:t xml:space="preserve">Relative to the plain VexRiscv baseline, the accelerators add </w:t>
       </w:r>
       <w:r>
         <w:rPr>
           <w:b/>
         </w:rPr>
-        <w:t>+3.9 percentage points of LUT</w:t>
+        <w:t>+3.9 pp LUT</w:t>
       </w:r>
       <w:r>
         <w:t xml:space="preserve"> (6.13% → </w:t>
@@ -7955,7 +7727,7 @@
         <w:rPr>
           <w:b/>
         </w:rPr>
-        <w:t>+1.8 percentage points of flip-flops</w:t>
+        <w:t>+1.8 pp flip-flops</w:t>
       </w:r>
       <w:r>
         <w:t xml:space="preserve"> (2.49% → 4.32%), and </w:t>
@@ -7964,10 +7736,10 @@
         <w:rPr>
           <w:b/>
         </w:rPr>
-        <w:t>+3.3 percentage points of DSP</w:t>
-      </w:r>
-      <w:r>
-        <w:t xml:space="preserve"> (0% → 3.3%). Measured power rises from </w:t>
+        <w:t>+3.3 pp DSP</w:t>
+      </w:r>
+      <w:r>
+        <w:t xml:space="preserve"> (0% → 3.3%); power rises from </w:t>
       </w:r>
       <w:r>
         <w:rPr>
@@ -7976,30 +7748,21 @@
         <w:t>0.740 W to 0.792 W</w:t>
       </w:r>
       <w:r>
-        <w:t xml:space="preserve">, a factor of </w:t>
+        <w:t xml:space="preserve"> (</w:t>
       </w:r>
       <w:r>
         <w:rPr>
           <w:b/>
         </w:rPr>
-        <w:t>1.07</w:t>
-      </w:r>
-      <w:r>
-        <w:t xml:space="preserve"> (≈ 7%). The full breakdown is given in Table 2.</w:t>
+        <w:t>1.07×</w:t>
+      </w:r>
+      <w:r>
+        <w:t>, ≈7%). Full breakdown in Table 2.</w:t>
       </w:r>
     </w:p>
     <w:p>
       <w:r>
-        <w:t xml:space="preserve">It is worth being candid about the area and power outcome. Among the project's original goals was the aspiration to keep the design *below* 10% of the LUT fabric and to limit power growth. In practice, both area and power </w:t>
-      </w:r>
-      <w:r>
-        <w:rPr>
-          <w:b/>
-        </w:rPr>
-        <w:t>increased modestly</w:t>
-      </w:r>
-      <w:r>
-        <w:t xml:space="preserve"> — this is a fundamental trade-off of FPGA acceleration: dedicated arithmetic units and wider data paths consume logic and switch more, in exchange for fewer cycles. The design landed at 10.04% LUT — marginally over the sub-10% aspiration — and 1.07× power. Set against a </w:t>
+        <w:t xml:space="preserve">To be candid: the original goal aspired to stay *below* 10% LUT and limit power growth, but both rose modestly — the fundamental trade-off of FPGA acceleration, where dedicated arithmetic and wider data paths cost logic and switching in exchange for fewer cycles. The design landed at 10.04% LUT (marginally over) and 1.07× power. Against a </w:t>
       </w:r>
       <w:r>
         <w:rPr>
@@ -8008,16 +7771,16 @@
         <w:t>4.82× speedup</w:t>
       </w:r>
       <w:r>
-        <w:t xml:space="preserve">, this is a strongly favorable exchange: the system reaches a 157.55 ms target latency for only ~7% more power, and approximately </w:t>
+        <w:t xml:space="preserve"> this is strongly favorable: 157.55 ms latency for ~7% more power, with ~</w:t>
       </w:r>
       <w:r>
         <w:rPr>
           <w:b/>
         </w:rPr>
-        <w:t>90% of the FPGA fabric remains free</w:t>
-      </w:r>
-      <w:r>
-        <w:t xml:space="preserve"> for future extensions.</w:t>
+        <w:t>90% of the fabric still free</w:t>
+      </w:r>
+      <w:r>
+        <w:t>.</w:t>
       </w:r>
     </w:p>
     <w:p>
@@ -8433,7 +8196,7 @@
     <w:p/>
     <w:p>
       <w:r>
-        <w:t>The single partial result is the LUT budget: the design reached 10.04% rather than staying strictly below 10%, and power rose 1.07× rather than falling. As discussed in Section 5.5, this is the expected cost of dedicated hardware and is strongly outweighed by the 4.82× speedup. The remaining key findings are:</w:t>
+        <w:t>The single partial result is the LUT budget: 10.04% rather than strictly below 10%, with power up 1.07×. As noted in Section 5.5, this is the expected cost of dedicated hardware, strongly outweighed by the 4.82× speedup. The remaining key findings:</w:t>
       </w:r>
     </w:p>
     <w:p>
@@ -8450,7 +8213,7 @@
         <w:t>Bottleneck identification is essential and non-obvious.</w:t>
       </w:r>
       <w:r>
-        <w:t xml:space="preserve"> The 71% cycle share of softmax exp() was not predictable from instruction counts; without on-chip profiling, effort might have gone to attention dot-products, which are only 1% of cycles.</w:t>
+        <w:t xml:space="preserve"> The 71% softmax share was not predictable from instruction counts; without profiling, effort might have gone to attention dot-products (only 1% of cycles).</w:t>
       </w:r>
     </w:p>
     <w:p>
@@ -8467,7 +8230,7 @@
         <w:t>The simplest accelerator delivers the largest gain.</w:t>
       </w:r>
       <w:r>
-        <w:t xml:space="preserve"> The EXP-LUT — a combinational ROM with two CSR registers — accounts for most of the cycle reduction despite being the simplest block, underscoring the value of targeting the true bottleneck over the most interesting one.</w:t>
+        <w:t xml:space="preserve"> The EXP-LUT — a combinational ROM with two CSRs — accounts for most of the cycle reduction, underscoring the value of targeting the true bottleneck over the most interesting one.</w:t>
       </w:r>
     </w:p>
     <w:p>
@@ -8484,7 +8247,7 @@
         <w:t>Data-path width matters as much as compute parallelism.</w:t>
       </w:r>
       <w:r>
-        <w:t xml:space="preserve"> GEMV's efficiency comes equally from cutting CSR-bus traffic (4×, packed writes) and parallelizing the MAC (4×, 4-lane); for MMIO-coupled accelerators, bus bandwidth is a co-bottleneck with arithmetic throughput.</w:t>
+        <w:t xml:space="preserve"> GEMV's efficiency comes equally from cutting CSR-bus traffic (4×, packed writes) and parallelizing the MAC (4×); for MMIO accelerators, bus bandwidth co-limits with arithmetic throughput.</w:t>
       </w:r>
     </w:p>
     <w:p>
@@ -8511,7 +8274,7 @@
         <w:t>ENC_CKSUM</w:t>
       </w:r>
       <w:r>
-        <w:t xml:space="preserve"> before any benchmark prevented reporting speedups that reflected skipped or corrupted computation.</w:t>
+        <w:t xml:space="preserve"> before any benchmark prevented reporting speedups from skipped or corrupted computation.</w:t>
       </w:r>
     </w:p>
     <w:p>
@@ -8528,7 +8291,7 @@
         <w:t>4.82× at ~10% LUT is competitive.</w:t>
       </w:r>
       <w:r>
-        <w:t xml:space="preserve"> KWT-Tiny [1] reports 5× at 29% area overhead; this work reaches 4.82× for a +3.9 pp LUT overhead (≈7× lower added area), with full bit-exact accuracy on an open FPGA platform. Honestly, area and power both rose slightly against the initial goal of reducing them — the expected cost of dedicated hardware.</w:t>
+        <w:t xml:space="preserve"> KWT-Tiny [1] reports 5× at 29% area overhead; this work reaches 4.82× for +3.9 pp LUT (≈7× lower added area) with full bit-exact accuracy on an open FPGA platform.</w:t>
       </w:r>
     </w:p>
     <w:p>
@@ -8542,10 +8305,10 @@
         <w:rPr>
           <w:b/>
         </w:rPr>
-        <w:t>Universality vs. effectiveness is bounded by the bottleneck.</w:t>
-      </w:r>
-      <w:r>
-        <w:t xml:space="preserve"> Accelerating softmax and GEMV ties the bitstream to TinyFormer's fixed dimensions; a fully general accelerator would need GEMV tiling/DMA and a larger, programmable EXP-LUT.</w:t>
+        <w:t>Universality is bounded by the bottleneck.</w:t>
+      </w:r>
+      <w:r>
+        <w:t xml:space="preserve"> Accelerating softmax and GEMV ties the bitstream to TinyFormer's fixed dimensions; a general accelerator would need GEMV tiling/DMA and a larger, programmable EXP-LUT.</w:t>
       </w:r>
     </w:p>
     <w:p>
@@ -8567,7 +8330,7 @@
         <w:t>DMA-based GEMV.</w:t>
       </w:r>
       <w:r>
-        <w:t xml:space="preserve"> The current design requires the CPU to write all W and X elements to CSR registers over the system bus. A DMA engine would allow the GEMV core to fetch rows of W directly from DDR2, eliminating CPU involvement in data movement entirely and further reducing inference latency by an estimated 2–3× for GEMV-bound operations.</w:t>
+        <w:t xml:space="preserve"> A DMA engine fetching W rows from DDR2 directly would remove CPU CSR streaming entirely, an estimated 2–3× further latency cut for GEMV-bound operations.</w:t>
       </w:r>
     </w:p>
     <w:p>
@@ -8581,7 +8344,7 @@
         <w:t>Pipelined GEMV dot4 stage.</w:t>
       </w:r>
       <w:r>
-        <w:t xml:space="preserve"> The current GEMV design does not meet timing at 100 MHz (WNS = −6.3 ns). Adding one pipeline register between the 4-lane multiplier array and the adder tree would close timing cleanly at 100 MHz while adding only one cycle of latency per output element — negligible at the scale of 32 output elements per call.</w:t>
+        <w:t xml:space="preserve"> GEMV does not meet timing at 100 MHz (WNS = −6.3 ns). One pipeline register between the multiplier array and adder tree would close timing, adding just one cycle of latency per output element (negligible at 32 elements/call).</w:t>
       </w:r>
     </w:p>
     <w:p>
@@ -8595,7 +8358,7 @@
         <w:t>Wider DOT8.</w:t>
       </w:r>
       <w:r>
-        <w:t xml:space="preserve"> An 8-lane DOT8 instruction — using two packed 32-bit source words and one 64-bit source/two 32-bit sources — would double attention throughput and become worthwhile in models with larger model dimension D or multi-head attention.</w:t>
+        <w:t xml:space="preserve"> An 8-lane DOT8 would double attention throughput, worthwhile for larger D or multi-head attention.</w:t>
       </w:r>
     </w:p>
     <w:p>
@@ -8609,7 +8372,7 @@
         <w:t>Larger EXP-LUT.</w:t>
       </w:r>
       <w:r>
-        <w:t xml:space="preserve"> A 256-entry table with finer step size (or higher Q-format precision) would support models with wider attention logit ranges and reduce approximation error in the softmax output.</w:t>
+        <w:t xml:space="preserve"> A 256-entry table (finer step or higher Q precision) would support wider attention logit ranges and reduce approximation error.</w:t>
       </w:r>
     </w:p>
     <w:p>
@@ -8620,10 +8383,10 @@
         <w:rPr>
           <w:b/>
         </w:rPr>
-        <w:t>Tiling support for larger models.</w:t>
-      </w:r>
-      <w:r>
-        <w:t xml:space="preserve"> The GEMV peripheral supports matrices up to 64×64. Tiling support would enable larger model dimensions (D=64, D=128) and multi-head attention without architectural changes to the peripheral, at the cost of additional firmware loop overhead.</w:t>
+        <w:t>Tiling for larger models.</w:t>
+      </w:r>
+      <w:r>
+        <w:t xml:space="preserve"> GEMV supports up to 64×64; tiling would enable D=64/128 and multi-head attention without peripheral changes, at some firmware loop overhead.</w:t>
       </w:r>
     </w:p>
     <w:p>
@@ -8637,7 +8400,7 @@
         <w:t>Multi-head attention.</w:t>
       </w:r>
       <w:r>
-        <w:t xml:space="preserve"> TinyFormer uses a single attention head. Extending to H heads would require either H parallel GEMV cores or a serialized schedule with shared hardware, depending on the area budget.</w:t>
+        <w:t xml:space="preserve"> Extending from one head to H would need H parallel GEMV cores or a serialized schedule on shared hardware, depending on area budget.</w:t>
       </w:r>
     </w:p>
     <w:p>
@@ -8650,7 +8413,7 @@
     </w:p>
     <w:p>
       <w:r>
-        <w:t>All project deliverables are maintained in two Git repositories, organized as follows:</w:t>
+        <w:t>All deliverables are maintained in two Git repositories:</w:t>
       </w:r>
     </w:p>
     <w:p>
@@ -9286,10 +9049,10 @@
         <w:rPr>
           <w:b/>
         </w:rPr>
-        <w:t>Build the LiteX SoC bitstream</w:t>
-      </w:r>
-      <w:r>
-        <w:t xml:space="preserve"> using </w:t>
+        <w:t>Build the SoC bitstream</w:t>
+      </w:r>
+      <w:r>
+        <w:t xml:space="preserve"> with </w:t>
       </w:r>
       <w:r>
         <w:rPr>
@@ -9299,7 +9062,7 @@
         <w:t>hw/build_soc.py</w:t>
       </w:r>
       <w:r>
-        <w:t xml:space="preserve"> in Vivado (requires Vivado 2025.2 and the Nexys4DDR board file).</w:t>
+        <w:t xml:space="preserve"> (Vivado 2025.2 + Nexys4DDR board file).</w:t>
       </w:r>
     </w:p>
     <w:p>
@@ -9316,7 +9079,7 @@
         <w:t>Program the bitstream</w:t>
       </w:r>
       <w:r>
-        <w:t xml:space="preserve"> onto the Nexys4DDR using </w:t>
+        <w:t xml:space="preserve"> per </w:t>
       </w:r>
       <w:r>
         <w:rPr>
@@ -9343,7 +9106,7 @@
         <w:t>Build each firmware mode</w:t>
       </w:r>
       <w:r>
-        <w:t xml:space="preserve"> using the compile flags and file lists in </w:t>
+        <w:t xml:space="preserve"> using the flags/file lists in </w:t>
       </w:r>
       <w:r>
         <w:rPr>
@@ -9370,7 +9133,7 @@
         <w:t>Run self-tests</w:t>
       </w:r>
       <w:r>
-        <w:t xml:space="preserve"> (LUT PASS, GEMV PASS, DOT8 PASS) before benchmarking.</w:t>
+        <w:t xml:space="preserve"> (LUT/GEMV/DOT8 PASS) before benchmarking.</w:t>
       </w:r>
     </w:p>
     <w:p>
@@ -9387,12 +9150,12 @@
         <w:t>Run baseline and accel_all</w:t>
       </w:r>
       <w:r>
-        <w:t xml:space="preserve"> firmwares; verify ENC_CKSUM match; compare CYCLES output.</w:t>
+        <w:t>; verify ENC_CKSUM match; compare CYCLES.</w:t>
       </w:r>
     </w:p>
     <w:p>
       <w:r>
-        <w:t xml:space="preserve">Full reproduction instructions, including LiteX SoC build, firmware compilation per mode, self-test execution, correctness verification, and performance measurement, are documented in </w:t>
+        <w:t xml:space="preserve">Full instructions are in </w:t>
       </w:r>
       <w:r>
         <w:rPr>
@@ -11574,6 +11337,9 @@
     <w:name w:val="Normal"/>
     <w:qFormat/>
     <w:rsid w:val="00FC693F"/>
+    <w:pPr>
+      <w:spacing w:before="0" w:after="80" w:line="252" w:lineRule="auto"/>
+    </w:pPr>
     <w:rPr>
       <w:rFonts w:ascii="Calibri" w:hAnsi="Calibri"/>
       <w:sz w:val="22"/>

</xml_diff>

<commit_message>
docs: keep waveform figures at full size
Only diagrams/graphs use the tighter image cap; the GEMV/LUT simulation
waveforms (Figures 7-12) revert to their original 5.6x6.0in size so they
stay readable.

Co-Authored-By: Claude Opus 4.8 <noreply@anthropic.com>
</commit_message>
<xml_diff>
--- a/Docs/Project_Report.docx
+++ b/Docs/Project_Report.docx
@@ -4739,7 +4739,7 @@
       <w:r>
         <w:drawing>
           <wp:inline xmlns:a="http://schemas.openxmlformats.org/drawingml/2006/main" xmlns:pic="http://schemas.openxmlformats.org/drawingml/2006/picture">
-            <wp:extent cx="4754880" cy="1518590"/>
+            <wp:extent cx="5120640" cy="1635404"/>
             <wp:docPr id="7" name="Picture 7"/>
             <wp:cNvGraphicFramePr>
               <a:graphicFrameLocks noChangeAspect="1"/>
@@ -4760,7 +4760,7 @@
                   <pic:spPr>
                     <a:xfrm>
                       <a:off x="0" y="0"/>
-                      <a:ext cx="4754880" cy="1518590"/>
+                      <a:ext cx="5120640" cy="1635404"/>
                     </a:xfrm>
                     <a:prstGeom prst="rect"/>
                   </pic:spPr>
@@ -4876,7 +4876,7 @@
       <w:r>
         <w:drawing>
           <wp:inline xmlns:a="http://schemas.openxmlformats.org/drawingml/2006/main" xmlns:pic="http://schemas.openxmlformats.org/drawingml/2006/picture">
-            <wp:extent cx="4754880" cy="1491844"/>
+            <wp:extent cx="5120640" cy="1606601"/>
             <wp:docPr id="8" name="Picture 8"/>
             <wp:cNvGraphicFramePr>
               <a:graphicFrameLocks noChangeAspect="1"/>
@@ -4897,7 +4897,7 @@
                   <pic:spPr>
                     <a:xfrm>
                       <a:off x="0" y="0"/>
-                      <a:ext cx="4754880" cy="1491844"/>
+                      <a:ext cx="5120640" cy="1606601"/>
                     </a:xfrm>
                     <a:prstGeom prst="rect"/>
                   </pic:spPr>
@@ -4973,7 +4973,7 @@
       <w:r>
         <w:drawing>
           <wp:inline xmlns:a="http://schemas.openxmlformats.org/drawingml/2006/main" xmlns:pic="http://schemas.openxmlformats.org/drawingml/2006/picture">
-            <wp:extent cx="4754880" cy="1500759"/>
+            <wp:extent cx="5120640" cy="1616202"/>
             <wp:docPr id="9" name="Picture 9"/>
             <wp:cNvGraphicFramePr>
               <a:graphicFrameLocks noChangeAspect="1"/>
@@ -4994,7 +4994,7 @@
                   <pic:spPr>
                     <a:xfrm>
                       <a:off x="0" y="0"/>
-                      <a:ext cx="4754880" cy="1500759"/>
+                      <a:ext cx="5120640" cy="1616202"/>
                     </a:xfrm>
                     <a:prstGeom prst="rect"/>
                   </pic:spPr>
@@ -5170,7 +5170,7 @@
       <w:r>
         <w:drawing>
           <wp:inline xmlns:a="http://schemas.openxmlformats.org/drawingml/2006/main" xmlns:pic="http://schemas.openxmlformats.org/drawingml/2006/picture">
-            <wp:extent cx="4754880" cy="1485900"/>
+            <wp:extent cx="5120640" cy="1600200"/>
             <wp:docPr id="10" name="Picture 10"/>
             <wp:cNvGraphicFramePr>
               <a:graphicFrameLocks noChangeAspect="1"/>
@@ -5191,7 +5191,7 @@
                   <pic:spPr>
                     <a:xfrm>
                       <a:off x="0" y="0"/>
-                      <a:ext cx="4754880" cy="1485900"/>
+                      <a:ext cx="5120640" cy="1600200"/>
                     </a:xfrm>
                     <a:prstGeom prst="rect"/>
                   </pic:spPr>
@@ -5320,7 +5320,7 @@
       <w:r>
         <w:drawing>
           <wp:inline xmlns:a="http://schemas.openxmlformats.org/drawingml/2006/main" xmlns:pic="http://schemas.openxmlformats.org/drawingml/2006/picture">
-            <wp:extent cx="4754880" cy="659740"/>
+            <wp:extent cx="5120640" cy="710489"/>
             <wp:docPr id="11" name="Picture 11"/>
             <wp:cNvGraphicFramePr>
               <a:graphicFrameLocks noChangeAspect="1"/>
@@ -5341,7 +5341,7 @@
                   <pic:spPr>
                     <a:xfrm>
                       <a:off x="0" y="0"/>
-                      <a:ext cx="4754880" cy="659740"/>
+                      <a:ext cx="5120640" cy="710489"/>
                     </a:xfrm>
                     <a:prstGeom prst="rect"/>
                   </pic:spPr>
@@ -5475,7 +5475,7 @@
       <w:r>
         <w:drawing>
           <wp:inline xmlns:a="http://schemas.openxmlformats.org/drawingml/2006/main" xmlns:pic="http://schemas.openxmlformats.org/drawingml/2006/picture">
-            <wp:extent cx="4754880" cy="650824"/>
+            <wp:extent cx="5120640" cy="700888"/>
             <wp:docPr id="12" name="Picture 12"/>
             <wp:cNvGraphicFramePr>
               <a:graphicFrameLocks noChangeAspect="1"/>
@@ -5496,7 +5496,7 @@
                   <pic:spPr>
                     <a:xfrm>
                       <a:off x="0" y="0"/>
-                      <a:ext cx="4754880" cy="650824"/>
+                      <a:ext cx="5120640" cy="700888"/>
                     </a:xfrm>
                     <a:prstGeom prst="rect"/>
                   </pic:spPr>

</xml_diff>